<commit_message>
feat: update document v2
</commit_message>
<xml_diff>
--- a/v2/local_llm_pt_v2.docx
+++ b/v2/local_llm_pt_v2.docx
@@ -949,21 +949,7 @@
                 <w:rStyle w:val="Hiperligao"/>
                 <w:noProof/>
               </w:rPr>
-              <w:t>Arquitetu</w:t>
-            </w:r>
-            <w:r>
-              <w:rPr>
-                <w:rStyle w:val="Hiperligao"/>
-                <w:noProof/>
-              </w:rPr>
-              <w:t>r</w:t>
-            </w:r>
-            <w:r>
-              <w:rPr>
-                <w:rStyle w:val="Hiperligao"/>
-                <w:noProof/>
-              </w:rPr>
-              <w:t>a</w:t>
+              <w:t>Arquitetura</w:t>
             </w:r>
             <w:r>
               <w:rPr>
@@ -1839,7 +1825,7 @@
               </wp:anchor>
             </w:drawing>
           </mc:Choice>
-          <mc:Fallback xmlns:ns11="http://schemas.microsoft.com/office/drawing/2010/main" xmlns:ns5="http://schemas.openxmlformats.org/drawingml/2006/main" xmlns:ns9="http://schemas.openxmlformats.org/drawingml/2006/picture">
+          <mc:Fallback xmlns:ns9="http://schemas.openxmlformats.org/drawingml/2006/picture" xmlns:ns5="http://schemas.openxmlformats.org/drawingml/2006/main" xmlns:ns11="http://schemas.microsoft.com/office/drawing/2010/main">
             <w:pict>
               <v:line w14:anchorId="416D2C14" id="Conexão Reta 2" o:spid="_x0000_s1026" style="position:absolute;z-index:251659264;visibility:visible;mso-wrap-style:square;mso-wrap-distance-left:9pt;mso-wrap-distance-top:0;mso-wrap-distance-right:9pt;mso-wrap-distance-bottom:0;mso-position-horizontal:absolute;mso-position-horizontal-relative:text;mso-position-vertical:absolute;mso-position-vertical-relative:text" from=".9pt,23.9pt" to="485.1pt,23.9pt" o:gfxdata="UEsDBBQABgAIAAAAIQC2gziS/gAAAOEBAAATAAAAW0NvbnRlbnRfVHlwZXNdLnhtbJSRQU7DMBBF 90jcwfIWJU67QAgl6YK0S0CoHGBkTxKLZGx5TGhvj5O2G0SRWNoz/78nu9wcxkFMGNg6quQqL6RA 0s5Y6ir5vt9lD1JwBDIwOMJKHpHlpr69KfdHjyxSmriSfYz+USnWPY7AufNIadK6MEJMx9ApD/oD OlTrorhX2lFEilmcO2RdNtjC5xDF9pCuTyYBB5bi6bQ4syoJ3g9WQ0ymaiLzg5KdCXlKLjvcW893 SUOqXwnz5DrgnHtJTxOsQfEKIT7DmDSUCaxw7Rqn8787ZsmRM9e2VmPeBN4uqYvTtW7jvijg9N/y JsXecLq0q+WD6m8AAAD//wMAUEsDBBQABgAIAAAAIQA4/SH/1gAAAJQBAAALAAAAX3JlbHMvLnJl bHOkkMFqwzAMhu+DvYPRfXGawxijTi+j0GvpHsDYimMaW0Yy2fr2M4PBMnrbUb/Q94l/f/hMi1qR JVI2sOt6UJgd+ZiDgffL8ekFlFSbvV0oo4EbChzGx4f9GRdb25HMsYhqlCwG5lrLq9biZkxWOiqY 22YiTra2kYMu1l1tQD30/bPm3wwYN0x18gb45AdQl1tp5j/sFB2T0FQ7R0nTNEV3j6o9feQzro1i OWA14Fm+Q8a1a8+Bvu/d/dMb2JY5uiPbhG/ktn4cqGU/er3pcvwCAAD//wMAUEsDBBQABgAIAAAA IQCZ2PQonAEAAJQDAAAOAAAAZHJzL2Uyb0RvYy54bWysU01P3DAQvVfqf7B8Z5MAQm202T2A4FK1 qMAPMM54Y8n2WLbZZP99x97dLGorIRAXxx/z3sx7M1muJ2vYFkLU6DreLGrOwEnstdt0/Onx9uwb ZzEJ1wuDDjq+g8jXq69flqNv4RwHND0ERiQutqPv+JCSb6sqygGsiAv04OhRYbAi0TFsqj6Ikdit qc7r+qoaMfQ+oIQY6fZm/8hXhV8pkOmXUhESMx2n2lJZQ1mf81qtlqLdBOEHLQ9liA9UYYV2lHSm uhFJsJeg/6GyWgaMqNJCoq1QKS2haCA1Tf2XmodBeChayJzoZ5vi59HKn9trdx/IhtHHNvr7kFVM Ktj8pfrYVMzazWbBlJiky6vm8vvFJXkqj2/VCehDTHeAluVNx412WYdoxfZHTJSMQo8hdDilLru0 M5CDjfsNiumekjUFXaYCrk1gW0H9FFKCS03uIfGV6AxT2pgZWL8NPMRnKJSJeQ94RpTM6NIMttph +F/2NB1LVvv4owN73dmCZ+x3pSnFGmp9UXgY0zxbr88FfvqZVn8AAAD//wMAUEsDBBQABgAIAAAA IQDx80zj4AAAAAwBAAAPAAAAZHJzL2Rvd25yZXYueG1sTE9NS8NAEL0L/odlBG92YxBr02xKqYi1 UIqtUI/b7JhEs7Nhd9uk/94RD3qZ4c1j3kc+G2wrTuhD40jB7SgBgVQ601Cl4G33dPMAIkRNRreO UMEZA8yKy4tcZ8b19IqnbawEi1DItII6xi6TMpQ1Wh1GrkNi7sN5qyNDX0njdc/itpVpktxLqxti h1p3uKix/NoerYK1Xy4X89X5kzbvtt+nq/3mZXhW6vpqeJzymE9BRBzi3wf8dOD8UHCwgzuSCaJl zOmjgrsxb6Yn4yQFcfg9yCKX/0sU3wAAAP//AwBQSwECLQAUAAYACAAAACEAtoM4kv4AAADhAQAA EwAAAAAAAAAAAAAAAAAAAAAAW0NvbnRlbnRfVHlwZXNdLnhtbFBLAQItABQABgAIAAAAIQA4/SH/ 1gAAAJQBAAALAAAAAAAAAAAAAAAAAC8BAABfcmVscy8ucmVsc1BLAQItABQABgAIAAAAIQCZ2PQo nAEAAJQDAAAOAAAAAAAAAAAAAAAAAC4CAABkcnMvZTJvRG9jLnhtbFBLAQItABQABgAIAAAAIQDx 80zj4AAAAAwBAAAPAAAAAAAAAAAAAAAAAPYDAABkcnMvZG93bnJldi54bWxQSwUGAAAAAAQABADz AAAAAwUAAAAA " strokecolor="#156082 [3204]" strokeweight=".5pt">
                 <v:stroke joinstyle="miter"/>
@@ -1928,7 +1914,7 @@
               </wp:anchor>
             </w:drawing>
           </mc:Choice>
-          <mc:Fallback xmlns:ns11="http://schemas.microsoft.com/office/drawing/2010/main" xmlns:ns5="http://schemas.openxmlformats.org/drawingml/2006/main" xmlns:ns9="http://schemas.openxmlformats.org/drawingml/2006/picture">
+          <mc:Fallback xmlns:ns9="http://schemas.openxmlformats.org/drawingml/2006/picture" xmlns:ns5="http://schemas.openxmlformats.org/drawingml/2006/main" xmlns:ns11="http://schemas.microsoft.com/office/drawing/2010/main">
             <w:pict>
               <v:line w14:anchorId="6F2C7688" id="Conexão Reta 3" o:spid="_x0000_s1026" style="position:absolute;z-index:251660288;visibility:visible;mso-wrap-style:square;mso-wrap-distance-left:9pt;mso-wrap-distance-top:0;mso-wrap-distance-right:9pt;mso-wrap-distance-bottom:0;mso-position-horizontal:absolute;mso-position-horizontal-relative:text;mso-position-vertical:absolute;mso-position-vertical-relative:text" from=".9pt,23.25pt" to="485.1pt,23.25pt" o:gfxdata="UEsDBBQABgAIAAAAIQC2gziS/gAAAOEBAAATAAAAW0NvbnRlbnRfVHlwZXNdLnhtbJSRQU7DMBBF 90jcwfIWJU67QAgl6YK0S0CoHGBkTxKLZGx5TGhvj5O2G0SRWNoz/78nu9wcxkFMGNg6quQqL6RA 0s5Y6ir5vt9lD1JwBDIwOMJKHpHlpr69KfdHjyxSmriSfYz+USnWPY7AufNIadK6MEJMx9ApD/oD OlTrorhX2lFEilmcO2RdNtjC5xDF9pCuTyYBB5bi6bQ4syoJ3g9WQ0ymaiLzg5KdCXlKLjvcW893 SUOqXwnz5DrgnHtJTxOsQfEKIT7DmDSUCaxw7Rqn8787ZsmRM9e2VmPeBN4uqYvTtW7jvijg9N/y JsXecLq0q+WD6m8AAAD//wMAUEsDBBQABgAIAAAAIQA4/SH/1gAAAJQBAAALAAAAX3JlbHMvLnJl bHOkkMFqwzAMhu+DvYPRfXGawxijTi+j0GvpHsDYimMaW0Yy2fr2M4PBMnrbUb/Q94l/f/hMi1qR JVI2sOt6UJgd+ZiDgffL8ekFlFSbvV0oo4EbChzGx4f9GRdb25HMsYhqlCwG5lrLq9biZkxWOiqY 22YiTra2kYMu1l1tQD30/bPm3wwYN0x18gb45AdQl1tp5j/sFB2T0FQ7R0nTNEV3j6o9feQzro1i OWA14Fm+Q8a1a8+Bvu/d/dMb2JY5uiPbhG/ktn4cqGU/er3pcvwCAAD//wMAUEsDBBQABgAIAAAA IQCZ2PQonAEAAJQDAAAOAAAAZHJzL2Uyb0RvYy54bWysU01P3DAQvVfqf7B8Z5MAQm202T2A4FK1 qMAPMM54Y8n2WLbZZP99x97dLGorIRAXxx/z3sx7M1muJ2vYFkLU6DreLGrOwEnstdt0/Onx9uwb ZzEJ1wuDDjq+g8jXq69flqNv4RwHND0ERiQutqPv+JCSb6sqygGsiAv04OhRYbAi0TFsqj6Ikdit qc7r+qoaMfQ+oIQY6fZm/8hXhV8pkOmXUhESMx2n2lJZQ1mf81qtlqLdBOEHLQ9liA9UYYV2lHSm uhFJsJeg/6GyWgaMqNJCoq1QKS2haCA1Tf2XmodBeChayJzoZ5vi59HKn9trdx/IhtHHNvr7kFVM Ktj8pfrYVMzazWbBlJiky6vm8vvFJXkqj2/VCehDTHeAluVNx412WYdoxfZHTJSMQo8hdDilLru0 M5CDjfsNiumekjUFXaYCrk1gW0H9FFKCS03uIfGV6AxT2pgZWL8NPMRnKJSJeQ94RpTM6NIMttph +F/2NB1LVvv4owN73dmCZ+x3pSnFGmp9UXgY0zxbr88FfvqZVn8AAAD//wMAUEsDBBQABgAIAAAA IQC7cnDs4gAAAAwBAAAPAAAAZHJzL2Rvd25yZXYueG1sTI9BS8NAEIXvgv9hGcGb3Ri01jSbUipi LUixFepxmx2TaHY27G6b9N874kEvA28e8+Z7+WywrTiiD40jBdejBARS6UxDlYK37ePVBESImoxu HaGCEwaYFednuc6M6+kVj5tYCQ6hkGkFdYxdJmUoa7Q6jFyHxN6H81ZHlr6Sxuuew20r0yQZS6sb 4g+17nBRY/m1OVgFL365XMxXp09av9t+l6526+fhSanLi+FhymM+BRFxiH8X8NOB+aFgsL07kAmi Zc30UcHN+BYE2/d3SQpi/7uQRS7/lyi+AQAA//8DAFBLAQItABQABgAIAAAAIQC2gziS/gAAAOEB AAATAAAAAAAAAAAAAAAAAAAAAABbQ29udGVudF9UeXBlc10ueG1sUEsBAi0AFAAGAAgAAAAhADj9 If/WAAAAlAEAAAsAAAAAAAAAAAAAAAAALwEAAF9yZWxzLy5yZWxzUEsBAi0AFAAGAAgAAAAhAJnY 9CicAQAAlAMAAA4AAAAAAAAAAAAAAAAALgIAAGRycy9lMm9Eb2MueG1sUEsBAi0AFAAGAAgAAAAh ALtycOziAAAADAEAAA8AAAAAAAAAAAAAAAAA9gMAAGRycy9kb3ducmV2LnhtbFBLBQYAAAAABAAE APMAAAAFBQAAAAA= " strokecolor="#156082 [3204]" strokeweight=".5pt">
                 <v:stroke joinstyle="miter"/>
@@ -2297,7 +2283,7 @@
               </wp:anchor>
             </w:drawing>
           </mc:Choice>
-          <mc:Fallback xmlns:ns11="http://schemas.microsoft.com/office/drawing/2010/main" xmlns:ns5="http://schemas.openxmlformats.org/drawingml/2006/main" xmlns:ns9="http://schemas.openxmlformats.org/drawingml/2006/picture">
+          <mc:Fallback xmlns:ns9="http://schemas.openxmlformats.org/drawingml/2006/picture" xmlns:ns5="http://schemas.openxmlformats.org/drawingml/2006/main" xmlns:ns11="http://schemas.microsoft.com/office/drawing/2010/main">
             <w:pict>
               <v:line w14:anchorId="65E0A2AF" id="Conexão Reta 3" o:spid="_x0000_s1026" style="position:absolute;z-index:251697152;visibility:visible;mso-wrap-style:square;mso-wrap-distance-left:9pt;mso-wrap-distance-top:0;mso-wrap-distance-right:9pt;mso-wrap-distance-bottom:0;mso-position-horizontal:absolute;mso-position-horizontal-relative:text;mso-position-vertical:absolute;mso-position-vertical-relative:text" from="0,-.05pt" to="484.2pt,-.05pt" o:gfxdata="UEsDBBQABgAIAAAAIQC2gziS/gAAAOEBAAATAAAAW0NvbnRlbnRfVHlwZXNdLnhtbJSRQU7DMBBF 90jcwfIWJU67QAgl6YK0S0CoHGBkTxKLZGx5TGhvj5O2G0SRWNoz/78nu9wcxkFMGNg6quQqL6RA 0s5Y6ir5vt9lD1JwBDIwOMJKHpHlpr69KfdHjyxSmriSfYz+USnWPY7AufNIadK6MEJMx9ApD/oD OlTrorhX2lFEilmcO2RdNtjC5xDF9pCuTyYBB5bi6bQ4syoJ3g9WQ0ymaiLzg5KdCXlKLjvcW893 SUOqXwnz5DrgnHtJTxOsQfEKIT7DmDSUCaxw7Rqn8787ZsmRM9e2VmPeBN4uqYvTtW7jvijg9N/y JsXecLq0q+WD6m8AAAD//wMAUEsDBBQABgAIAAAAIQA4/SH/1gAAAJQBAAALAAAAX3JlbHMvLnJl bHOkkMFqwzAMhu+DvYPRfXGawxijTi+j0GvpHsDYimMaW0Yy2fr2M4PBMnrbUb/Q94l/f/hMi1qR JVI2sOt6UJgd+ZiDgffL8ekFlFSbvV0oo4EbChzGx4f9GRdb25HMsYhqlCwG5lrLq9biZkxWOiqY 22YiTra2kYMu1l1tQD30/bPm3wwYN0x18gb45AdQl1tp5j/sFB2T0FQ7R0nTNEV3j6o9feQzro1i OWA14Fm+Q8a1a8+Bvu/d/dMb2JY5uiPbhG/ktn4cqGU/er3pcvwCAAD//wMAUEsDBBQABgAIAAAA IQCZ2PQonAEAAJQDAAAOAAAAZHJzL2Uyb0RvYy54bWysU01P3DAQvVfqf7B8Z5MAQm202T2A4FK1 qMAPMM54Y8n2WLbZZP99x97dLGorIRAXxx/z3sx7M1muJ2vYFkLU6DreLGrOwEnstdt0/Onx9uwb ZzEJ1wuDDjq+g8jXq69flqNv4RwHND0ERiQutqPv+JCSb6sqygGsiAv04OhRYbAi0TFsqj6Ikdit qc7r+qoaMfQ+oIQY6fZm/8hXhV8pkOmXUhESMx2n2lJZQ1mf81qtlqLdBOEHLQ9liA9UYYV2lHSm uhFJsJeg/6GyWgaMqNJCoq1QKS2haCA1Tf2XmodBeChayJzoZ5vi59HKn9trdx/IhtHHNvr7kFVM Ktj8pfrYVMzazWbBlJiky6vm8vvFJXkqj2/VCehDTHeAluVNx412WYdoxfZHTJSMQo8hdDilLru0 M5CDjfsNiumekjUFXaYCrk1gW0H9FFKCS03uIfGV6AxT2pgZWL8NPMRnKJSJeQ94RpTM6NIMttph +F/2NB1LVvv4owN73dmCZ+x3pSnFGmp9UXgY0zxbr88FfvqZVn8AAAD//wMAUEsDBBQABgAIAAAA IQCasyRQ4AAAAAkBAAAPAAAAZHJzL2Rvd25yZXYueG1sTI9Ba8JAEIXvhf6HZQq96UYpYmM2IpZS KxSpFfS4ZqdJ2uxs2F1N/Pcde2kvA4/He/O+bN7bRpzRh9qRgtEwAYFUOFNTqWD38TyYgghRk9GN I1RwwQDz/PYm06lxHb3jeRtLwSUUUq2girFNpQxFhVaHoWuR2Pt03urI0pfSeN1xuW3kOEkm0uqa +EOlW1xWWHxvT1bBm1+tlov15Ys2B9vtx+v95rV/Uer+rn+a8VnMQETs418Crgy8H3IednQnMkE0 CpgmKhiMQLD5OJk+gDj+apln8j9B/gMAAP//AwBQSwECLQAUAAYACAAAACEAtoM4kv4AAADhAQAA EwAAAAAAAAAAAAAAAAAAAAAAW0NvbnRlbnRfVHlwZXNdLnhtbFBLAQItABQABgAIAAAAIQA4/SH/ 1gAAAJQBAAALAAAAAAAAAAAAAAAAAC8BAABfcmVscy8ucmVsc1BLAQItABQABgAIAAAAIQCZ2PQo nAEAAJQDAAAOAAAAAAAAAAAAAAAAAC4CAABkcnMvZTJvRG9jLnhtbFBLAQItABQABgAIAAAAIQCa syRQ4AAAAAkBAAAPAAAAAAAAAAAAAAAAAPYDAABkcnMvZG93bnJldi54bWxQSwUGAAAAAAQABADz AAAAAwUAAAAA " strokecolor="#156082 [3204]" strokeweight=".5pt">
                 <v:stroke joinstyle="miter"/>
@@ -3043,7 +3029,7 @@
               </wp:anchor>
             </w:drawing>
           </mc:Choice>
-          <mc:Fallback xmlns:ns11="http://schemas.microsoft.com/office/drawing/2010/main" xmlns:ns5="http://schemas.openxmlformats.org/drawingml/2006/main" xmlns:ns9="http://schemas.openxmlformats.org/drawingml/2006/picture">
+          <mc:Fallback xmlns:ns9="http://schemas.openxmlformats.org/drawingml/2006/picture" xmlns:ns5="http://schemas.openxmlformats.org/drawingml/2006/main" xmlns:ns11="http://schemas.microsoft.com/office/drawing/2010/main">
             <w:pict>
               <v:line w14:anchorId="781B6A1A" id="Conexão Reta 3" o:spid="_x0000_s1026" style="position:absolute;z-index:251662336;visibility:visible;mso-wrap-style:square;mso-wrap-distance-left:9pt;mso-wrap-distance-top:0;mso-wrap-distance-right:9pt;mso-wrap-distance-bottom:0;mso-position-horizontal:absolute;mso-position-horizontal-relative:text;mso-position-vertical:absolute;mso-position-vertical-relative:text" from="0,-.05pt" to="484.2pt,-.05pt" o:gfxdata="UEsDBBQABgAIAAAAIQC2gziS/gAAAOEBAAATAAAAW0NvbnRlbnRfVHlwZXNdLnhtbJSRQU7DMBBF 90jcwfIWJU67QAgl6YK0S0CoHGBkTxKLZGx5TGhvj5O2G0SRWNoz/78nu9wcxkFMGNg6quQqL6RA 0s5Y6ir5vt9lD1JwBDIwOMJKHpHlpr69KfdHjyxSmriSfYz+USnWPY7AufNIadK6MEJMx9ApD/oD OlTrorhX2lFEilmcO2RdNtjC5xDF9pCuTyYBB5bi6bQ4syoJ3g9WQ0ymaiLzg5KdCXlKLjvcW893 SUOqXwnz5DrgnHtJTxOsQfEKIT7DmDSUCaxw7Rqn8787ZsmRM9e2VmPeBN4uqYvTtW7jvijg9N/y JsXecLq0q+WD6m8AAAD//wMAUEsDBBQABgAIAAAAIQA4/SH/1gAAAJQBAAALAAAAX3JlbHMvLnJl bHOkkMFqwzAMhu+DvYPRfXGawxijTi+j0GvpHsDYimMaW0Yy2fr2M4PBMnrbUb/Q94l/f/hMi1qR JVI2sOt6UJgd+ZiDgffL8ekFlFSbvV0oo4EbChzGx4f9GRdb25HMsYhqlCwG5lrLq9biZkxWOiqY 22YiTra2kYMu1l1tQD30/bPm3wwYN0x18gb45AdQl1tp5j/sFB2T0FQ7R0nTNEV3j6o9feQzro1i OWA14Fm+Q8a1a8+Bvu/d/dMb2JY5uiPbhG/ktn4cqGU/er3pcvwCAAD//wMAUEsDBBQABgAIAAAA IQCZ2PQonAEAAJQDAAAOAAAAZHJzL2Uyb0RvYy54bWysU01P3DAQvVfqf7B8Z5MAQm202T2A4FK1 qMAPMM54Y8n2WLbZZP99x97dLGorIRAXxx/z3sx7M1muJ2vYFkLU6DreLGrOwEnstdt0/Onx9uwb ZzEJ1wuDDjq+g8jXq69flqNv4RwHND0ERiQutqPv+JCSb6sqygGsiAv04OhRYbAi0TFsqj6Ikdit qc7r+qoaMfQ+oIQY6fZm/8hXhV8pkOmXUhESMx2n2lJZQ1mf81qtlqLdBOEHLQ9liA9UYYV2lHSm uhFJsJeg/6GyWgaMqNJCoq1QKS2haCA1Tf2XmodBeChayJzoZ5vi59HKn9trdx/IhtHHNvr7kFVM Ktj8pfrYVMzazWbBlJiky6vm8vvFJXkqj2/VCehDTHeAluVNx412WYdoxfZHTJSMQo8hdDilLru0 M5CDjfsNiumekjUFXaYCrk1gW0H9FFKCS03uIfGV6AxT2pgZWL8NPMRnKJSJeQ94RpTM6NIMttph +F/2NB1LVvv4owN73dmCZ+x3pSnFGmp9UXgY0zxbr88FfvqZVn8AAAD//wMAUEsDBBQABgAIAAAA IQCasyRQ4AAAAAkBAAAPAAAAZHJzL2Rvd25yZXYueG1sTI9Ba8JAEIXvhf6HZQq96UYpYmM2IpZS KxSpFfS4ZqdJ2uxs2F1N/Pcde2kvA4/He/O+bN7bRpzRh9qRgtEwAYFUOFNTqWD38TyYgghRk9GN I1RwwQDz/PYm06lxHb3jeRtLwSUUUq2girFNpQxFhVaHoWuR2Pt03urI0pfSeN1xuW3kOEkm0uqa +EOlW1xWWHxvT1bBm1+tlov15Ys2B9vtx+v95rV/Uer+rn+a8VnMQETs418Crgy8H3IednQnMkE0 CpgmKhiMQLD5OJk+gDj+apln8j9B/gMAAP//AwBQSwECLQAUAAYACAAAACEAtoM4kv4AAADhAQAA EwAAAAAAAAAAAAAAAAAAAAAAW0NvbnRlbnRfVHlwZXNdLnhtbFBLAQItABQABgAIAAAAIQA4/SH/ 1gAAAJQBAAALAAAAAAAAAAAAAAAAAC8BAABfcmVscy8ucmVsc1BLAQItABQABgAIAAAAIQCZ2PQo nAEAAJQDAAAOAAAAAAAAAAAAAAAAAC4CAABkcnMvZTJvRG9jLnhtbFBLAQItABQABgAIAAAAIQCa syRQ4AAAAAkBAAAPAAAAAAAAAAAAAAAAAPYDAABkcnMvZG93bnJldi54bWxQSwUGAAAAAAQABADz AAAAAwUAAAAA " strokecolor="#156082 [3204]" strokeweight=".5pt">
                 <v:stroke joinstyle="miter"/>
@@ -3549,7 +3535,7 @@
               </wp:anchor>
             </w:drawing>
           </mc:Choice>
-          <mc:Fallback xmlns:ns11="http://schemas.microsoft.com/office/drawing/2010/main" xmlns:ns5="http://schemas.openxmlformats.org/drawingml/2006/main" xmlns:ns9="http://schemas.openxmlformats.org/drawingml/2006/picture">
+          <mc:Fallback xmlns:ns9="http://schemas.openxmlformats.org/drawingml/2006/picture" xmlns:ns5="http://schemas.openxmlformats.org/drawingml/2006/main" xmlns:ns11="http://schemas.microsoft.com/office/drawing/2010/main">
             <w:pict>
               <v:line w14:anchorId="20F34B84" id="Conexão Reta 3" o:spid="_x0000_s1026" style="position:absolute;z-index:251664384;visibility:visible;mso-wrap-style:square;mso-wrap-distance-left:9pt;mso-wrap-distance-top:0;mso-wrap-distance-right:9pt;mso-wrap-distance-bottom:0;mso-position-horizontal:absolute;mso-position-horizontal-relative:text;mso-position-vertical:absolute;mso-position-vertical-relative:text" from="0,-.05pt" to="484.2pt,-.05pt" o:gfxdata="UEsDBBQABgAIAAAAIQC2gziS/gAAAOEBAAATAAAAW0NvbnRlbnRfVHlwZXNdLnhtbJSRQU7DMBBF 90jcwfIWJU67QAgl6YK0S0CoHGBkTxKLZGx5TGhvj5O2G0SRWNoz/78nu9wcxkFMGNg6quQqL6RA 0s5Y6ir5vt9lD1JwBDIwOMJKHpHlpr69KfdHjyxSmriSfYz+USnWPY7AufNIadK6MEJMx9ApD/oD OlTrorhX2lFEilmcO2RdNtjC5xDF9pCuTyYBB5bi6bQ4syoJ3g9WQ0ymaiLzg5KdCXlKLjvcW893 SUOqXwnz5DrgnHtJTxOsQfEKIT7DmDSUCaxw7Rqn8787ZsmRM9e2VmPeBN4uqYvTtW7jvijg9N/y JsXecLq0q+WD6m8AAAD//wMAUEsDBBQABgAIAAAAIQA4/SH/1gAAAJQBAAALAAAAX3JlbHMvLnJl bHOkkMFqwzAMhu+DvYPRfXGawxijTi+j0GvpHsDYimMaW0Yy2fr2M4PBMnrbUb/Q94l/f/hMi1qR JVI2sOt6UJgd+ZiDgffL8ekFlFSbvV0oo4EbChzGx4f9GRdb25HMsYhqlCwG5lrLq9biZkxWOiqY 22YiTra2kYMu1l1tQD30/bPm3wwYN0x18gb45AdQl1tp5j/sFB2T0FQ7R0nTNEV3j6o9feQzro1i OWA14Fm+Q8a1a8+Bvu/d/dMb2JY5uiPbhG/ktn4cqGU/er3pcvwCAAD//wMAUEsDBBQABgAIAAAA IQCZ2PQonAEAAJQDAAAOAAAAZHJzL2Uyb0RvYy54bWysU01P3DAQvVfqf7B8Z5MAQm202T2A4FK1 qMAPMM54Y8n2WLbZZP99x97dLGorIRAXxx/z3sx7M1muJ2vYFkLU6DreLGrOwEnstdt0/Onx9uwb ZzEJ1wuDDjq+g8jXq69flqNv4RwHND0ERiQutqPv+JCSb6sqygGsiAv04OhRYbAi0TFsqj6Ikdit qc7r+qoaMfQ+oIQY6fZm/8hXhV8pkOmXUhESMx2n2lJZQ1mf81qtlqLdBOEHLQ9liA9UYYV2lHSm uhFJsJeg/6GyWgaMqNJCoq1QKS2haCA1Tf2XmodBeChayJzoZ5vi59HKn9trdx/IhtHHNvr7kFVM Ktj8pfrYVMzazWbBlJiky6vm8vvFJXkqj2/VCehDTHeAluVNx412WYdoxfZHTJSMQo8hdDilLru0 M5CDjfsNiumekjUFXaYCrk1gW0H9FFKCS03uIfGV6AxT2pgZWL8NPMRnKJSJeQ94RpTM6NIMttph +F/2NB1LVvv4owN73dmCZ+x3pSnFGmp9UXgY0zxbr88FfvqZVn8AAAD//wMAUEsDBBQABgAIAAAA IQCasyRQ4AAAAAkBAAAPAAAAZHJzL2Rvd25yZXYueG1sTI9Ba8JAEIXvhf6HZQq96UYpYmM2IpZS KxSpFfS4ZqdJ2uxs2F1N/Pcde2kvA4/He/O+bN7bRpzRh9qRgtEwAYFUOFNTqWD38TyYgghRk9GN I1RwwQDz/PYm06lxHb3jeRtLwSUUUq2girFNpQxFhVaHoWuR2Pt03urI0pfSeN1xuW3kOEkm0uqa +EOlW1xWWHxvT1bBm1+tlov15Ys2B9vtx+v95rV/Uer+rn+a8VnMQETs418Crgy8H3IednQnMkE0 CpgmKhiMQLD5OJk+gDj+apln8j9B/gMAAP//AwBQSwECLQAUAAYACAAAACEAtoM4kv4AAADhAQAA EwAAAAAAAAAAAAAAAAAAAAAAW0NvbnRlbnRfVHlwZXNdLnhtbFBLAQItABQABgAIAAAAIQA4/SH/ 1gAAAJQBAAALAAAAAAAAAAAAAAAAAC8BAABfcmVscy8ucmVsc1BLAQItABQABgAIAAAAIQCZ2PQo nAEAAJQDAAAOAAAAAAAAAAAAAAAAAC4CAABkcnMvZTJvRG9jLnhtbFBLAQItABQABgAIAAAAIQCa syRQ4AAAAAkBAAAPAAAAAAAAAAAAAAAAAPYDAABkcnMvZG93bnJldi54bWxQSwUGAAAAAAQABADz AAAAAwUAAAAA " strokecolor="#156082 [3204]" strokeweight=".5pt">
                 <v:stroke joinstyle="miter"/>
@@ -4009,7 +3995,7 @@
               </wp:anchor>
             </w:drawing>
           </mc:Choice>
-          <mc:Fallback xmlns:ns11="http://schemas.microsoft.com/office/drawing/2010/main" xmlns:ns5="http://schemas.openxmlformats.org/drawingml/2006/main" xmlns:ns9="http://schemas.openxmlformats.org/drawingml/2006/picture">
+          <mc:Fallback xmlns:ns9="http://schemas.openxmlformats.org/drawingml/2006/picture" xmlns:ns5="http://schemas.openxmlformats.org/drawingml/2006/main" xmlns:ns11="http://schemas.microsoft.com/office/drawing/2010/main">
             <w:pict>
               <v:line w14:anchorId="619BBE13" id="Conexão Reta 3" o:spid="_x0000_s1026" style="position:absolute;z-index:251666432;visibility:visible;mso-wrap-style:square;mso-wrap-distance-left:9pt;mso-wrap-distance-top:0;mso-wrap-distance-right:9pt;mso-wrap-distance-bottom:0;mso-position-horizontal:absolute;mso-position-horizontal-relative:text;mso-position-vertical:absolute;mso-position-vertical-relative:text" from="0,-.05pt" to="484.2pt,-.05pt" o:gfxdata="UEsDBBQABgAIAAAAIQC2gziS/gAAAOEBAAATAAAAW0NvbnRlbnRfVHlwZXNdLnhtbJSRQU7DMBBF 90jcwfIWJU67QAgl6YK0S0CoHGBkTxKLZGx5TGhvj5O2G0SRWNoz/78nu9wcxkFMGNg6quQqL6RA 0s5Y6ir5vt9lD1JwBDIwOMJKHpHlpr69KfdHjyxSmriSfYz+USnWPY7AufNIadK6MEJMx9ApD/oD OlTrorhX2lFEilmcO2RdNtjC5xDF9pCuTyYBB5bi6bQ4syoJ3g9WQ0ymaiLzg5KdCXlKLjvcW893 SUOqXwnz5DrgnHtJTxOsQfEKIT7DmDSUCaxw7Rqn8787ZsmRM9e2VmPeBN4uqYvTtW7jvijg9N/y JsXecLq0q+WD6m8AAAD//wMAUEsDBBQABgAIAAAAIQA4/SH/1gAAAJQBAAALAAAAX3JlbHMvLnJl bHOkkMFqwzAMhu+DvYPRfXGawxijTi+j0GvpHsDYimMaW0Yy2fr2M4PBMnrbUb/Q94l/f/hMi1qR JVI2sOt6UJgd+ZiDgffL8ekFlFSbvV0oo4EbChzGx4f9GRdb25HMsYhqlCwG5lrLq9biZkxWOiqY 22YiTra2kYMu1l1tQD30/bPm3wwYN0x18gb45AdQl1tp5j/sFB2T0FQ7R0nTNEV3j6o9feQzro1i OWA14Fm+Q8a1a8+Bvu/d/dMb2JY5uiPbhG/ktn4cqGU/er3pcvwCAAD//wMAUEsDBBQABgAIAAAA IQCZ2PQonAEAAJQDAAAOAAAAZHJzL2Uyb0RvYy54bWysU01P3DAQvVfqf7B8Z5MAQm202T2A4FK1 qMAPMM54Y8n2WLbZZP99x97dLGorIRAXxx/z3sx7M1muJ2vYFkLU6DreLGrOwEnstdt0/Onx9uwb ZzEJ1wuDDjq+g8jXq69flqNv4RwHND0ERiQutqPv+JCSb6sqygGsiAv04OhRYbAi0TFsqj6Ikdit qc7r+qoaMfQ+oIQY6fZm/8hXhV8pkOmXUhESMx2n2lJZQ1mf81qtlqLdBOEHLQ9liA9UYYV2lHSm uhFJsJeg/6GyWgaMqNJCoq1QKS2haCA1Tf2XmodBeChayJzoZ5vi59HKn9trdx/IhtHHNvr7kFVM Ktj8pfrYVMzazWbBlJiky6vm8vvFJXkqj2/VCehDTHeAluVNx412WYdoxfZHTJSMQo8hdDilLru0 M5CDjfsNiumekjUFXaYCrk1gW0H9FFKCS03uIfGV6AxT2pgZWL8NPMRnKJSJeQ94RpTM6NIMttph +F/2NB1LVvv4owN73dmCZ+x3pSnFGmp9UXgY0zxbr88FfvqZVn8AAAD//wMAUEsDBBQABgAIAAAA IQCasyRQ4AAAAAkBAAAPAAAAZHJzL2Rvd25yZXYueG1sTI9Ba8JAEIXvhf6HZQq96UYpYmM2IpZS KxSpFfS4ZqdJ2uxs2F1N/Pcde2kvA4/He/O+bN7bRpzRh9qRgtEwAYFUOFNTqWD38TyYgghRk9GN I1RwwQDz/PYm06lxHb3jeRtLwSUUUq2girFNpQxFhVaHoWuR2Pt03urI0pfSeN1xuW3kOEkm0uqa +EOlW1xWWHxvT1bBm1+tlov15Ys2B9vtx+v95rV/Uer+rn+a8VnMQETs418Crgy8H3IednQnMkE0 CpgmKhiMQLD5OJk+gDj+apln8j9B/gMAAP//AwBQSwECLQAUAAYACAAAACEAtoM4kv4AAADhAQAA EwAAAAAAAAAAAAAAAAAAAAAAW0NvbnRlbnRfVHlwZXNdLnhtbFBLAQItABQABgAIAAAAIQA4/SH/ 1gAAAJQBAAALAAAAAAAAAAAAAAAAAC8BAABfcmVscy8ucmVsc1BLAQItABQABgAIAAAAIQCZ2PQo nAEAAJQDAAAOAAAAAAAAAAAAAAAAAC4CAABkcnMvZTJvRG9jLnhtbFBLAQItABQABgAIAAAAIQCa syRQ4AAAAAkBAAAPAAAAAAAAAAAAAAAAAPYDAABkcnMvZG93bnJldi54bWxQSwUGAAAAAAQABADz AAAAAwUAAAAA " strokecolor="#156082 [3204]" strokeweight=".5pt">
                 <v:stroke joinstyle="miter"/>
@@ -4176,7 +4162,7 @@
               </wp:anchor>
             </w:drawing>
           </mc:Choice>
-          <mc:Fallback xmlns:ns11="http://schemas.microsoft.com/office/drawing/2010/main" xmlns:ns5="http://schemas.openxmlformats.org/drawingml/2006/main" xmlns:ns9="http://schemas.openxmlformats.org/drawingml/2006/picture">
+          <mc:Fallback xmlns:ns9="http://schemas.openxmlformats.org/drawingml/2006/picture" xmlns:ns5="http://schemas.openxmlformats.org/drawingml/2006/main" xmlns:ns11="http://schemas.microsoft.com/office/drawing/2010/main">
             <w:pict>
               <v:line w14:anchorId="44DE2E80" id="Conexão Reta 3" o:spid="_x0000_s1026" style="position:absolute;z-index:251668480;visibility:visible;mso-wrap-style:square;mso-wrap-distance-left:9pt;mso-wrap-distance-top:0;mso-wrap-distance-right:9pt;mso-wrap-distance-bottom:0;mso-position-horizontal:absolute;mso-position-horizontal-relative:text;mso-position-vertical:absolute;mso-position-vertical-relative:text" from="0,0" to="484.2pt,0" o:gfxdata="UEsDBBQABgAIAAAAIQC2gziS/gAAAOEBAAATAAAAW0NvbnRlbnRfVHlwZXNdLnhtbJSRQU7DMBBF 90jcwfIWJU67QAgl6YK0S0CoHGBkTxKLZGx5TGhvj5O2G0SRWNoz/78nu9wcxkFMGNg6quQqL6RA 0s5Y6ir5vt9lD1JwBDIwOMJKHpHlpr69KfdHjyxSmriSfYz+USnWPY7AufNIadK6MEJMx9ApD/oD OlTrorhX2lFEilmcO2RdNtjC5xDF9pCuTyYBB5bi6bQ4syoJ3g9WQ0ymaiLzg5KdCXlKLjvcW893 SUOqXwnz5DrgnHtJTxOsQfEKIT7DmDSUCaxw7Rqn8787ZsmRM9e2VmPeBN4uqYvTtW7jvijg9N/y JsXecLq0q+WD6m8AAAD//wMAUEsDBBQABgAIAAAAIQA4/SH/1gAAAJQBAAALAAAAX3JlbHMvLnJl bHOkkMFqwzAMhu+DvYPRfXGawxijTi+j0GvpHsDYimMaW0Yy2fr2M4PBMnrbUb/Q94l/f/hMi1qR JVI2sOt6UJgd+ZiDgffL8ekFlFSbvV0oo4EbChzGx4f9GRdb25HMsYhqlCwG5lrLq9biZkxWOiqY 22YiTra2kYMu1l1tQD30/bPm3wwYN0x18gb45AdQl1tp5j/sFB2T0FQ7R0nTNEV3j6o9feQzro1i OWA14Fm+Q8a1a8+Bvu/d/dMb2JY5uiPbhG/ktn4cqGU/er3pcvwCAAD//wMAUEsDBBQABgAIAAAA IQCZ2PQonAEAAJQDAAAOAAAAZHJzL2Uyb0RvYy54bWysU01P3DAQvVfqf7B8Z5MAQm202T2A4FK1 qMAPMM54Y8n2WLbZZP99x97dLGorIRAXxx/z3sx7M1muJ2vYFkLU6DreLGrOwEnstdt0/Onx9uwb ZzEJ1wuDDjq+g8jXq69flqNv4RwHND0ERiQutqPv+JCSb6sqygGsiAv04OhRYbAi0TFsqj6Ikdit qc7r+qoaMfQ+oIQY6fZm/8hXhV8pkOmXUhESMx2n2lJZQ1mf81qtlqLdBOEHLQ9liA9UYYV2lHSm uhFJsJeg/6GyWgaMqNJCoq1QKS2haCA1Tf2XmodBeChayJzoZ5vi59HKn9trdx/IhtHHNvr7kFVM Ktj8pfrYVMzazWbBlJiky6vm8vvFJXkqj2/VCehDTHeAluVNx412WYdoxfZHTJSMQo8hdDilLru0 M5CDjfsNiumekjUFXaYCrk1gW0H9FFKCS03uIfGV6AxT2pgZWL8NPMRnKJSJeQ94RpTM6NIMttph +F/2NB1LVvv4owN73dmCZ+x3pSnFGmp9UXgY0zxbr88FfvqZVn8AAAD//wMAUEsDBBQABgAIAAAA IQBdcTjb3gAAAAcBAAAPAAAAZHJzL2Rvd25yZXYueG1sTI9Ba8JAEIXvBf/DMkJvdVMpYmM2IpZS KxSpLdjjmp0m0exs2F1N/Pcde2kvDx6PefO9bN7bRpzRh9qRgvtRAgKpcKamUsHnx/PdFESImoxu HKGCCwaY54ObTKfGdfSO520sBZdQSLWCKsY2lTIUFVodRq5F4uzbeasjW19K43XH5baR4ySZSKtr 4g+VbnFZYXHcnqyCN79aLRfry4E2X7bbjde7zWv/otTtsH+asSxmICL28e8CrhuYH3IG27sTmSAa Bbwm/ipnj5PpA4j91co8k//58x8AAAD//wMAUEsBAi0AFAAGAAgAAAAhALaDOJL+AAAA4QEAABMA AAAAAAAAAAAAAAAAAAAAAFtDb250ZW50X1R5cGVzXS54bWxQSwECLQAUAAYACAAAACEAOP0h/9YA AACUAQAACwAAAAAAAAAAAAAAAAAvAQAAX3JlbHMvLnJlbHNQSwECLQAUAAYACAAAACEAmdj0KJwB AACUAwAADgAAAAAAAAAAAAAAAAAuAgAAZHJzL2Uyb0RvYy54bWxQSwECLQAUAAYACAAAACEAXXE4 294AAAAHAQAADwAAAAAAAAAAAAAAAAD2AwAAZHJzL2Rvd25yZXYueG1sUEsFBgAAAAAEAAQA8wAA AAEFAAAAAA== " strokecolor="#156082 [3204]" strokeweight=".5pt">
                 <v:stroke joinstyle="miter"/>
@@ -4395,7 +4381,7 @@
               </wp:anchor>
             </w:drawing>
           </mc:Choice>
-          <mc:Fallback xmlns:ns11="http://schemas.microsoft.com/office/drawing/2010/main" xmlns:ns5="http://schemas.openxmlformats.org/drawingml/2006/main" xmlns:ns9="http://schemas.openxmlformats.org/drawingml/2006/picture">
+          <mc:Fallback xmlns:ns9="http://schemas.openxmlformats.org/drawingml/2006/picture" xmlns:ns5="http://schemas.openxmlformats.org/drawingml/2006/main" xmlns:ns11="http://schemas.microsoft.com/office/drawing/2010/main">
             <w:pict>
               <v:line w14:anchorId="7BCFBA01" id="Conexão Reta 3" o:spid="_x0000_s1026" style="position:absolute;z-index:251670528;visibility:visible;mso-wrap-style:square;mso-wrap-distance-left:9pt;mso-wrap-distance-top:0;mso-wrap-distance-right:9pt;mso-wrap-distance-bottom:0;mso-position-horizontal:absolute;mso-position-horizontal-relative:text;mso-position-vertical:absolute;mso-position-vertical-relative:text" from="0,-.05pt" to="484.2pt,-.05pt" o:gfxdata="UEsDBBQABgAIAAAAIQC2gziS/gAAAOEBAAATAAAAW0NvbnRlbnRfVHlwZXNdLnhtbJSRQU7DMBBF 90jcwfIWJU67QAgl6YK0S0CoHGBkTxKLZGx5TGhvj5O2G0SRWNoz/78nu9wcxkFMGNg6quQqL6RA 0s5Y6ir5vt9lD1JwBDIwOMJKHpHlpr69KfdHjyxSmriSfYz+USnWPY7AufNIadK6MEJMx9ApD/oD OlTrorhX2lFEilmcO2RdNtjC5xDF9pCuTyYBB5bi6bQ4syoJ3g9WQ0ymaiLzg5KdCXlKLjvcW893 SUOqXwnz5DrgnHtJTxOsQfEKIT7DmDSUCaxw7Rqn8787ZsmRM9e2VmPeBN4uqYvTtW7jvijg9N/y JsXecLq0q+WD6m8AAAD//wMAUEsDBBQABgAIAAAAIQA4/SH/1gAAAJQBAAALAAAAX3JlbHMvLnJl bHOkkMFqwzAMhu+DvYPRfXGawxijTi+j0GvpHsDYimMaW0Yy2fr2M4PBMnrbUb/Q94l/f/hMi1qR JVI2sOt6UJgd+ZiDgffL8ekFlFSbvV0oo4EbChzGx4f9GRdb25HMsYhqlCwG5lrLq9biZkxWOiqY 22YiTra2kYMu1l1tQD30/bPm3wwYN0x18gb45AdQl1tp5j/sFB2T0FQ7R0nTNEV3j6o9feQzro1i OWA14Fm+Q8a1a8+Bvu/d/dMb2JY5uiPbhG/ktn4cqGU/er3pcvwCAAD//wMAUEsDBBQABgAIAAAA IQCZ2PQonAEAAJQDAAAOAAAAZHJzL2Uyb0RvYy54bWysU01P3DAQvVfqf7B8Z5MAQm202T2A4FK1 qMAPMM54Y8n2WLbZZP99x97dLGorIRAXxx/z3sx7M1muJ2vYFkLU6DreLGrOwEnstdt0/Onx9uwb ZzEJ1wuDDjq+g8jXq69flqNv4RwHND0ERiQutqPv+JCSb6sqygGsiAv04OhRYbAi0TFsqj6Ikdit qc7r+qoaMfQ+oIQY6fZm/8hXhV8pkOmXUhESMx2n2lJZQ1mf81qtlqLdBOEHLQ9liA9UYYV2lHSm uhFJsJeg/6GyWgaMqNJCoq1QKS2haCA1Tf2XmodBeChayJzoZ5vi59HKn9trdx/IhtHHNvr7kFVM Ktj8pfrYVMzazWbBlJiky6vm8vvFJXkqj2/VCehDTHeAluVNx412WYdoxfZHTJSMQo8hdDilLru0 M5CDjfsNiumekjUFXaYCrk1gW0H9FFKCS03uIfGV6AxT2pgZWL8NPMRnKJSJeQ94RpTM6NIMttph +F/2NB1LVvv4owN73dmCZ+x3pSnFGmp9UXgY0zxbr88FfvqZVn8AAAD//wMAUEsDBBQABgAIAAAA IQCasyRQ4AAAAAkBAAAPAAAAZHJzL2Rvd25yZXYueG1sTI9Ba8JAEIXvhf6HZQq96UYpYmM2IpZS KxSpFfS4ZqdJ2uxs2F1N/Pcde2kvA4/He/O+bN7bRpzRh9qRgtEwAYFUOFNTqWD38TyYgghRk9GN I1RwwQDz/PYm06lxHb3jeRtLwSUUUq2girFNpQxFhVaHoWuR2Pt03urI0pfSeN1xuW3kOEkm0uqa +EOlW1xWWHxvT1bBm1+tlov15Ys2B9vtx+v95rV/Uer+rn+a8VnMQETs418Crgy8H3IednQnMkE0 CpgmKhiMQLD5OJk+gDj+apln8j9B/gMAAP//AwBQSwECLQAUAAYACAAAACEAtoM4kv4AAADhAQAA EwAAAAAAAAAAAAAAAAAAAAAAW0NvbnRlbnRfVHlwZXNdLnhtbFBLAQItABQABgAIAAAAIQA4/SH/ 1gAAAJQBAAALAAAAAAAAAAAAAAAAAC8BAABfcmVscy8ucmVsc1BLAQItABQABgAIAAAAIQCZ2PQo nAEAAJQDAAAOAAAAAAAAAAAAAAAAAC4CAABkcnMvZTJvRG9jLnhtbFBLAQItABQABgAIAAAAIQCa syRQ4AAAAAkBAAAPAAAAAAAAAAAAAAAAAPYDAABkcnMvZG93bnJldi54bWxQSwUGAAAAAAQABADz AAAAAwUAAAAA " strokecolor="#156082 [3204]" strokeweight=".5pt">
                 <v:stroke joinstyle="miter"/>
@@ -4650,7 +4636,7 @@
               </wp:anchor>
             </w:drawing>
           </mc:Choice>
-          <mc:Fallback xmlns:ns11="http://schemas.microsoft.com/office/drawing/2010/main" xmlns:ns5="http://schemas.openxmlformats.org/drawingml/2006/main" xmlns:ns9="http://schemas.openxmlformats.org/drawingml/2006/picture">
+          <mc:Fallback xmlns:ns9="http://schemas.openxmlformats.org/drawingml/2006/picture" xmlns:ns5="http://schemas.openxmlformats.org/drawingml/2006/main" xmlns:ns11="http://schemas.microsoft.com/office/drawing/2010/main">
             <w:pict>
               <v:line w14:anchorId="546AD9F8" id="Conexão Reta 3" o:spid="_x0000_s1026" style="position:absolute;z-index:251672576;visibility:visible;mso-wrap-style:square;mso-wrap-distance-left:9pt;mso-wrap-distance-top:0;mso-wrap-distance-right:9pt;mso-wrap-distance-bottom:0;mso-position-horizontal:absolute;mso-position-horizontal-relative:text;mso-position-vertical:absolute;mso-position-vertical-relative:text" from="0,-.05pt" to="484.2pt,-.05pt" o:gfxdata="UEsDBBQABgAIAAAAIQC2gziS/gAAAOEBAAATAAAAW0NvbnRlbnRfVHlwZXNdLnhtbJSRQU7DMBBF 90jcwfIWJU67QAgl6YK0S0CoHGBkTxKLZGx5TGhvj5O2G0SRWNoz/78nu9wcxkFMGNg6quQqL6RA 0s5Y6ir5vt9lD1JwBDIwOMJKHpHlpr69KfdHjyxSmriSfYz+USnWPY7AufNIadK6MEJMx9ApD/oD OlTrorhX2lFEilmcO2RdNtjC5xDF9pCuTyYBB5bi6bQ4syoJ3g9WQ0ymaiLzg5KdCXlKLjvcW893 SUOqXwnz5DrgnHtJTxOsQfEKIT7DmDSUCaxw7Rqn8787ZsmRM9e2VmPeBN4uqYvTtW7jvijg9N/y JsXecLq0q+WD6m8AAAD//wMAUEsDBBQABgAIAAAAIQA4/SH/1gAAAJQBAAALAAAAX3JlbHMvLnJl bHOkkMFqwzAMhu+DvYPRfXGawxijTi+j0GvpHsDYimMaW0Yy2fr2M4PBMnrbUb/Q94l/f/hMi1qR JVI2sOt6UJgd+ZiDgffL8ekFlFSbvV0oo4EbChzGx4f9GRdb25HMsYhqlCwG5lrLq9biZkxWOiqY 22YiTra2kYMu1l1tQD30/bPm3wwYN0x18gb45AdQl1tp5j/sFB2T0FQ7R0nTNEV3j6o9feQzro1i OWA14Fm+Q8a1a8+Bvu/d/dMb2JY5uiPbhG/ktn4cqGU/er3pcvwCAAD//wMAUEsDBBQABgAIAAAA IQCZ2PQonAEAAJQDAAAOAAAAZHJzL2Uyb0RvYy54bWysU01P3DAQvVfqf7B8Z5MAQm202T2A4FK1 qMAPMM54Y8n2WLbZZP99x97dLGorIRAXxx/z3sx7M1muJ2vYFkLU6DreLGrOwEnstdt0/Onx9uwb ZzEJ1wuDDjq+g8jXq69flqNv4RwHND0ERiQutqPv+JCSb6sqygGsiAv04OhRYbAi0TFsqj6Ikdit qc7r+qoaMfQ+oIQY6fZm/8hXhV8pkOmXUhESMx2n2lJZQ1mf81qtlqLdBOEHLQ9liA9UYYV2lHSm uhFJsJeg/6GyWgaMqNJCoq1QKS2haCA1Tf2XmodBeChayJzoZ5vi59HKn9trdx/IhtHHNvr7kFVM Ktj8pfrYVMzazWbBlJiky6vm8vvFJXkqj2/VCehDTHeAluVNx412WYdoxfZHTJSMQo8hdDilLru0 M5CDjfsNiumekjUFXaYCrk1gW0H9FFKCS03uIfGV6AxT2pgZWL8NPMRnKJSJeQ94RpTM6NIMttph +F/2NB1LVvv4owN73dmCZ+x3pSnFGmp9UXgY0zxbr88FfvqZVn8AAAD//wMAUEsDBBQABgAIAAAA IQCasyRQ4AAAAAkBAAAPAAAAZHJzL2Rvd25yZXYueG1sTI9Ba8JAEIXvhf6HZQq96UYpYmM2IpZS KxSpFfS4ZqdJ2uxs2F1N/Pcde2kvA4/He/O+bN7bRpzRh9qRgtEwAYFUOFNTqWD38TyYgghRk9GN I1RwwQDz/PYm06lxHb3jeRtLwSUUUq2girFNpQxFhVaHoWuR2Pt03urI0pfSeN1xuW3kOEkm0uqa +EOlW1xWWHxvT1bBm1+tlov15Ys2B9vtx+v95rV/Uer+rn+a8VnMQETs418Crgy8H3IednQnMkE0 CpgmKhiMQLD5OJk+gDj+apln8j9B/gMAAP//AwBQSwECLQAUAAYACAAAACEAtoM4kv4AAADhAQAA EwAAAAAAAAAAAAAAAAAAAAAAW0NvbnRlbnRfVHlwZXNdLnhtbFBLAQItABQABgAIAAAAIQA4/SH/ 1gAAAJQBAAALAAAAAAAAAAAAAAAAAC8BAABfcmVscy8ucmVsc1BLAQItABQABgAIAAAAIQCZ2PQo nAEAAJQDAAAOAAAAAAAAAAAAAAAAAC4CAABkcnMvZTJvRG9jLnhtbFBLAQItABQABgAIAAAAIQCa syRQ4AAAAAkBAAAPAAAAAAAAAAAAAAAAAPYDAABkcnMvZG93bnJldi54bWxQSwUGAAAAAAQABADz AAAAAwUAAAAA " strokecolor="#156082 [3204]" strokeweight=".5pt">
                 <v:stroke joinstyle="miter"/>
@@ -4685,6 +4671,218 @@
         </w:rPr>
         <w:t xml:space="preserve">→  </w:t>
       </w:r>
+      <w:r>
+        <w:fldChar w:fldCharType="begin"/>
+      </w:r>
+      <w:r>
+        <w:rPr>
+          <w:lang w:val="en-US"/>
+        </w:rPr>
+        <w:instrText>HYPERLINK "https://lmstudio.ai/"</w:instrText>
+      </w:r>
+      <w:r>
+        <w:fldChar w:fldCharType="separate"/>
+      </w:r>
+      <w:r>
+        <w:rPr>
+          <w:rStyle w:val="Hiperligao"/>
+          <w:color w:val="2E75B6"/>
+          <w:lang w:val="en-US"/>
+        </w:rPr>
+        <w:t>LM Studio</w:t>
+      </w:r>
+      <w:r>
+        <w:fldChar w:fldCharType="end"/>
+      </w:r>
+    </w:p>
+    <w:p>
+      <w:pPr>
+        <w:spacing w:before="60" w:after="60"/>
+        <w:rPr>
+          <w:lang w:val="en-US"/>
+        </w:rPr>
+      </w:pPr>
+      <w:r>
+        <w:rPr>
+          <w:b/>
+          <w:bCs/>
+          <w:color w:val="2E75B6"/>
+          <w:lang w:val="en-US"/>
+        </w:rPr>
+        <w:t xml:space="preserve">→  </w:t>
+      </w:r>
+      <w:r>
+        <w:fldChar w:fldCharType="begin"/>
+      </w:r>
+      <w:r>
+        <w:rPr>
+          <w:lang w:val="en-US"/>
+        </w:rPr>
+        <w:instrText>HYPERLINK "https://www.jan.ai/"</w:instrText>
+      </w:r>
+      <w:r>
+        <w:fldChar w:fldCharType="separate"/>
+      </w:r>
+      <w:r>
+        <w:rPr>
+          <w:rStyle w:val="Hiperligao"/>
+          <w:color w:val="2E75B6"/>
+          <w:lang w:val="en-US"/>
+        </w:rPr>
+        <w:t>Jan — Privacy-First Local AI</w:t>
+      </w:r>
+      <w:r>
+        <w:fldChar w:fldCharType="end"/>
+      </w:r>
+    </w:p>
+    <w:p>
+      <w:pPr>
+        <w:spacing w:before="60" w:after="60"/>
+        <w:rPr>
+          <w:lang w:val="en-US"/>
+        </w:rPr>
+      </w:pPr>
+      <w:r>
+        <w:rPr>
+          <w:b/>
+          <w:bCs/>
+          <w:color w:val="2E75B6"/>
+          <w:lang w:val="en-US"/>
+        </w:rPr>
+        <w:t xml:space="preserve">→  </w:t>
+      </w:r>
+      <w:r>
+        <w:fldChar w:fldCharType="begin"/>
+      </w:r>
+      <w:r>
+        <w:rPr>
+          <w:lang w:val="en-US"/>
+        </w:rPr>
+        <w:instrText>HYPERLINK "https://www.nomic.ai/gpt4all"</w:instrText>
+      </w:r>
+      <w:r>
+        <w:fldChar w:fldCharType="separate"/>
+      </w:r>
+      <w:r>
+        <w:rPr>
+          <w:rStyle w:val="Hiperligao"/>
+          <w:color w:val="2E75B6"/>
+          <w:lang w:val="en-US"/>
+        </w:rPr>
+        <w:t>GPT4All</w:t>
+      </w:r>
+      <w:r>
+        <w:fldChar w:fldCharType="end"/>
+      </w:r>
+    </w:p>
+    <w:p>
+      <w:pPr>
+        <w:spacing w:before="60" w:after="60"/>
+        <w:rPr>
+          <w:lang w:val="en-US"/>
+        </w:rPr>
+      </w:pPr>
+      <w:r>
+        <w:rPr>
+          <w:b/>
+          <w:bCs/>
+          <w:color w:val="2E75B6"/>
+          <w:lang w:val="en-US"/>
+        </w:rPr>
+        <w:t xml:space="preserve">→  </w:t>
+      </w:r>
+      <w:r>
+        <w:fldChar w:fldCharType="begin"/>
+      </w:r>
+      <w:r>
+        <w:rPr>
+          <w:lang w:val="en-US"/>
+        </w:rPr>
+        <w:instrText>HYPERLINK "https://podman-desktop.io/docs/ai-lab"</w:instrText>
+      </w:r>
+      <w:r>
+        <w:fldChar w:fldCharType="separate"/>
+      </w:r>
+      <w:proofErr w:type="spellStart"/>
+      <w:r>
+        <w:rPr>
+          <w:rStyle w:val="Hiperligao"/>
+          <w:color w:val="2E75B6"/>
+          <w:lang w:val="en-US"/>
+        </w:rPr>
+        <w:t>Podman</w:t>
+      </w:r>
+      <w:proofErr w:type="spellEnd"/>
+      <w:r>
+        <w:rPr>
+          <w:rStyle w:val="Hiperligao"/>
+          <w:color w:val="2E75B6"/>
+          <w:lang w:val="en-US"/>
+        </w:rPr>
+        <w:t xml:space="preserve"> Desktop AI Lab</w:t>
+      </w:r>
+      <w:r>
+        <w:fldChar w:fldCharType="end"/>
+      </w:r>
+    </w:p>
+    <w:p>
+      <w:pPr>
+        <w:spacing w:before="60" w:after="60"/>
+        <w:rPr>
+          <w:lang w:val="en-US"/>
+        </w:rPr>
+      </w:pPr>
+      <w:r>
+        <w:rPr>
+          <w:b/>
+          <w:bCs/>
+          <w:color w:val="2E75B6"/>
+          <w:lang w:val="en-US"/>
+        </w:rPr>
+        <w:t xml:space="preserve">→  </w:t>
+      </w:r>
+      <w:r>
+        <w:fldChar w:fldCharType="begin"/>
+      </w:r>
+      <w:r>
+        <w:rPr>
+          <w:lang w:val="en-US"/>
+        </w:rPr>
+        <w:instrText>HYPERLINK "https://ramalama.ai/"</w:instrText>
+      </w:r>
+      <w:r>
+        <w:fldChar w:fldCharType="separate"/>
+      </w:r>
+      <w:proofErr w:type="spellStart"/>
+      <w:r>
+        <w:rPr>
+          <w:rStyle w:val="Hiperligao"/>
+          <w:color w:val="2E75B6"/>
+          <w:lang w:val="en-US"/>
+        </w:rPr>
+        <w:t>Ramalama</w:t>
+      </w:r>
+      <w:proofErr w:type="spellEnd"/>
+      <w:r>
+        <w:fldChar w:fldCharType="end"/>
+      </w:r>
+    </w:p>
+    <w:p>
+      <w:pPr>
+        <w:spacing w:before="60" w:after="60"/>
+        <w:rPr>
+          <w:lang w:val="en-US"/>
+        </w:rPr>
+      </w:pPr>
+      <w:r>
+        <w:rPr>
+          <w:b/>
+          <w:bCs/>
+          <w:color w:val="2E75B6"/>
+          <w:lang w:val="en-US"/>
+        </w:rPr>
+        <w:t xml:space="preserve">→  </w:t>
+      </w:r>
       <w:hyperlink r:id="rId10" w:history="1">
         <w:r>
           <w:rPr>
@@ -4692,7 +4890,7 @@
             <w:color w:val="2E75B6"/>
             <w:lang w:val="en-US"/>
           </w:rPr>
-          <w:t>LM Studio</w:t>
+          <w:t>IBM Granite 4.0 Language Models</w:t>
         </w:r>
       </w:hyperlink>
     </w:p>
@@ -4719,7 +4917,25 @@
             <w:color w:val="2E75B6"/>
             <w:lang w:val="en-US"/>
           </w:rPr>
-          <w:t>Jan — Privacy-First Local AI</w:t>
+          <w:t xml:space="preserve">Dark Reading: </w:t>
+        </w:r>
+        <w:proofErr w:type="gramStart"/>
+        <w:r>
+          <w:rPr>
+            <w:rStyle w:val="Hiperligao"/>
+            <w:color w:val="2E75B6"/>
+            <w:lang w:val="en-US"/>
+          </w:rPr>
+          <w:t>Open Source</w:t>
+        </w:r>
+        <w:proofErr w:type="gramEnd"/>
+        <w:r>
+          <w:rPr>
+            <w:rStyle w:val="Hiperligao"/>
+            <w:color w:val="2E75B6"/>
+            <w:lang w:val="en-US"/>
+          </w:rPr>
+          <w:t xml:space="preserve"> AI Models Security Risks</w:t>
         </w:r>
       </w:hyperlink>
     </w:p>
@@ -4746,7 +4962,7 @@
             <w:color w:val="2E75B6"/>
             <w:lang w:val="en-US"/>
           </w:rPr>
-          <w:t>GPT4All</w:t>
+          <w:t>Slides (Speaker Deck)</w:t>
         </w:r>
       </w:hyperlink>
     </w:p>
@@ -4767,227 +4983,28 @@
         <w:t xml:space="preserve">→  </w:t>
       </w:r>
       <w:hyperlink r:id="rId13" w:history="1">
-        <w:proofErr w:type="spellStart"/>
         <w:r>
           <w:rPr>
             <w:rStyle w:val="Hiperligao"/>
-            <w:color w:val="2E75B6"/>
             <w:lang w:val="en-US"/>
           </w:rPr>
-          <w:t>Podman</w:t>
-        </w:r>
-        <w:proofErr w:type="spellEnd"/>
-        <w:r>
-          <w:rPr>
-            <w:rStyle w:val="Hiperligao"/>
-            <w:color w:val="2E75B6"/>
-            <w:lang w:val="en-US"/>
-          </w:rPr>
-          <w:t xml:space="preserve"> Desktop AI Lab</w:t>
+          <w:t>Can I Run AI locally</w:t>
         </w:r>
       </w:hyperlink>
     </w:p>
     <w:p>
       <w:pPr>
         <w:spacing w:before="60" w:after="60"/>
-        <w:rPr>
-          <w:lang w:val="en-US"/>
-        </w:rPr>
       </w:pPr>
       <w:r>
         <w:rPr>
           <w:b/>
           <w:bCs/>
           <w:color w:val="2E75B6"/>
-          <w:lang w:val="en-US"/>
         </w:rPr>
         <w:t xml:space="preserve">→  </w:t>
       </w:r>
       <w:hyperlink r:id="rId14" w:history="1">
-        <w:proofErr w:type="spellStart"/>
-        <w:r>
-          <w:rPr>
-            <w:rStyle w:val="Hiperligao"/>
-            <w:color w:val="2E75B6"/>
-            <w:lang w:val="en-US"/>
-          </w:rPr>
-          <w:t>Ramalama</w:t>
-        </w:r>
-        <w:proofErr w:type="spellEnd"/>
-      </w:hyperlink>
-    </w:p>
-    <w:p>
-      <w:pPr>
-        <w:spacing w:before="60" w:after="60"/>
-        <w:rPr>
-          <w:lang w:val="en-US"/>
-        </w:rPr>
-      </w:pPr>
-      <w:r>
-        <w:rPr>
-          <w:b/>
-          <w:bCs/>
-          <w:color w:val="2E75B6"/>
-          <w:lang w:val="en-US"/>
-        </w:rPr>
-        <w:t xml:space="preserve">→  </w:t>
-      </w:r>
-      <w:r>
-        <w:fldChar w:fldCharType="begin"/>
-      </w:r>
-      <w:r>
-        <w:rPr>
-          <w:lang w:val="en-US"/>
-        </w:rPr>
-        <w:instrText>HYPERLINK "https://github.com/ibm-granite/granite-4.0-language-models"</w:instrText>
-      </w:r>
-      <w:r>
-        <w:fldChar w:fldCharType="separate"/>
-      </w:r>
-      <w:r>
-        <w:rPr>
-          <w:rStyle w:val="Hiperligao"/>
-          <w:color w:val="2E75B6"/>
-          <w:lang w:val="en-US"/>
-        </w:rPr>
-        <w:t>IBM Granite 4.0 Language Models</w:t>
-      </w:r>
-      <w:r>
-        <w:fldChar w:fldCharType="end"/>
-      </w:r>
-    </w:p>
-    <w:p>
-      <w:pPr>
-        <w:spacing w:before="60" w:after="60"/>
-        <w:rPr>
-          <w:lang w:val="en-US"/>
-        </w:rPr>
-      </w:pPr>
-      <w:r>
-        <w:rPr>
-          <w:b/>
-          <w:bCs/>
-          <w:color w:val="2E75B6"/>
-          <w:lang w:val="en-US"/>
-        </w:rPr>
-        <w:t xml:space="preserve">→  </w:t>
-      </w:r>
-      <w:r>
-        <w:fldChar w:fldCharType="begin"/>
-      </w:r>
-      <w:r>
-        <w:rPr>
-          <w:lang w:val="en-US"/>
-        </w:rPr>
-        <w:instrText>HYPERLINK "https://www.darkreading.com/cyber-risk/open-source-ai-models-pose-risks-of-malicious-code-vulnerabilities"</w:instrText>
-      </w:r>
-      <w:r>
-        <w:fldChar w:fldCharType="separate"/>
-      </w:r>
-      <w:r>
-        <w:rPr>
-          <w:rStyle w:val="Hiperligao"/>
-          <w:color w:val="2E75B6"/>
-          <w:lang w:val="en-US"/>
-        </w:rPr>
-        <w:t>Dark Reading: Open Source AI Models Security Risks</w:t>
-      </w:r>
-      <w:r>
-        <w:fldChar w:fldCharType="end"/>
-      </w:r>
-    </w:p>
-    <w:p>
-      <w:pPr>
-        <w:spacing w:before="60" w:after="60"/>
-        <w:rPr>
-          <w:lang w:val="en-US"/>
-        </w:rPr>
-      </w:pPr>
-      <w:r>
-        <w:rPr>
-          <w:b/>
-          <w:bCs/>
-          <w:color w:val="2E75B6"/>
-          <w:lang w:val="en-US"/>
-        </w:rPr>
-        <w:t xml:space="preserve">→  </w:t>
-      </w:r>
-      <w:r>
-        <w:fldChar w:fldCharType="begin"/>
-      </w:r>
-      <w:r>
-        <w:rPr>
-          <w:lang w:val="en-US"/>
-        </w:rPr>
-        <w:instrText>HYPERLINK "https://speakerdeck.com/kdubois/jcon-local-development-in-the-ai-era"</w:instrText>
-      </w:r>
-      <w:r>
-        <w:fldChar w:fldCharType="separate"/>
-      </w:r>
-      <w:r>
-        <w:rPr>
-          <w:rStyle w:val="Hiperligao"/>
-          <w:color w:val="2E75B6"/>
-          <w:lang w:val="en-US"/>
-        </w:rPr>
-        <w:t>Slides (Speaker Deck)</w:t>
-      </w:r>
-      <w:r>
-        <w:fldChar w:fldCharType="end"/>
-      </w:r>
-    </w:p>
-    <w:p>
-      <w:pPr>
-        <w:spacing w:before="60" w:after="60"/>
-        <w:rPr>
-          <w:lang w:val="en-US"/>
-        </w:rPr>
-      </w:pPr>
-      <w:r>
-        <w:rPr>
-          <w:b/>
-          <w:bCs/>
-          <w:color w:val="2E75B6"/>
-          <w:lang w:val="en-US"/>
-        </w:rPr>
-        <w:t xml:space="preserve">→  </w:t>
-      </w:r>
-      <w:r>
-        <w:fldChar w:fldCharType="begin"/>
-      </w:r>
-      <w:r>
-        <w:rPr>
-          <w:lang w:val="en-US"/>
-        </w:rPr>
-        <w:instrText>HYPERLINK "https://www.canirun.ai/"</w:instrText>
-      </w:r>
-      <w:r>
-        <w:fldChar w:fldCharType="separate"/>
-      </w:r>
-      <w:r>
-        <w:rPr>
-          <w:rStyle w:val="Hiperligao"/>
-          <w:lang w:val="en-US"/>
-        </w:rPr>
-        <w:t>Can I Run AI locally</w:t>
-      </w:r>
-      <w:r>
-        <w:fldChar w:fldCharType="end"/>
-      </w:r>
-    </w:p>
-    <w:p>
-      <w:pPr>
-        <w:spacing w:before="60" w:after="60"/>
-      </w:pPr>
-      <w:r>
-        <w:rPr>
-          <w:b/>
-          <w:bCs/>
-          <w:color w:val="2E75B6"/>
-        </w:rPr>
-        <w:t xml:space="preserve">→  </w:t>
-      </w:r>
-      <w:hyperlink r:id="rId15" w:history="1">
         <w:r>
           <w:rPr>
             <w:rStyle w:val="Hiperligao"/>
@@ -5012,37 +5029,24 @@
         </w:rPr>
         <w:t xml:space="preserve">→  </w:t>
       </w:r>
-      <w:r>
-        <w:fldChar w:fldCharType="begin"/>
-      </w:r>
-      <w:r>
-        <w:rPr>
-          <w:lang w:val="en-US"/>
-        </w:rPr>
-        <w:instrText>HYPERLINK "https://sudipta-deb.in/2026/03/llmfit-stop-guessing-which-ai-models-will-run-on-your-machine.html"</w:instrText>
-      </w:r>
-      <w:r>
-        <w:fldChar w:fldCharType="separate"/>
-      </w:r>
-      <w:proofErr w:type="spellStart"/>
-      <w:r>
-        <w:rPr>
-          <w:rStyle w:val="Hiperligao"/>
-          <w:lang w:val="en-US"/>
-        </w:rPr>
-        <w:t>llmfit</w:t>
-      </w:r>
-      <w:proofErr w:type="spellEnd"/>
-      <w:r>
-        <w:rPr>
-          <w:rStyle w:val="Hiperligao"/>
-          <w:lang w:val="en-US"/>
-        </w:rPr>
-        <w:t xml:space="preserve"> — Stop Guessing Which AI Models Will Run on Your Machine</w:t>
-      </w:r>
-      <w:r>
-        <w:fldChar w:fldCharType="end"/>
-      </w:r>
+      <w:hyperlink r:id="rId15" w:history="1">
+        <w:proofErr w:type="spellStart"/>
+        <w:r>
+          <w:rPr>
+            <w:rStyle w:val="Hiperligao"/>
+            <w:lang w:val="en-US"/>
+          </w:rPr>
+          <w:t>llmfit</w:t>
+        </w:r>
+        <w:proofErr w:type="spellEnd"/>
+        <w:r>
+          <w:rPr>
+            <w:rStyle w:val="Hiperligao"/>
+            <w:lang w:val="en-US"/>
+          </w:rPr>
+          <w:t xml:space="preserve"> — Stop Guessing Which AI Models Will Run on Your Machine</w:t>
+        </w:r>
+      </w:hyperlink>
     </w:p>
     <w:p>
       <w:pPr>
@@ -5252,7 +5256,7 @@
               </wp:anchor>
             </w:drawing>
           </mc:Choice>
-          <mc:Fallback xmlns:ns11="http://schemas.microsoft.com/office/drawing/2010/main" xmlns:ns5="http://schemas.openxmlformats.org/drawingml/2006/main" xmlns:ns9="http://schemas.openxmlformats.org/drawingml/2006/picture">
+          <mc:Fallback xmlns:ns9="http://schemas.openxmlformats.org/drawingml/2006/picture" xmlns:ns5="http://schemas.openxmlformats.org/drawingml/2006/main" xmlns:ns11="http://schemas.microsoft.com/office/drawing/2010/main">
             <w:pict>
               <v:line w14:anchorId="353A3786" id="Conexão Reta 3" o:spid="_x0000_s1026" style="position:absolute;z-index:251674624;visibility:visible;mso-wrap-style:square;mso-wrap-distance-left:9pt;mso-wrap-distance-top:0;mso-wrap-distance-right:9pt;mso-wrap-distance-bottom:0;mso-position-horizontal:absolute;mso-position-horizontal-relative:text;mso-position-vertical:absolute;mso-position-vertical-relative:text" from="0,-.05pt" to="484.2pt,-.05pt" o:gfxdata="UEsDBBQABgAIAAAAIQC2gziS/gAAAOEBAAATAAAAW0NvbnRlbnRfVHlwZXNdLnhtbJSRQU7DMBBF 90jcwfIWJU67QAgl6YK0S0CoHGBkTxKLZGx5TGhvj5O2G0SRWNoz/78nu9wcxkFMGNg6quQqL6RA 0s5Y6ir5vt9lD1JwBDIwOMJKHpHlpr69KfdHjyxSmriSfYz+USnWPY7AufNIadK6MEJMx9ApD/oD OlTrorhX2lFEilmcO2RdNtjC5xDF9pCuTyYBB5bi6bQ4syoJ3g9WQ0ymaiLzg5KdCXlKLjvcW893 SUOqXwnz5DrgnHtJTxOsQfEKIT7DmDSUCaxw7Rqn8787ZsmRM9e2VmPeBN4uqYvTtW7jvijg9N/y JsXecLq0q+WD6m8AAAD//wMAUEsDBBQABgAIAAAAIQA4/SH/1gAAAJQBAAALAAAAX3JlbHMvLnJl bHOkkMFqwzAMhu+DvYPRfXGawxijTi+j0GvpHsDYimMaW0Yy2fr2M4PBMnrbUb/Q94l/f/hMi1qR JVI2sOt6UJgd+ZiDgffL8ekFlFSbvV0oo4EbChzGx4f9GRdb25HMsYhqlCwG5lrLq9biZkxWOiqY 22YiTra2kYMu1l1tQD30/bPm3wwYN0x18gb45AdQl1tp5j/sFB2T0FQ7R0nTNEV3j6o9feQzro1i OWA14Fm+Q8a1a8+Bvu/d/dMb2JY5uiPbhG/ktn4cqGU/er3pcvwCAAD//wMAUEsDBBQABgAIAAAA IQCZ2PQonAEAAJQDAAAOAAAAZHJzL2Uyb0RvYy54bWysU01P3DAQvVfqf7B8Z5MAQm202T2A4FK1 qMAPMM54Y8n2WLbZZP99x97dLGorIRAXxx/z3sx7M1muJ2vYFkLU6DreLGrOwEnstdt0/Onx9uwb ZzEJ1wuDDjq+g8jXq69flqNv4RwHND0ERiQutqPv+JCSb6sqygGsiAv04OhRYbAi0TFsqj6Ikdit qc7r+qoaMfQ+oIQY6fZm/8hXhV8pkOmXUhESMx2n2lJZQ1mf81qtlqLdBOEHLQ9liA9UYYV2lHSm uhFJsJeg/6GyWgaMqNJCoq1QKS2haCA1Tf2XmodBeChayJzoZ5vi59HKn9trdx/IhtHHNvr7kFVM Ktj8pfrYVMzazWbBlJiky6vm8vvFJXkqj2/VCehDTHeAluVNx412WYdoxfZHTJSMQo8hdDilLru0 M5CDjfsNiumekjUFXaYCrk1gW0H9FFKCS03uIfGV6AxT2pgZWL8NPMRnKJSJeQ94RpTM6NIMttph +F/2NB1LVvv4owN73dmCZ+x3pSnFGmp9UXgY0zxbr88FfvqZVn8AAAD//wMAUEsDBBQABgAIAAAA IQCasyRQ4AAAAAkBAAAPAAAAZHJzL2Rvd25yZXYueG1sTI9Ba8JAEIXvhf6HZQq96UYpYmM2IpZS KxSpFfS4ZqdJ2uxs2F1N/Pcde2kvA4/He/O+bN7bRpzRh9qRgtEwAYFUOFNTqWD38TyYgghRk9GN I1RwwQDz/PYm06lxHb3jeRtLwSUUUq2girFNpQxFhVaHoWuR2Pt03urI0pfSeN1xuW3kOEkm0uqa +EOlW1xWWHxvT1bBm1+tlov15Ys2B9vtx+v95rV/Uer+rn+a8VnMQETs418Crgy8H3IednQnMkE0 CpgmKhiMQLD5OJk+gDj+apln8j9B/gMAAP//AwBQSwECLQAUAAYACAAAACEAtoM4kv4AAADhAQAA EwAAAAAAAAAAAAAAAAAAAAAAW0NvbnRlbnRfVHlwZXNdLnhtbFBLAQItABQABgAIAAAAIQA4/SH/ 1gAAAJQBAAALAAAAAAAAAAAAAAAAAC8BAABfcmVscy8ucmVsc1BLAQItABQABgAIAAAAIQCZ2PQo nAEAAJQDAAAOAAAAAAAAAAAAAAAAAC4CAABkcnMvZTJvRG9jLnhtbFBLAQItABQABgAIAAAAIQCa syRQ4AAAAAkBAAAPAAAAAAAAAAAAAAAAAPYDAABkcnMvZG93bnJldi54bWxQSwUGAAAAAAQABADz AAAAAwUAAAAA " strokecolor="#156082 [3204]" strokeweight=".5pt">
                 <v:stroke joinstyle="miter"/>
@@ -5695,13 +5699,15 @@
     <w:p>
       <w:pPr>
         <w:spacing w:before="120" w:after="40"/>
-        <w:jc w:val="center"/>
-      </w:pPr>
-      <w:r>
+      </w:pPr>
+      <w:r>
+        <w:rPr>
+          <w:noProof/>
+        </w:rPr>
         <w:drawing>
-          <wp:inline distT="0" distB="0" distL="0" distR="0" wp14:anchorId="075BF8AD" wp14:editId="23998D63">
-            <wp:extent cx="6120130" cy="3251200"/>
-            <wp:effectExtent l="0" t="0" r="1270" b="0"/>
+          <wp:inline distT="0" distB="0" distL="0" distR="0" wp14:anchorId="075BF8AD" wp14:editId="564663EF">
+            <wp:extent cx="5110619" cy="2714917"/>
+            <wp:effectExtent l="0" t="0" r="0" b="3175"/>
             <wp:docPr id="1761303237" name="Imagem 1"/>
             <wp:cNvGraphicFramePr>
               <a:graphicFrameLocks xmlns:a="http://schemas.openxmlformats.org/drawingml/2006/main" noChangeAspect="1"/>
@@ -5722,7 +5728,7 @@
                   <pic:spPr>
                     <a:xfrm>
                       <a:off x="0" y="0"/>
-                      <a:ext cx="6120130" cy="3251200"/>
+                      <a:ext cx="5168062" cy="2745432"/>
                     </a:xfrm>
                     <a:prstGeom prst="rect">
                       <a:avLst/>
@@ -6148,7 +6154,6 @@
                 <w:sz w:val="20"/>
                 <w:szCs w:val="20"/>
               </w:rPr>
-              <w:lastRenderedPageBreak/>
               <w:t>HibernateAssistantLC4J / SpringAI</w:t>
             </w:r>
           </w:p>
@@ -6232,6 +6237,7 @@
                 <w:sz w:val="20"/>
                 <w:szCs w:val="20"/>
               </w:rPr>
+              <w:lastRenderedPageBreak/>
               <w:t>MetamodelJsonSerializer</w:t>
             </w:r>
           </w:p>
@@ -7906,7 +7912,6 @@
                 <w:szCs w:val="18"/>
                 <w:lang w:val="en-US"/>
               </w:rPr>
-              <w:lastRenderedPageBreak/>
               <w:t xml:space="preserve">  return chatModel.chat(ChatRequest.builder(</w:t>
             </w:r>
             <w:proofErr w:type="gramStart"/>
@@ -8082,6 +8087,7 @@
                 <w:sz w:val="18"/>
                 <w:szCs w:val="18"/>
               </w:rPr>
+              <w:lastRenderedPageBreak/>
               <w:t>}</w:t>
             </w:r>
           </w:p>
@@ -9117,11 +9123,11 @@
         <w:spacing w:before="80" w:after="80" w:line="276" w:lineRule="auto"/>
       </w:pPr>
       <w:r>
-        <w:t xml:space="preserve">Os dois projetos V2 implementam exatamente a mesma arquitetura sobre a mesma biblioteca oficial: o metamodelo constrói o prompt, o LLM gera HQL, o Hibernate valida e executa, o LLM </w:t>
+        <w:t xml:space="preserve">Os dois projetos V2 implementam exatamente a mesma arquitetura sobre a mesma biblioteca oficial: o metamodelo constrói o prompt, o LLM gera HQL, o Hibernate valida e executa, o LLM redige a resposta. A única diferença é a API de integração com o LLM. As entidades, o data.sql, os dois serializers de ocultação (FilteringMetamodelSerializer / FilteringResultsSerializer) e a suite </w:t>
       </w:r>
       <w:r>
         <w:lastRenderedPageBreak/>
-        <w:t>redige a resposta. A única diferença é a API de integração com o LLM. As entidades, o data.sql, os dois serializers de ocultação (FilteringMetamodelSerializer / FilteringResultsSerializer) e a suite de testes são partilhados, byte a byte — provando que essas camadas não dependem do framework de LLM.</w:t>
+        <w:t>de testes são partilhados, byte a byte — provando que essas camadas não dependem do framework de LLM.</w:t>
       </w:r>
     </w:p>
     <w:p>
@@ -9154,55 +9160,16 @@
         <w:rPr>
           <w:b/>
           <w:bCs/>
-        </w:rPr>
-      </w:pPr>
-      <w:proofErr w:type="spellStart"/>
+          <w:lang w:val="en-US"/>
+        </w:rPr>
+      </w:pPr>
       <w:r>
         <w:rPr>
           <w:b/>
           <w:bCs/>
-        </w:rPr>
-        <w:t>spring</w:t>
-      </w:r>
-      <w:proofErr w:type="spellEnd"/>
-      <w:r>
-        <w:rPr>
-          <w:b/>
-          <w:bCs/>
-        </w:rPr>
-        <w:t>-</w:t>
-      </w:r>
-      <w:proofErr w:type="gramStart"/>
-      <w:r>
-        <w:rPr>
-          <w:b/>
-          <w:bCs/>
-        </w:rPr>
-        <w:t>ai</w:t>
-      </w:r>
-      <w:proofErr w:type="gramEnd"/>
-      <w:r>
-        <w:rPr>
-          <w:b/>
-          <w:bCs/>
-        </w:rPr>
-        <w:t>-</w:t>
-      </w:r>
-      <w:proofErr w:type="spellStart"/>
-      <w:r>
-        <w:rPr>
-          <w:b/>
-          <w:bCs/>
-        </w:rPr>
-        <w:t>assistant</w:t>
-      </w:r>
-      <w:proofErr w:type="spellEnd"/>
-      <w:r>
-        <w:rPr>
-          <w:b/>
-          <w:bCs/>
-        </w:rPr>
-        <w:t>-demo (Spring AI)</w:t>
+          <w:lang w:val="en-US"/>
+        </w:rPr>
+        <w:t>spring-ai-assistant-demo (Spring AI)</w:t>
       </w:r>
     </w:p>
     <w:p>
@@ -10234,7 +10201,6 @@
         <w:rPr>
           <w:noProof/>
         </w:rPr>
-        <w:lastRenderedPageBreak/>
         <mc:AlternateContent>
           <mc:Choice Requires="wps">
             <w:drawing>
@@ -10285,7 +10251,7 @@
               </wp:anchor>
             </w:drawing>
           </mc:Choice>
-          <mc:Fallback xmlns:ns11="http://schemas.microsoft.com/office/drawing/2010/main" xmlns:ns5="http://schemas.openxmlformats.org/drawingml/2006/main" xmlns:ns9="http://schemas.openxmlformats.org/drawingml/2006/picture">
+          <mc:Fallback xmlns:ns9="http://schemas.openxmlformats.org/drawingml/2006/picture" xmlns:ns5="http://schemas.openxmlformats.org/drawingml/2006/main" xmlns:ns11="http://schemas.microsoft.com/office/drawing/2010/main">
             <w:pict>
               <v:line w14:anchorId="33CA8BAD" id="Conexão Reta 3" o:spid="_x0000_s1026" style="position:absolute;z-index:251684864;visibility:visible;mso-wrap-style:square;mso-wrap-distance-left:9pt;mso-wrap-distance-top:0;mso-wrap-distance-right:9pt;mso-wrap-distance-bottom:0;mso-position-horizontal:absolute;mso-position-horizontal-relative:text;mso-position-vertical:absolute;mso-position-vertical-relative:text" from="0,0" to="484.2pt,0" o:gfxdata="UEsDBBQABgAIAAAAIQC2gziS/gAAAOEBAAATAAAAW0NvbnRlbnRfVHlwZXNdLnhtbJSRQU7DMBBF 90jcwfIWJU67QAgl6YK0S0CoHGBkTxKLZGx5TGhvj5O2G0SRWNoz/78nu9wcxkFMGNg6quQqL6RA 0s5Y6ir5vt9lD1JwBDIwOMJKHpHlpr69KfdHjyxSmriSfYz+USnWPY7AufNIadK6MEJMx9ApD/oD OlTrorhX2lFEilmcO2RdNtjC5xDF9pCuTyYBB5bi6bQ4syoJ3g9WQ0ymaiLzg5KdCXlKLjvcW893 SUOqXwnz5DrgnHtJTxOsQfEKIT7DmDSUCaxw7Rqn8787ZsmRM9e2VmPeBN4uqYvTtW7jvijg9N/y JsXecLq0q+WD6m8AAAD//wMAUEsDBBQABgAIAAAAIQA4/SH/1gAAAJQBAAALAAAAX3JlbHMvLnJl bHOkkMFqwzAMhu+DvYPRfXGawxijTi+j0GvpHsDYimMaW0Yy2fr2M4PBMnrbUb/Q94l/f/hMi1qR JVI2sOt6UJgd+ZiDgffL8ekFlFSbvV0oo4EbChzGx4f9GRdb25HMsYhqlCwG5lrLq9biZkxWOiqY 22YiTra2kYMu1l1tQD30/bPm3wwYN0x18gb45AdQl1tp5j/sFB2T0FQ7R0nTNEV3j6o9feQzro1i OWA14Fm+Q8a1a8+Bvu/d/dMb2JY5uiPbhG/ktn4cqGU/er3pcvwCAAD//wMAUEsDBBQABgAIAAAA IQCZ2PQonAEAAJQDAAAOAAAAZHJzL2Uyb0RvYy54bWysU01P3DAQvVfqf7B8Z5MAQm202T2A4FK1 qMAPMM54Y8n2WLbZZP99x97dLGorIRAXxx/z3sx7M1muJ2vYFkLU6DreLGrOwEnstdt0/Onx9uwb ZzEJ1wuDDjq+g8jXq69flqNv4RwHND0ERiQutqPv+JCSb6sqygGsiAv04OhRYbAi0TFsqj6Ikdit qc7r+qoaMfQ+oIQY6fZm/8hXhV8pkOmXUhESMx2n2lJZQ1mf81qtlqLdBOEHLQ9liA9UYYV2lHSm uhFJsJeg/6GyWgaMqNJCoq1QKS2haCA1Tf2XmodBeChayJzoZ5vi59HKn9trdx/IhtHHNvr7kFVM Ktj8pfrYVMzazWbBlJiky6vm8vvFJXkqj2/VCehDTHeAluVNx412WYdoxfZHTJSMQo8hdDilLru0 M5CDjfsNiumekjUFXaYCrk1gW0H9FFKCS03uIfGV6AxT2pgZWL8NPMRnKJSJeQ94RpTM6NIMttph +F/2NB1LVvv4owN73dmCZ+x3pSnFGmp9UXgY0zxbr88FfvqZVn8AAAD//wMAUEsDBBQABgAIAAAA IQBdcTjb3gAAAAcBAAAPAAAAZHJzL2Rvd25yZXYueG1sTI9Ba8JAEIXvBf/DMkJvdVMpYmM2IpZS KxSpLdjjmp0m0exs2F1N/Pcde2kvDx6PefO9bN7bRpzRh9qRgvtRAgKpcKamUsHnx/PdFESImoxu HKGCCwaY54ObTKfGdfSO520sBZdQSLWCKsY2lTIUFVodRq5F4uzbeasjW19K43XH5baR4ySZSKtr 4g+VbnFZYXHcnqyCN79aLRfry4E2X7bbjde7zWv/otTtsH+asSxmICL28e8CrhuYH3IG27sTmSAa Bbwm/ipnj5PpA4j91co8k//58x8AAAD//wMAUEsBAi0AFAAGAAgAAAAhALaDOJL+AAAA4QEAABMA AAAAAAAAAAAAAAAAAAAAAFtDb250ZW50X1R5cGVzXS54bWxQSwECLQAUAAYACAAAACEAOP0h/9YA AACUAQAACwAAAAAAAAAAAAAAAAAvAQAAX3JlbHMvLnJlbHNQSwECLQAUAAYACAAAACEAmdj0KJwB AACUAwAADgAAAAAAAAAAAAAAAAAuAgAAZHJzL2Uyb0RvYy54bWxQSwECLQAUAAYACAAAACEAXXE4 294AAAAHAQAADwAAAAAAAAAAAAAAAAD2AwAAZHJzL2Rvd25yZXYueG1sUEsFBgAAAAAEAAQA8wAA AAEFAAAAAA== " strokecolor="#156082 [3204]" strokeweight=".5pt">
                 <v:stroke joinstyle="miter"/>
@@ -10317,6 +10283,7 @@
           <w:bCs/>
           <w:lang w:val="en-US"/>
         </w:rPr>
+        <w:lastRenderedPageBreak/>
         <w:t>Exemplo Concreto</w:t>
       </w:r>
     </w:p>
@@ -11679,7 +11646,6 @@
           <w:sz w:val="20"/>
           <w:szCs w:val="20"/>
         </w:rPr>
-        <w:lastRenderedPageBreak/>
         <w:t>Tabela 7 — HQL via Hibernate Assistant vs SQL gerado pelo LLM: comparação técnica</w:t>
       </w:r>
     </w:p>
@@ -11751,7 +11717,7 @@
               </wp:anchor>
             </w:drawing>
           </mc:Choice>
-          <mc:Fallback xmlns:ns11="http://schemas.microsoft.com/office/drawing/2010/main" xmlns:ns5="http://schemas.openxmlformats.org/drawingml/2006/main" xmlns:ns9="http://schemas.openxmlformats.org/drawingml/2006/picture">
+          <mc:Fallback xmlns:ns9="http://schemas.openxmlformats.org/drawingml/2006/picture" xmlns:ns5="http://schemas.openxmlformats.org/drawingml/2006/main" xmlns:ns11="http://schemas.microsoft.com/office/drawing/2010/main">
             <w:pict>
               <v:line w14:anchorId="2E235C5D" id="Conexão Reta 3" o:spid="_x0000_s1026" style="position:absolute;z-index:251686912;visibility:visible;mso-wrap-style:square;mso-wrap-distance-left:9pt;mso-wrap-distance-top:0;mso-wrap-distance-right:9pt;mso-wrap-distance-bottom:0;mso-position-horizontal:absolute;mso-position-horizontal-relative:text;mso-position-vertical:absolute;mso-position-vertical-relative:text" from="0,-.05pt" to="484.2pt,-.05pt" o:gfxdata="UEsDBBQABgAIAAAAIQC2gziS/gAAAOEBAAATAAAAW0NvbnRlbnRfVHlwZXNdLnhtbJSRQU7DMBBF 90jcwfIWJU67QAgl6YK0S0CoHGBkTxKLZGx5TGhvj5O2G0SRWNoz/78nu9wcxkFMGNg6quQqL6RA 0s5Y6ir5vt9lD1JwBDIwOMJKHpHlpr69KfdHjyxSmriSfYz+USnWPY7AufNIadK6MEJMx9ApD/oD OlTrorhX2lFEilmcO2RdNtjC5xDF9pCuTyYBB5bi6bQ4syoJ3g9WQ0ymaiLzg5KdCXlKLjvcW893 SUOqXwnz5DrgnHtJTxOsQfEKIT7DmDSUCaxw7Rqn8787ZsmRM9e2VmPeBN4uqYvTtW7jvijg9N/y JsXecLq0q+WD6m8AAAD//wMAUEsDBBQABgAIAAAAIQA4/SH/1gAAAJQBAAALAAAAX3JlbHMvLnJl bHOkkMFqwzAMhu+DvYPRfXGawxijTi+j0GvpHsDYimMaW0Yy2fr2M4PBMnrbUb/Q94l/f/hMi1qR JVI2sOt6UJgd+ZiDgffL8ekFlFSbvV0oo4EbChzGx4f9GRdb25HMsYhqlCwG5lrLq9biZkxWOiqY 22YiTra2kYMu1l1tQD30/bPm3wwYN0x18gb45AdQl1tp5j/sFB2T0FQ7R0nTNEV3j6o9feQzro1i OWA14Fm+Q8a1a8+Bvu/d/dMb2JY5uiPbhG/ktn4cqGU/er3pcvwCAAD//wMAUEsDBBQABgAIAAAA IQCZ2PQonAEAAJQDAAAOAAAAZHJzL2Uyb0RvYy54bWysU01P3DAQvVfqf7B8Z5MAQm202T2A4FK1 qMAPMM54Y8n2WLbZZP99x97dLGorIRAXxx/z3sx7M1muJ2vYFkLU6DreLGrOwEnstdt0/Onx9uwb ZzEJ1wuDDjq+g8jXq69flqNv4RwHND0ERiQutqPv+JCSb6sqygGsiAv04OhRYbAi0TFsqj6Ikdit qc7r+qoaMfQ+oIQY6fZm/8hXhV8pkOmXUhESMx2n2lJZQ1mf81qtlqLdBOEHLQ9liA9UYYV2lHSm uhFJsJeg/6GyWgaMqNJCoq1QKS2haCA1Tf2XmodBeChayJzoZ5vi59HKn9trdx/IhtHHNvr7kFVM Ktj8pfrYVMzazWbBlJiky6vm8vvFJXkqj2/VCehDTHeAluVNx412WYdoxfZHTJSMQo8hdDilLru0 M5CDjfsNiumekjUFXaYCrk1gW0H9FFKCS03uIfGV6AxT2pgZWL8NPMRnKJSJeQ94RpTM6NIMttph +F/2NB1LVvv4owN73dmCZ+x3pSnFGmp9UXgY0zxbr88FfvqZVn8AAAD//wMAUEsDBBQABgAIAAAA IQCasyRQ4AAAAAkBAAAPAAAAZHJzL2Rvd25yZXYueG1sTI9Ba8JAEIXvhf6HZQq96UYpYmM2IpZS KxSpFfS4ZqdJ2uxs2F1N/Pcde2kvA4/He/O+bN7bRpzRh9qRgtEwAYFUOFNTqWD38TyYgghRk9GN I1RwwQDz/PYm06lxHb3jeRtLwSUUUq2girFNpQxFhVaHoWuR2Pt03urI0pfSeN1xuW3kOEkm0uqa +EOlW1xWWHxvT1bBm1+tlov15Ys2B9vtx+v95rV/Uer+rn+a8VnMQETs418Crgy8H3IednQnMkE0 CpgmKhiMQLD5OJk+gDj+apln8j9B/gMAAP//AwBQSwECLQAUAAYACAAAACEAtoM4kv4AAADhAQAA EwAAAAAAAAAAAAAAAAAAAAAAW0NvbnRlbnRfVHlwZXNdLnhtbFBLAQItABQABgAIAAAAIQA4/SH/ 1gAAAJQBAAALAAAAAAAAAAAAAAAAAC8BAABfcmVscy8ucmVsc1BLAQItABQABgAIAAAAIQCZ2PQo nAEAAJQDAAAOAAAAAAAAAAAAAAAAAC4CAABkcnMvZTJvRG9jLnhtbFBLAQItABQABgAIAAAAIQCa syRQ4AAAAAkBAAAPAAAAAAAAAAAAAAAAAPYDAABkcnMvZG93bnJldi54bWxQSwUGAAAAAAQABADz AAAAAwUAAAAA " strokecolor="#156082 [3204]" strokeweight=".5pt">
                 <v:stroke joinstyle="miter"/>
@@ -11761,7 +11727,11 @@
         </mc:AlternateContent>
       </w:r>
       <w:r>
-        <w:t>Os LLMs são treinados com dados até uma determinada data e não conhecem a realidade atual da nossa aplicação. Se perguntarmos ao modelo sobre as encomendas em aberto, os utilizadores registados ou o stock disponível, ele simplesmente não tem essa informação — e sem contexto, pode inventar respostas plausíveis mas incorretas, fenómeno conhecido como alucinação.</w:t>
+        <w:t xml:space="preserve">Os LLMs são treinados com dados até uma determinada data e não conhecem a realidade atual da nossa aplicação. Se perguntarmos ao modelo sobre as encomendas em aberto, os utilizadores </w:t>
+      </w:r>
+      <w:r>
+        <w:lastRenderedPageBreak/>
+        <w:t>registados ou o stock disponível, ele simplesmente não tem essa informação — e sem contexto, pode inventar respostas plausíveis mas incorretas, fenómeno conhecido como alucinação.</w:t>
       </w:r>
     </w:p>
     <w:p>
@@ -12463,7 +12433,6 @@
                 <w:szCs w:val="18"/>
                 <w:lang w:val="en-US"/>
               </w:rPr>
-              <w:lastRenderedPageBreak/>
               <w:t xml:space="preserve">  JsonNode root = MAPPER.readTree(</w:t>
             </w:r>
             <w:proofErr w:type="gramStart"/>
@@ -12745,6 +12714,7 @@
                 <w:szCs w:val="18"/>
                 <w:lang w:val="en-US"/>
               </w:rPr>
+              <w:lastRenderedPageBreak/>
               <w:t xml:space="preserve">  </w:t>
             </w:r>
             <w:r>
@@ -13575,28 +13545,25 @@
         <w:spacing w:before="80" w:after="80" w:line="276" w:lineRule="auto"/>
       </w:pPr>
       <w:r>
-        <w:t xml:space="preserve">Comparado com um MCP de PostgreSQL, que expõe diretamente a ligação à base de dados — todas as tabelas, todas as colunas e potencialmente escrita — o Hibernate Assistant inverte este </w:t>
-      </w:r>
+        <w:t>Comparado com um MCP de PostgreSQL, que expõe diretamente a ligação à base de dados — todas as tabelas, todas as colunas e potencialmente escrita — o Hibernate Assistant inverte este modelo de forma mais forte que a primeira iteração: o LLM não só “não pode aceder” ao que não é permitido, como nunca chega a saber que existe.</w:t>
+      </w:r>
+    </w:p>
+    <w:p>
+      <w:pPr>
+        <w:pStyle w:val="Ttulo3"/>
+      </w:pPr>
+      <w:bookmarkStart w:id="21" w:name="_Toc234848123"/>
+      <w:r>
+        <w:t>Perguntas de Demonstração</w:t>
+      </w:r>
+      <w:bookmarkEnd w:id="21"/>
+    </w:p>
+    <w:p>
+      <w:pPr>
+        <w:spacing w:before="80" w:after="80" w:line="276" w:lineRule="auto"/>
+      </w:pPr>
       <w:r>
         <w:lastRenderedPageBreak/>
-        <w:t>modelo de forma mais forte que a primeira iteração: o LLM não só “não pode aceder” ao que não é permitido, como nunca chega a saber que existe.</w:t>
-      </w:r>
-    </w:p>
-    <w:p>
-      <w:pPr>
-        <w:pStyle w:val="Ttulo3"/>
-      </w:pPr>
-      <w:bookmarkStart w:id="21" w:name="_Toc234848123"/>
-      <w:r>
-        <w:t>Perguntas de Demonstração</w:t>
-      </w:r>
-      <w:bookmarkEnd w:id="21"/>
-    </w:p>
-    <w:p>
-      <w:pPr>
-        <w:spacing w:before="80" w:after="80" w:line="276" w:lineRule="auto"/>
-      </w:pPr>
-      <w:r>
         <w:t>Um conjunto de perguntas testadas para a demonstração ao vivo. Todas passam pelo LLM (qwen2.5-coder:7b) para a geração de HQL: o modelo gera a query a partir do prompt construído do metamodelo já filtrado, o Hibernate valida e executa via SelectionQuery, e o LLM formata a resposta em linguagem natural. As últimas provam as duas camadas de ocultação e os endpoints de depuração. Os endpoints são idênticos nos dois gémeos (porta 8080).</w:t>
       </w:r>
     </w:p>
@@ -14479,7 +14446,6 @@
           <w:b/>
           <w:bCs/>
         </w:rPr>
-        <w:lastRenderedPageBreak/>
         <w:t>Biblioteca oficial:</w:t>
       </w:r>
       <w:r>
@@ -14520,6 +14486,7 @@
           <w:b/>
           <w:bCs/>
         </w:rPr>
+        <w:lastRenderedPageBreak/>
         <w:t>Segurança em duas camadas:</w:t>
       </w:r>
       <w:r>
@@ -14619,108 +14586,11 @@
     <w:p>
       <w:pPr>
         <w:spacing w:before="60" w:after="60"/>
+        <w:rPr>
+          <w:lang w:val="en-US"/>
+        </w:rPr>
       </w:pPr>
       <w:proofErr w:type="gramStart"/>
-      <w:r>
-        <w:rPr>
-          <w:b/>
-          <w:bCs/>
-          <w:color w:val="2E75B6"/>
-        </w:rPr>
-        <w:t xml:space="preserve">→  </w:t>
-      </w:r>
-      <w:proofErr w:type="spellStart"/>
-      <w:r>
-        <w:rPr>
-          <w:color w:val="2E75B6"/>
-        </w:rPr>
-        <w:t>Hibernate</w:t>
-      </w:r>
-      <w:proofErr w:type="spellEnd"/>
-      <w:proofErr w:type="gramEnd"/>
-      <w:r>
-        <w:rPr>
-          <w:color w:val="2E75B6"/>
-        </w:rPr>
-        <w:t xml:space="preserve"> ORM 7.4 — módulo </w:t>
-      </w:r>
-      <w:proofErr w:type="spellStart"/>
-      <w:r>
-        <w:rPr>
-          <w:color w:val="2E75B6"/>
-        </w:rPr>
-        <w:t>hibernate-</w:t>
-      </w:r>
-      <w:proofErr w:type="gramStart"/>
-      <w:r>
-        <w:rPr>
-          <w:color w:val="2E75B6"/>
-        </w:rPr>
-        <w:t>assistant</w:t>
-      </w:r>
-      <w:proofErr w:type="spellEnd"/>
-      <w:r>
-        <w:rPr>
-          <w:color w:val="2E75B6"/>
-        </w:rPr>
-        <w:t xml:space="preserve">  (</w:t>
-      </w:r>
-      <w:proofErr w:type="gramEnd"/>
-      <w:r>
-        <w:rPr>
-          <w:color w:val="2E75B6"/>
-        </w:rPr>
-        <w:t>hibernate.org/</w:t>
-      </w:r>
-      <w:proofErr w:type="spellStart"/>
-      <w:r>
-        <w:rPr>
-          <w:color w:val="2E75B6"/>
-        </w:rPr>
-        <w:t>orm</w:t>
-      </w:r>
-      <w:proofErr w:type="spellEnd"/>
-      <w:r>
-        <w:rPr>
-          <w:color w:val="2E75B6"/>
-        </w:rPr>
-        <w:t>)</w:t>
-      </w:r>
-    </w:p>
-    <w:p>
-      <w:pPr>
-        <w:spacing w:before="60" w:after="60"/>
-      </w:pPr>
-      <w:proofErr w:type="gramStart"/>
-      <w:r>
-        <w:rPr>
-          <w:b/>
-          <w:bCs/>
-          <w:color w:val="2E75B6"/>
-        </w:rPr>
-        <w:t xml:space="preserve">→  </w:t>
-      </w:r>
-      <w:r>
-        <w:rPr>
-          <w:color w:val="2E75B6"/>
-        </w:rPr>
-        <w:t>Demo</w:t>
-      </w:r>
-      <w:proofErr w:type="gramEnd"/>
-      <w:r>
-        <w:rPr>
-          <w:color w:val="2E75B6"/>
-        </w:rPr>
-        <w:t xml:space="preserve"> de referência (Quarkus) — github.com/mbellade/demos</w:t>
-      </w:r>
-    </w:p>
-    <w:p>
-      <w:pPr>
-        <w:spacing w:before="60" w:after="60"/>
-        <w:rPr>
-          <w:lang w:val="en-US"/>
-        </w:rPr>
-      </w:pPr>
       <w:r>
         <w:rPr>
           <w:b/>
@@ -14735,7 +14605,90 @@
           <w:color w:val="2E75B6"/>
           <w:lang w:val="en-US"/>
         </w:rPr>
-        <w:t>LangChain4j — docs.langchain4j.dev</w:t>
+        <w:t>Hibernate</w:t>
+      </w:r>
+      <w:proofErr w:type="gramEnd"/>
+      <w:r>
+        <w:rPr>
+          <w:color w:val="2E75B6"/>
+          <w:lang w:val="en-US"/>
+        </w:rPr>
+        <w:t xml:space="preserve"> ORM 7.4 — </w:t>
+      </w:r>
+      <w:proofErr w:type="spellStart"/>
+      <w:r>
+        <w:rPr>
+          <w:color w:val="2E75B6"/>
+          <w:lang w:val="en-US"/>
+        </w:rPr>
+        <w:t>módulo</w:t>
+      </w:r>
+      <w:proofErr w:type="spellEnd"/>
+      <w:r>
+        <w:rPr>
+          <w:color w:val="2E75B6"/>
+          <w:lang w:val="en-US"/>
+        </w:rPr>
+        <w:t xml:space="preserve"> hibernate-</w:t>
+      </w:r>
+      <w:proofErr w:type="gramStart"/>
+      <w:r>
+        <w:rPr>
+          <w:color w:val="2E75B6"/>
+          <w:lang w:val="en-US"/>
+        </w:rPr>
+        <w:t>assistant  (</w:t>
+      </w:r>
+      <w:proofErr w:type="gramEnd"/>
+      <w:r>
+        <w:rPr>
+          <w:color w:val="2E75B6"/>
+          <w:lang w:val="en-US"/>
+        </w:rPr>
+        <w:t>hibernate.org/</w:t>
+      </w:r>
+      <w:proofErr w:type="spellStart"/>
+      <w:r>
+        <w:rPr>
+          <w:color w:val="2E75B6"/>
+          <w:lang w:val="en-US"/>
+        </w:rPr>
+        <w:t>orm</w:t>
+      </w:r>
+      <w:proofErr w:type="spellEnd"/>
+      <w:r>
+        <w:rPr>
+          <w:color w:val="2E75B6"/>
+          <w:lang w:val="en-US"/>
+        </w:rPr>
+        <w:t>)</w:t>
+      </w:r>
+    </w:p>
+    <w:p>
+      <w:pPr>
+        <w:spacing w:before="60" w:after="60"/>
+      </w:pPr>
+      <w:proofErr w:type="gramStart"/>
+      <w:r>
+        <w:rPr>
+          <w:b/>
+          <w:bCs/>
+          <w:color w:val="2E75B6"/>
+        </w:rPr>
+        <w:t xml:space="preserve">→  </w:t>
+      </w:r>
+      <w:r>
+        <w:rPr>
+          <w:color w:val="2E75B6"/>
+        </w:rPr>
+        <w:t>Demo</w:t>
+      </w:r>
+      <w:proofErr w:type="gramEnd"/>
+      <w:r>
+        <w:rPr>
+          <w:color w:val="2E75B6"/>
+        </w:rPr>
+        <w:t xml:space="preserve"> de referência (Quarkus) — github.com/mbellade/demos</w:t>
       </w:r>
     </w:p>
     <w:p>
@@ -14759,7 +14712,7 @@
           <w:color w:val="2E75B6"/>
           <w:lang w:val="en-US"/>
         </w:rPr>
-        <w:t>Spring AI — docs.spring.io/spring-ai/reference</w:t>
+        <w:t>LangChain4j — docs.langchain4j.dev</w:t>
       </w:r>
     </w:p>
     <w:p>
@@ -14783,7 +14736,56 @@
           <w:color w:val="2E75B6"/>
           <w:lang w:val="en-US"/>
         </w:rPr>
-        <w:t>Artigo JAVAPRO — Talk to Your Data (Marco Belladelli, JCON 2026)</w:t>
+        <w:t>Spring AI — docs.spring.io/spring-ai/reference</w:t>
+      </w:r>
+    </w:p>
+    <w:p>
+      <w:pPr>
+        <w:spacing w:before="60" w:after="60"/>
+        <w:rPr>
+          <w:color w:val="2E75B6"/>
+          <w:lang w:val="en-US"/>
+        </w:rPr>
+      </w:pPr>
+      <w:proofErr w:type="gramStart"/>
+      <w:r>
+        <w:rPr>
+          <w:b/>
+          <w:bCs/>
+          <w:color w:val="2E75B6"/>
+          <w:lang w:val="en-US"/>
+        </w:rPr>
+        <w:t xml:space="preserve">→  </w:t>
+      </w:r>
+      <w:r>
+        <w:rPr>
+          <w:color w:val="2E75B6"/>
+          <w:lang w:val="en-US"/>
+        </w:rPr>
+        <w:t>Artigo</w:t>
+      </w:r>
+      <w:proofErr w:type="gramEnd"/>
+      <w:r>
+        <w:rPr>
+          <w:color w:val="2E75B6"/>
+          <w:lang w:val="en-US"/>
+        </w:rPr>
+        <w:t xml:space="preserve"> JAVAPRO — Talk to Your Data (Marco Belladelli, JCON 2026)</w:t>
+      </w:r>
+    </w:p>
+    <w:p>
+      <w:pPr>
+        <w:rPr>
+          <w:color w:val="2E75B6"/>
+          <w:lang w:val="en-US"/>
+        </w:rPr>
+      </w:pPr>
+      <w:r>
+        <w:rPr>
+          <w:color w:val="2E75B6"/>
+          <w:lang w:val="en-US"/>
+        </w:rPr>
+        <w:br w:type="page"/>
       </w:r>
     </w:p>
     <w:p>
@@ -14793,6 +14795,7 @@
       <w:bookmarkStart w:id="24" w:name="_Toc230208856"/>
       <w:bookmarkStart w:id="25" w:name="_Toc234848126"/>
       <w:r>
+        <w:lastRenderedPageBreak/>
         <w:t>Conclusão</w:t>
       </w:r>
       <w:bookmarkEnd w:id="24"/>

</xml_diff>

<commit_message>
feat: add spenish version
</commit_message>
<xml_diff>
--- a/v2/local_llm_pt_v2.docx
+++ b/v2/local_llm_pt_v2.docx
@@ -949,21 +949,7 @@
                 <w:rStyle w:val="Hiperligao"/>
                 <w:noProof/>
               </w:rPr>
-              <w:t>Hibernate Assistant — Como F</w:t>
-            </w:r>
-            <w:r>
-              <w:rPr>
-                <w:rStyle w:val="Hiperligao"/>
-                <w:noProof/>
-              </w:rPr>
-              <w:t>u</w:t>
-            </w:r>
-            <w:r>
-              <w:rPr>
-                <w:rStyle w:val="Hiperligao"/>
-                <w:noProof/>
-              </w:rPr>
-              <w:t>nciona Internamente</w:t>
+              <w:t>Hibernate Assistant — Como Funciona Internamente</w:t>
             </w:r>
             <w:r>
               <w:rPr>
@@ -1905,7 +1891,7 @@
               </wp:anchor>
             </w:drawing>
           </mc:Choice>
-          <mc:Fallback xmlns:ns11="http://schemas.microsoft.com/office/drawing/2010/main" xmlns:ns5="http://schemas.openxmlformats.org/drawingml/2006/main" xmlns:ns9="http://schemas.openxmlformats.org/drawingml/2006/picture">
+          <mc:Fallback xmlns:ns9="http://schemas.openxmlformats.org/drawingml/2006/picture" xmlns:ns5="http://schemas.openxmlformats.org/drawingml/2006/main" xmlns:ns11="http://schemas.microsoft.com/office/drawing/2010/main">
             <w:pict>
               <v:line w14:anchorId="416D2C14" id="Conexão Reta 2" o:spid="_x0000_s1026" style="position:absolute;z-index:251659264;visibility:visible;mso-wrap-style:square;mso-wrap-distance-left:9pt;mso-wrap-distance-top:0;mso-wrap-distance-right:9pt;mso-wrap-distance-bottom:0;mso-position-horizontal:absolute;mso-position-horizontal-relative:text;mso-position-vertical:absolute;mso-position-vertical-relative:text" from=".9pt,23.9pt" to="485.1pt,23.9pt" o:gfxdata="UEsDBBQABgAIAAAAIQC2gziS/gAAAOEBAAATAAAAW0NvbnRlbnRfVHlwZXNdLnhtbJSRQU7DMBBF 90jcwfIWJU67QAgl6YK0S0CoHGBkTxKLZGx5TGhvj5O2G0SRWNoz/78nu9wcxkFMGNg6quQqL6RA 0s5Y6ir5vt9lD1JwBDIwOMJKHpHlpr69KfdHjyxSmriSfYz+USnWPY7AufNIadK6MEJMx9ApD/oD OlTrorhX2lFEilmcO2RdNtjC5xDF9pCuTyYBB5bi6bQ4syoJ3g9WQ0ymaiLzg5KdCXlKLjvcW893 SUOqXwnz5DrgnHtJTxOsQfEKIT7DmDSUCaxw7Rqn8787ZsmRM9e2VmPeBN4uqYvTtW7jvijg9N/y JsXecLq0q+WD6m8AAAD//wMAUEsDBBQABgAIAAAAIQA4/SH/1gAAAJQBAAALAAAAX3JlbHMvLnJl bHOkkMFqwzAMhu+DvYPRfXGawxijTi+j0GvpHsDYimMaW0Yy2fr2M4PBMnrbUb/Q94l/f/hMi1qR JVI2sOt6UJgd+ZiDgffL8ekFlFSbvV0oo4EbChzGx4f9GRdb25HMsYhqlCwG5lrLq9biZkxWOiqY 22YiTra2kYMu1l1tQD30/bPm3wwYN0x18gb45AdQl1tp5j/sFB2T0FQ7R0nTNEV3j6o9feQzro1i OWA14Fm+Q8a1a8+Bvu/d/dMb2JY5uiPbhG/ktn4cqGU/er3pcvwCAAD//wMAUEsDBBQABgAIAAAA IQCZ2PQonAEAAJQDAAAOAAAAZHJzL2Uyb0RvYy54bWysU01P3DAQvVfqf7B8Z5MAQm202T2A4FK1 qMAPMM54Y8n2WLbZZP99x97dLGorIRAXxx/z3sx7M1muJ2vYFkLU6DreLGrOwEnstdt0/Onx9uwb ZzEJ1wuDDjq+g8jXq69flqNv4RwHND0ERiQutqPv+JCSb6sqygGsiAv04OhRYbAi0TFsqj6Ikdit qc7r+qoaMfQ+oIQY6fZm/8hXhV8pkOmXUhESMx2n2lJZQ1mf81qtlqLdBOEHLQ9liA9UYYV2lHSm uhFJsJeg/6GyWgaMqNJCoq1QKS2haCA1Tf2XmodBeChayJzoZ5vi59HKn9trdx/IhtHHNvr7kFVM Ktj8pfrYVMzazWbBlJiky6vm8vvFJXkqj2/VCehDTHeAluVNx412WYdoxfZHTJSMQo8hdDilLru0 M5CDjfsNiumekjUFXaYCrk1gW0H9FFKCS03uIfGV6AxT2pgZWL8NPMRnKJSJeQ94RpTM6NIMttph +F/2NB1LVvv4owN73dmCZ+x3pSnFGmp9UXgY0zxbr88FfvqZVn8AAAD//wMAUEsDBBQABgAIAAAA IQDx80zj4AAAAAwBAAAPAAAAZHJzL2Rvd25yZXYueG1sTE9NS8NAEL0L/odlBG92YxBr02xKqYi1 UIqtUI/b7JhEs7Nhd9uk/94RD3qZ4c1j3kc+G2wrTuhD40jB7SgBgVQ601Cl4G33dPMAIkRNRreO UMEZA8yKy4tcZ8b19IqnbawEi1DItII6xi6TMpQ1Wh1GrkNi7sN5qyNDX0njdc/itpVpktxLqxti h1p3uKix/NoerYK1Xy4X89X5kzbvtt+nq/3mZXhW6vpqeJzymE9BRBzi3wf8dOD8UHCwgzuSCaJl zOmjgrsxb6Yn4yQFcfg9yCKX/0sU3wAAAP//AwBQSwECLQAUAAYACAAAACEAtoM4kv4AAADhAQAA EwAAAAAAAAAAAAAAAAAAAAAAW0NvbnRlbnRfVHlwZXNdLnhtbFBLAQItABQABgAIAAAAIQA4/SH/ 1gAAAJQBAAALAAAAAAAAAAAAAAAAAC8BAABfcmVscy8ucmVsc1BLAQItABQABgAIAAAAIQCZ2PQo nAEAAJQDAAAOAAAAAAAAAAAAAAAAAC4CAABkcnMvZTJvRG9jLnhtbFBLAQItABQABgAIAAAAIQDx 80zj4AAAAAwBAAAPAAAAAAAAAAAAAAAAAPYDAABkcnMvZG93bnJldi54bWxQSwUGAAAAAAQABADz AAAAAwUAAAAA " strokecolor="#156082 [3204]" strokeweight=".5pt">
                 <v:stroke joinstyle="miter"/>
@@ -1994,7 +1980,7 @@
               </wp:anchor>
             </w:drawing>
           </mc:Choice>
-          <mc:Fallback xmlns:ns11="http://schemas.microsoft.com/office/drawing/2010/main" xmlns:ns5="http://schemas.openxmlformats.org/drawingml/2006/main" xmlns:ns9="http://schemas.openxmlformats.org/drawingml/2006/picture">
+          <mc:Fallback xmlns:ns9="http://schemas.openxmlformats.org/drawingml/2006/picture" xmlns:ns5="http://schemas.openxmlformats.org/drawingml/2006/main" xmlns:ns11="http://schemas.microsoft.com/office/drawing/2010/main">
             <w:pict>
               <v:line w14:anchorId="6F2C7688" id="Conexão Reta 3" o:spid="_x0000_s1026" style="position:absolute;z-index:251660288;visibility:visible;mso-wrap-style:square;mso-wrap-distance-left:9pt;mso-wrap-distance-top:0;mso-wrap-distance-right:9pt;mso-wrap-distance-bottom:0;mso-position-horizontal:absolute;mso-position-horizontal-relative:text;mso-position-vertical:absolute;mso-position-vertical-relative:text" from=".9pt,23.25pt" to="485.1pt,23.25pt" o:gfxdata="UEsDBBQABgAIAAAAIQC2gziS/gAAAOEBAAATAAAAW0NvbnRlbnRfVHlwZXNdLnhtbJSRQU7DMBBF 90jcwfIWJU67QAgl6YK0S0CoHGBkTxKLZGx5TGhvj5O2G0SRWNoz/78nu9wcxkFMGNg6quQqL6RA 0s5Y6ir5vt9lD1JwBDIwOMJKHpHlpr69KfdHjyxSmriSfYz+USnWPY7AufNIadK6MEJMx9ApD/oD OlTrorhX2lFEilmcO2RdNtjC5xDF9pCuTyYBB5bi6bQ4syoJ3g9WQ0ymaiLzg5KdCXlKLjvcW893 SUOqXwnz5DrgnHtJTxOsQfEKIT7DmDSUCaxw7Rqn8787ZsmRM9e2VmPeBN4uqYvTtW7jvijg9N/y JsXecLq0q+WD6m8AAAD//wMAUEsDBBQABgAIAAAAIQA4/SH/1gAAAJQBAAALAAAAX3JlbHMvLnJl bHOkkMFqwzAMhu+DvYPRfXGawxijTi+j0GvpHsDYimMaW0Yy2fr2M4PBMnrbUb/Q94l/f/hMi1qR JVI2sOt6UJgd+ZiDgffL8ekFlFSbvV0oo4EbChzGx4f9GRdb25HMsYhqlCwG5lrLq9biZkxWOiqY 22YiTra2kYMu1l1tQD30/bPm3wwYN0x18gb45AdQl1tp5j/sFB2T0FQ7R0nTNEV3j6o9feQzro1i OWA14Fm+Q8a1a8+Bvu/d/dMb2JY5uiPbhG/ktn4cqGU/er3pcvwCAAD//wMAUEsDBBQABgAIAAAA IQCZ2PQonAEAAJQDAAAOAAAAZHJzL2Uyb0RvYy54bWysU01P3DAQvVfqf7B8Z5MAQm202T2A4FK1 qMAPMM54Y8n2WLbZZP99x97dLGorIRAXxx/z3sx7M1muJ2vYFkLU6DreLGrOwEnstdt0/Onx9uwb ZzEJ1wuDDjq+g8jXq69flqNv4RwHND0ERiQutqPv+JCSb6sqygGsiAv04OhRYbAi0TFsqj6Ikdit qc7r+qoaMfQ+oIQY6fZm/8hXhV8pkOmXUhESMx2n2lJZQ1mf81qtlqLdBOEHLQ9liA9UYYV2lHSm uhFJsJeg/6GyWgaMqNJCoq1QKS2haCA1Tf2XmodBeChayJzoZ5vi59HKn9trdx/IhtHHNvr7kFVM Ktj8pfrYVMzazWbBlJiky6vm8vvFJXkqj2/VCehDTHeAluVNx412WYdoxfZHTJSMQo8hdDilLru0 M5CDjfsNiumekjUFXaYCrk1gW0H9FFKCS03uIfGV6AxT2pgZWL8NPMRnKJSJeQ94RpTM6NIMttph +F/2NB1LVvv4owN73dmCZ+x3pSnFGmp9UXgY0zxbr88FfvqZVn8AAAD//wMAUEsDBBQABgAIAAAA IQC7cnDs4gAAAAwBAAAPAAAAZHJzL2Rvd25yZXYueG1sTI9BS8NAEIXvgv9hGcGb3Ri01jSbUipi LUixFepxmx2TaHY27G6b9N874kEvA28e8+Z7+WywrTiiD40jBdejBARS6UxDlYK37ePVBESImoxu HaGCEwaYFednuc6M6+kVj5tYCQ6hkGkFdYxdJmUoa7Q6jFyHxN6H81ZHlr6Sxuuew20r0yQZS6sb 4g+17nBRY/m1OVgFL365XMxXp09av9t+l6526+fhSanLi+FhymM+BRFxiH8X8NOB+aFgsL07kAmi Zc30UcHN+BYE2/d3SQpi/7uQRS7/lyi+AQAA//8DAFBLAQItABQABgAIAAAAIQC2gziS/gAAAOEB AAATAAAAAAAAAAAAAAAAAAAAAABbQ29udGVudF9UeXBlc10ueG1sUEsBAi0AFAAGAAgAAAAhADj9 If/WAAAAlAEAAAsAAAAAAAAAAAAAAAAALwEAAF9yZWxzLy5yZWxzUEsBAi0AFAAGAAgAAAAhAJnY 9CicAQAAlAMAAA4AAAAAAAAAAAAAAAAALgIAAGRycy9lMm9Eb2MueG1sUEsBAi0AFAAGAAgAAAAh ALtycOziAAAADAEAAA8AAAAAAAAAAAAAAAAA9gMAAGRycy9kb3ducmV2LnhtbFBLBQYAAAAABAAE APMAAAAFBQAAAAA= " strokecolor="#156082 [3204]" strokeweight=".5pt">
                 <v:stroke joinstyle="miter"/>
@@ -2363,7 +2349,7 @@
               </wp:anchor>
             </w:drawing>
           </mc:Choice>
-          <mc:Fallback xmlns:ns11="http://schemas.microsoft.com/office/drawing/2010/main" xmlns:ns5="http://schemas.openxmlformats.org/drawingml/2006/main" xmlns:ns9="http://schemas.openxmlformats.org/drawingml/2006/picture">
+          <mc:Fallback xmlns:ns9="http://schemas.openxmlformats.org/drawingml/2006/picture" xmlns:ns5="http://schemas.openxmlformats.org/drawingml/2006/main" xmlns:ns11="http://schemas.microsoft.com/office/drawing/2010/main">
             <w:pict>
               <v:line w14:anchorId="65E0A2AF" id="Conexão Reta 3" o:spid="_x0000_s1026" style="position:absolute;z-index:251697152;visibility:visible;mso-wrap-style:square;mso-wrap-distance-left:9pt;mso-wrap-distance-top:0;mso-wrap-distance-right:9pt;mso-wrap-distance-bottom:0;mso-position-horizontal:absolute;mso-position-horizontal-relative:text;mso-position-vertical:absolute;mso-position-vertical-relative:text" from="0,-.05pt" to="484.2pt,-.05pt" o:gfxdata="UEsDBBQABgAIAAAAIQC2gziS/gAAAOEBAAATAAAAW0NvbnRlbnRfVHlwZXNdLnhtbJSRQU7DMBBF 90jcwfIWJU67QAgl6YK0S0CoHGBkTxKLZGx5TGhvj5O2G0SRWNoz/78nu9wcxkFMGNg6quQqL6RA 0s5Y6ir5vt9lD1JwBDIwOMJKHpHlpr69KfdHjyxSmriSfYz+USnWPY7AufNIadK6MEJMx9ApD/oD OlTrorhX2lFEilmcO2RdNtjC5xDF9pCuTyYBB5bi6bQ4syoJ3g9WQ0ymaiLzg5KdCXlKLjvcW893 SUOqXwnz5DrgnHtJTxOsQfEKIT7DmDSUCaxw7Rqn8787ZsmRM9e2VmPeBN4uqYvTtW7jvijg9N/y JsXecLq0q+WD6m8AAAD//wMAUEsDBBQABgAIAAAAIQA4/SH/1gAAAJQBAAALAAAAX3JlbHMvLnJl bHOkkMFqwzAMhu+DvYPRfXGawxijTi+j0GvpHsDYimMaW0Yy2fr2M4PBMnrbUb/Q94l/f/hMi1qR JVI2sOt6UJgd+ZiDgffL8ekFlFSbvV0oo4EbChzGx4f9GRdb25HMsYhqlCwG5lrLq9biZkxWOiqY 22YiTra2kYMu1l1tQD30/bPm3wwYN0x18gb45AdQl1tp5j/sFB2T0FQ7R0nTNEV3j6o9feQzro1i OWA14Fm+Q8a1a8+Bvu/d/dMb2JY5uiPbhG/ktn4cqGU/er3pcvwCAAD//wMAUEsDBBQABgAIAAAA IQCZ2PQonAEAAJQDAAAOAAAAZHJzL2Uyb0RvYy54bWysU01P3DAQvVfqf7B8Z5MAQm202T2A4FK1 qMAPMM54Y8n2WLbZZP99x97dLGorIRAXxx/z3sx7M1muJ2vYFkLU6DreLGrOwEnstdt0/Onx9uwb ZzEJ1wuDDjq+g8jXq69flqNv4RwHND0ERiQutqPv+JCSb6sqygGsiAv04OhRYbAi0TFsqj6Ikdit qc7r+qoaMfQ+oIQY6fZm/8hXhV8pkOmXUhESMx2n2lJZQ1mf81qtlqLdBOEHLQ9liA9UYYV2lHSm uhFJsJeg/6GyWgaMqNJCoq1QKS2haCA1Tf2XmodBeChayJzoZ5vi59HKn9trdx/IhtHHNvr7kFVM Ktj8pfrYVMzazWbBlJiky6vm8vvFJXkqj2/VCehDTHeAluVNx412WYdoxfZHTJSMQo8hdDilLru0 M5CDjfsNiumekjUFXaYCrk1gW0H9FFKCS03uIfGV6AxT2pgZWL8NPMRnKJSJeQ94RpTM6NIMttph +F/2NB1LVvv4owN73dmCZ+x3pSnFGmp9UXgY0zxbr88FfvqZVn8AAAD//wMAUEsDBBQABgAIAAAA IQCasyRQ4AAAAAkBAAAPAAAAZHJzL2Rvd25yZXYueG1sTI9Ba8JAEIXvhf6HZQq96UYpYmM2IpZS KxSpFfS4ZqdJ2uxs2F1N/Pcde2kvA4/He/O+bN7bRpzRh9qRgtEwAYFUOFNTqWD38TyYgghRk9GN I1RwwQDz/PYm06lxHb3jeRtLwSUUUq2girFNpQxFhVaHoWuR2Pt03urI0pfSeN1xuW3kOEkm0uqa +EOlW1xWWHxvT1bBm1+tlov15Ys2B9vtx+v95rV/Uer+rn+a8VnMQETs418Crgy8H3IednQnMkE0 CpgmKhiMQLD5OJk+gDj+apln8j9B/gMAAP//AwBQSwECLQAUAAYACAAAACEAtoM4kv4AAADhAQAA EwAAAAAAAAAAAAAAAAAAAAAAW0NvbnRlbnRfVHlwZXNdLnhtbFBLAQItABQABgAIAAAAIQA4/SH/ 1gAAAJQBAAALAAAAAAAAAAAAAAAAAC8BAABfcmVscy8ucmVsc1BLAQItABQABgAIAAAAIQCZ2PQo nAEAAJQDAAAOAAAAAAAAAAAAAAAAAC4CAABkcnMvZTJvRG9jLnhtbFBLAQItABQABgAIAAAAIQCa syRQ4AAAAAkBAAAPAAAAAAAAAAAAAAAAAPYDAABkcnMvZG93bnJldi54bWxQSwUGAAAAAAQABADz AAAAAwUAAAAA " strokecolor="#156082 [3204]" strokeweight=".5pt">
                 <v:stroke joinstyle="miter"/>
@@ -3109,7 +3095,7 @@
               </wp:anchor>
             </w:drawing>
           </mc:Choice>
-          <mc:Fallback xmlns:ns11="http://schemas.microsoft.com/office/drawing/2010/main" xmlns:ns5="http://schemas.openxmlformats.org/drawingml/2006/main" xmlns:ns9="http://schemas.openxmlformats.org/drawingml/2006/picture">
+          <mc:Fallback xmlns:ns9="http://schemas.openxmlformats.org/drawingml/2006/picture" xmlns:ns5="http://schemas.openxmlformats.org/drawingml/2006/main" xmlns:ns11="http://schemas.microsoft.com/office/drawing/2010/main">
             <w:pict>
               <v:line w14:anchorId="781B6A1A" id="Conexão Reta 3" o:spid="_x0000_s1026" style="position:absolute;z-index:251662336;visibility:visible;mso-wrap-style:square;mso-wrap-distance-left:9pt;mso-wrap-distance-top:0;mso-wrap-distance-right:9pt;mso-wrap-distance-bottom:0;mso-position-horizontal:absolute;mso-position-horizontal-relative:text;mso-position-vertical:absolute;mso-position-vertical-relative:text" from="0,-.05pt" to="484.2pt,-.05pt" o:gfxdata="UEsDBBQABgAIAAAAIQC2gziS/gAAAOEBAAATAAAAW0NvbnRlbnRfVHlwZXNdLnhtbJSRQU7DMBBF 90jcwfIWJU67QAgl6YK0S0CoHGBkTxKLZGx5TGhvj5O2G0SRWNoz/78nu9wcxkFMGNg6quQqL6RA 0s5Y6ir5vt9lD1JwBDIwOMJKHpHlpr69KfdHjyxSmriSfYz+USnWPY7AufNIadK6MEJMx9ApD/oD OlTrorhX2lFEilmcO2RdNtjC5xDF9pCuTyYBB5bi6bQ4syoJ3g9WQ0ymaiLzg5KdCXlKLjvcW893 SUOqXwnz5DrgnHtJTxOsQfEKIT7DmDSUCaxw7Rqn8787ZsmRM9e2VmPeBN4uqYvTtW7jvijg9N/y JsXecLq0q+WD6m8AAAD//wMAUEsDBBQABgAIAAAAIQA4/SH/1gAAAJQBAAALAAAAX3JlbHMvLnJl bHOkkMFqwzAMhu+DvYPRfXGawxijTi+j0GvpHsDYimMaW0Yy2fr2M4PBMnrbUb/Q94l/f/hMi1qR JVI2sOt6UJgd+ZiDgffL8ekFlFSbvV0oo4EbChzGx4f9GRdb25HMsYhqlCwG5lrLq9biZkxWOiqY 22YiTra2kYMu1l1tQD30/bPm3wwYN0x18gb45AdQl1tp5j/sFB2T0FQ7R0nTNEV3j6o9feQzro1i OWA14Fm+Q8a1a8+Bvu/d/dMb2JY5uiPbhG/ktn4cqGU/er3pcvwCAAD//wMAUEsDBBQABgAIAAAA IQCZ2PQonAEAAJQDAAAOAAAAZHJzL2Uyb0RvYy54bWysU01P3DAQvVfqf7B8Z5MAQm202T2A4FK1 qMAPMM54Y8n2WLbZZP99x97dLGorIRAXxx/z3sx7M1muJ2vYFkLU6DreLGrOwEnstdt0/Onx9uwb ZzEJ1wuDDjq+g8jXq69flqNv4RwHND0ERiQutqPv+JCSb6sqygGsiAv04OhRYbAi0TFsqj6Ikdit qc7r+qoaMfQ+oIQY6fZm/8hXhV8pkOmXUhESMx2n2lJZQ1mf81qtlqLdBOEHLQ9liA9UYYV2lHSm uhFJsJeg/6GyWgaMqNJCoq1QKS2haCA1Tf2XmodBeChayJzoZ5vi59HKn9trdx/IhtHHNvr7kFVM Ktj8pfrYVMzazWbBlJiky6vm8vvFJXkqj2/VCehDTHeAluVNx412WYdoxfZHTJSMQo8hdDilLru0 M5CDjfsNiumekjUFXaYCrk1gW0H9FFKCS03uIfGV6AxT2pgZWL8NPMRnKJSJeQ94RpTM6NIMttph +F/2NB1LVvv4owN73dmCZ+x3pSnFGmp9UXgY0zxbr88FfvqZVn8AAAD//wMAUEsDBBQABgAIAAAA IQCasyRQ4AAAAAkBAAAPAAAAZHJzL2Rvd25yZXYueG1sTI9Ba8JAEIXvhf6HZQq96UYpYmM2IpZS KxSpFfS4ZqdJ2uxs2F1N/Pcde2kvA4/He/O+bN7bRpzRh9qRgtEwAYFUOFNTqWD38TyYgghRk9GN I1RwwQDz/PYm06lxHb3jeRtLwSUUUq2girFNpQxFhVaHoWuR2Pt03urI0pfSeN1xuW3kOEkm0uqa +EOlW1xWWHxvT1bBm1+tlov15Ys2B9vtx+v95rV/Uer+rn+a8VnMQETs418Crgy8H3IednQnMkE0 CpgmKhiMQLD5OJk+gDj+apln8j9B/gMAAP//AwBQSwECLQAUAAYACAAAACEAtoM4kv4AAADhAQAA EwAAAAAAAAAAAAAAAAAAAAAAW0NvbnRlbnRfVHlwZXNdLnhtbFBLAQItABQABgAIAAAAIQA4/SH/ 1gAAAJQBAAALAAAAAAAAAAAAAAAAAC8BAABfcmVscy8ucmVsc1BLAQItABQABgAIAAAAIQCZ2PQo nAEAAJQDAAAOAAAAAAAAAAAAAAAAAC4CAABkcnMvZTJvRG9jLnhtbFBLAQItABQABgAIAAAAIQCa syRQ4AAAAAkBAAAPAAAAAAAAAAAAAAAAAPYDAABkcnMvZG93bnJldi54bWxQSwUGAAAAAAQABADz AAAAAwUAAAAA " strokecolor="#156082 [3204]" strokeweight=".5pt">
                 <v:stroke joinstyle="miter"/>
@@ -3524,29 +3510,6 @@
         </w:tc>
       </w:tr>
     </w:tbl>
-    <w:p>
-      <w:pPr>
-        <w:spacing w:before="40" w:after="160"/>
-        <w:jc w:val="center"/>
-        <w:rPr>
-          <w:i/>
-          <w:iCs/>
-          <w:color w:val="595959"/>
-          <w:sz w:val="20"/>
-          <w:szCs w:val="20"/>
-        </w:rPr>
-      </w:pPr>
-      <w:r>
-        <w:rPr>
-          <w:i/>
-          <w:iCs/>
-          <w:color w:val="595959"/>
-          <w:sz w:val="20"/>
-          <w:szCs w:val="20"/>
-        </w:rPr>
-        <w:t>Tabela 3 — Guia de decisão: quando escolher modelos locais vs cloud</w:t>
-      </w:r>
-    </w:p>
     <w:p>
       <w:pPr>
         <w:pStyle w:val="Ttulo3"/>
@@ -3615,7 +3578,7 @@
               </wp:anchor>
             </w:drawing>
           </mc:Choice>
-          <mc:Fallback xmlns:ns11="http://schemas.microsoft.com/office/drawing/2010/main" xmlns:ns5="http://schemas.openxmlformats.org/drawingml/2006/main" xmlns:ns9="http://schemas.openxmlformats.org/drawingml/2006/picture">
+          <mc:Fallback xmlns:ns9="http://schemas.openxmlformats.org/drawingml/2006/picture" xmlns:ns5="http://schemas.openxmlformats.org/drawingml/2006/main" xmlns:ns11="http://schemas.microsoft.com/office/drawing/2010/main">
             <w:pict>
               <v:line w14:anchorId="20F34B84" id="Conexão Reta 3" o:spid="_x0000_s1026" style="position:absolute;z-index:251664384;visibility:visible;mso-wrap-style:square;mso-wrap-distance-left:9pt;mso-wrap-distance-top:0;mso-wrap-distance-right:9pt;mso-wrap-distance-bottom:0;mso-position-horizontal:absolute;mso-position-horizontal-relative:text;mso-position-vertical:absolute;mso-position-vertical-relative:text" from="0,-.05pt" to="484.2pt,-.05pt" o:gfxdata="UEsDBBQABgAIAAAAIQC2gziS/gAAAOEBAAATAAAAW0NvbnRlbnRfVHlwZXNdLnhtbJSRQU7DMBBF 90jcwfIWJU67QAgl6YK0S0CoHGBkTxKLZGx5TGhvj5O2G0SRWNoz/78nu9wcxkFMGNg6quQqL6RA 0s5Y6ir5vt9lD1JwBDIwOMJKHpHlpr69KfdHjyxSmriSfYz+USnWPY7AufNIadK6MEJMx9ApD/oD OlTrorhX2lFEilmcO2RdNtjC5xDF9pCuTyYBB5bi6bQ4syoJ3g9WQ0ymaiLzg5KdCXlKLjvcW893 SUOqXwnz5DrgnHtJTxOsQfEKIT7DmDSUCaxw7Rqn8787ZsmRM9e2VmPeBN4uqYvTtW7jvijg9N/y JsXecLq0q+WD6m8AAAD//wMAUEsDBBQABgAIAAAAIQA4/SH/1gAAAJQBAAALAAAAX3JlbHMvLnJl bHOkkMFqwzAMhu+DvYPRfXGawxijTi+j0GvpHsDYimMaW0Yy2fr2M4PBMnrbUb/Q94l/f/hMi1qR JVI2sOt6UJgd+ZiDgffL8ekFlFSbvV0oo4EbChzGx4f9GRdb25HMsYhqlCwG5lrLq9biZkxWOiqY 22YiTra2kYMu1l1tQD30/bPm3wwYN0x18gb45AdQl1tp5j/sFB2T0FQ7R0nTNEV3j6o9feQzro1i OWA14Fm+Q8a1a8+Bvu/d/dMb2JY5uiPbhG/ktn4cqGU/er3pcvwCAAD//wMAUEsDBBQABgAIAAAA IQCZ2PQonAEAAJQDAAAOAAAAZHJzL2Uyb0RvYy54bWysU01P3DAQvVfqf7B8Z5MAQm202T2A4FK1 qMAPMM54Y8n2WLbZZP99x97dLGorIRAXxx/z3sx7M1muJ2vYFkLU6DreLGrOwEnstdt0/Onx9uwb ZzEJ1wuDDjq+g8jXq69flqNv4RwHND0ERiQutqPv+JCSb6sqygGsiAv04OhRYbAi0TFsqj6Ikdit qc7r+qoaMfQ+oIQY6fZm/8hXhV8pkOmXUhESMx2n2lJZQ1mf81qtlqLdBOEHLQ9liA9UYYV2lHSm uhFJsJeg/6GyWgaMqNJCoq1QKS2haCA1Tf2XmodBeChayJzoZ5vi59HKn9trdx/IhtHHNvr7kFVM Ktj8pfrYVMzazWbBlJiky6vm8vvFJXkqj2/VCehDTHeAluVNx412WYdoxfZHTJSMQo8hdDilLru0 M5CDjfsNiumekjUFXaYCrk1gW0H9FFKCS03uIfGV6AxT2pgZWL8NPMRnKJSJeQ94RpTM6NIMttph +F/2NB1LVvv4owN73dmCZ+x3pSnFGmp9UXgY0zxbr88FfvqZVn8AAAD//wMAUEsDBBQABgAIAAAA IQCasyRQ4AAAAAkBAAAPAAAAZHJzL2Rvd25yZXYueG1sTI9Ba8JAEIXvhf6HZQq96UYpYmM2IpZS KxSpFfS4ZqdJ2uxs2F1N/Pcde2kvA4/He/O+bN7bRpzRh9qRgtEwAYFUOFNTqWD38TyYgghRk9GN I1RwwQDz/PYm06lxHb3jeRtLwSUUUq2girFNpQxFhVaHoWuR2Pt03urI0pfSeN1xuW3kOEkm0uqa +EOlW1xWWHxvT1bBm1+tlov15Ys2B9vtx+v95rV/Uer+rn+a8VnMQETs418Crgy8H3IednQnMkE0 CpgmKhiMQLD5OJk+gDj+apln8j9B/gMAAP//AwBQSwECLQAUAAYACAAAACEAtoM4kv4AAADhAQAA EwAAAAAAAAAAAAAAAAAAAAAAW0NvbnRlbnRfVHlwZXNdLnhtbFBLAQItABQABgAIAAAAIQA4/SH/ 1gAAAJQBAAALAAAAAAAAAAAAAAAAAC8BAABfcmVscy8ucmVsc1BLAQItABQABgAIAAAAIQCZ2PQo nAEAAJQDAAAOAAAAAAAAAAAAAAAAAC4CAABkcnMvZTJvRG9jLnhtbFBLAQItABQABgAIAAAAIQCa syRQ4AAAAAkBAAAPAAAAAAAAAAAAAAAAAPYDAABkcnMvZG93bnJldi54bWxQSwUGAAAAAAQABADz AAAAAwUAAAAA " strokecolor="#156082 [3204]" strokeweight=".5pt">
                 <v:stroke joinstyle="miter"/>
@@ -4075,7 +4038,7 @@
               </wp:anchor>
             </w:drawing>
           </mc:Choice>
-          <mc:Fallback xmlns:ns11="http://schemas.microsoft.com/office/drawing/2010/main" xmlns:ns5="http://schemas.openxmlformats.org/drawingml/2006/main" xmlns:ns9="http://schemas.openxmlformats.org/drawingml/2006/picture">
+          <mc:Fallback xmlns:ns9="http://schemas.openxmlformats.org/drawingml/2006/picture" xmlns:ns5="http://schemas.openxmlformats.org/drawingml/2006/main" xmlns:ns11="http://schemas.microsoft.com/office/drawing/2010/main">
             <w:pict>
               <v:line w14:anchorId="619BBE13" id="Conexão Reta 3" o:spid="_x0000_s1026" style="position:absolute;z-index:251666432;visibility:visible;mso-wrap-style:square;mso-wrap-distance-left:9pt;mso-wrap-distance-top:0;mso-wrap-distance-right:9pt;mso-wrap-distance-bottom:0;mso-position-horizontal:absolute;mso-position-horizontal-relative:text;mso-position-vertical:absolute;mso-position-vertical-relative:text" from="0,-.05pt" to="484.2pt,-.05pt" o:gfxdata="UEsDBBQABgAIAAAAIQC2gziS/gAAAOEBAAATAAAAW0NvbnRlbnRfVHlwZXNdLnhtbJSRQU7DMBBF 90jcwfIWJU67QAgl6YK0S0CoHGBkTxKLZGx5TGhvj5O2G0SRWNoz/78nu9wcxkFMGNg6quQqL6RA 0s5Y6ir5vt9lD1JwBDIwOMJKHpHlpr69KfdHjyxSmriSfYz+USnWPY7AufNIadK6MEJMx9ApD/oD OlTrorhX2lFEilmcO2RdNtjC5xDF9pCuTyYBB5bi6bQ4syoJ3g9WQ0ymaiLzg5KdCXlKLjvcW893 SUOqXwnz5DrgnHtJTxOsQfEKIT7DmDSUCaxw7Rqn8787ZsmRM9e2VmPeBN4uqYvTtW7jvijg9N/y JsXecLq0q+WD6m8AAAD//wMAUEsDBBQABgAIAAAAIQA4/SH/1gAAAJQBAAALAAAAX3JlbHMvLnJl bHOkkMFqwzAMhu+DvYPRfXGawxijTi+j0GvpHsDYimMaW0Yy2fr2M4PBMnrbUb/Q94l/f/hMi1qR JVI2sOt6UJgd+ZiDgffL8ekFlFSbvV0oo4EbChzGx4f9GRdb25HMsYhqlCwG5lrLq9biZkxWOiqY 22YiTra2kYMu1l1tQD30/bPm3wwYN0x18gb45AdQl1tp5j/sFB2T0FQ7R0nTNEV3j6o9feQzro1i OWA14Fm+Q8a1a8+Bvu/d/dMb2JY5uiPbhG/ktn4cqGU/er3pcvwCAAD//wMAUEsDBBQABgAIAAAA IQCZ2PQonAEAAJQDAAAOAAAAZHJzL2Uyb0RvYy54bWysU01P3DAQvVfqf7B8Z5MAQm202T2A4FK1 qMAPMM54Y8n2WLbZZP99x97dLGorIRAXxx/z3sx7M1muJ2vYFkLU6DreLGrOwEnstdt0/Onx9uwb ZzEJ1wuDDjq+g8jXq69flqNv4RwHND0ERiQutqPv+JCSb6sqygGsiAv04OhRYbAi0TFsqj6Ikdit qc7r+qoaMfQ+oIQY6fZm/8hXhV8pkOmXUhESMx2n2lJZQ1mf81qtlqLdBOEHLQ9liA9UYYV2lHSm uhFJsJeg/6GyWgaMqNJCoq1QKS2haCA1Tf2XmodBeChayJzoZ5vi59HKn9trdx/IhtHHNvr7kFVM Ktj8pfrYVMzazWbBlJiky6vm8vvFJXkqj2/VCehDTHeAluVNx412WYdoxfZHTJSMQo8hdDilLru0 M5CDjfsNiumekjUFXaYCrk1gW0H9FFKCS03uIfGV6AxT2pgZWL8NPMRnKJSJeQ94RpTM6NIMttph +F/2NB1LVvv4owN73dmCZ+x3pSnFGmp9UXgY0zxbr88FfvqZVn8AAAD//wMAUEsDBBQABgAIAAAA IQCasyRQ4AAAAAkBAAAPAAAAZHJzL2Rvd25yZXYueG1sTI9Ba8JAEIXvhf6HZQq96UYpYmM2IpZS KxSpFfS4ZqdJ2uxs2F1N/Pcde2kvA4/He/O+bN7bRpzRh9qRgtEwAYFUOFNTqWD38TyYgghRk9GN I1RwwQDz/PYm06lxHb3jeRtLwSUUUq2girFNpQxFhVaHoWuR2Pt03urI0pfSeN1xuW3kOEkm0uqa +EOlW1xWWHxvT1bBm1+tlov15Ys2B9vtx+v95rV/Uer+rn+a8VnMQETs418Crgy8H3IednQnMkE0 CpgmKhiMQLD5OJk+gDj+apln8j9B/gMAAP//AwBQSwECLQAUAAYACAAAACEAtoM4kv4AAADhAQAA EwAAAAAAAAAAAAAAAAAAAAAAW0NvbnRlbnRfVHlwZXNdLnhtbFBLAQItABQABgAIAAAAIQA4/SH/ 1gAAAJQBAAALAAAAAAAAAAAAAAAAAC8BAABfcmVscy8ucmVsc1BLAQItABQABgAIAAAAIQCZ2PQo nAEAAJQDAAAOAAAAAAAAAAAAAAAAAC4CAABkcnMvZTJvRG9jLnhtbFBLAQItABQABgAIAAAAIQCa syRQ4AAAAAkBAAAPAAAAAAAAAAAAAAAAAPYDAABkcnMvZG93bnJldi54bWxQSwUGAAAAAAQABADz AAAAAwUAAAAA " strokecolor="#156082 [3204]" strokeweight=".5pt">
                 <v:stroke joinstyle="miter"/>
@@ -4242,7 +4205,7 @@
               </wp:anchor>
             </w:drawing>
           </mc:Choice>
-          <mc:Fallback xmlns:ns11="http://schemas.microsoft.com/office/drawing/2010/main" xmlns:ns5="http://schemas.openxmlformats.org/drawingml/2006/main" xmlns:ns9="http://schemas.openxmlformats.org/drawingml/2006/picture">
+          <mc:Fallback xmlns:ns9="http://schemas.openxmlformats.org/drawingml/2006/picture" xmlns:ns5="http://schemas.openxmlformats.org/drawingml/2006/main" xmlns:ns11="http://schemas.microsoft.com/office/drawing/2010/main">
             <w:pict>
               <v:line w14:anchorId="44DE2E80" id="Conexão Reta 3" o:spid="_x0000_s1026" style="position:absolute;z-index:251668480;visibility:visible;mso-wrap-style:square;mso-wrap-distance-left:9pt;mso-wrap-distance-top:0;mso-wrap-distance-right:9pt;mso-wrap-distance-bottom:0;mso-position-horizontal:absolute;mso-position-horizontal-relative:text;mso-position-vertical:absolute;mso-position-vertical-relative:text" from="0,0" to="484.2pt,0" o:gfxdata="UEsDBBQABgAIAAAAIQC2gziS/gAAAOEBAAATAAAAW0NvbnRlbnRfVHlwZXNdLnhtbJSRQU7DMBBF 90jcwfIWJU67QAgl6YK0S0CoHGBkTxKLZGx5TGhvj5O2G0SRWNoz/78nu9wcxkFMGNg6quQqL6RA 0s5Y6ir5vt9lD1JwBDIwOMJKHpHlpr69KfdHjyxSmriSfYz+USnWPY7AufNIadK6MEJMx9ApD/oD OlTrorhX2lFEilmcO2RdNtjC5xDF9pCuTyYBB5bi6bQ4syoJ3g9WQ0ymaiLzg5KdCXlKLjvcW893 SUOqXwnz5DrgnHtJTxOsQfEKIT7DmDSUCaxw7Rqn8787ZsmRM9e2VmPeBN4uqYvTtW7jvijg9N/y JsXecLq0q+WD6m8AAAD//wMAUEsDBBQABgAIAAAAIQA4/SH/1gAAAJQBAAALAAAAX3JlbHMvLnJl bHOkkMFqwzAMhu+DvYPRfXGawxijTi+j0GvpHsDYimMaW0Yy2fr2M4PBMnrbUb/Q94l/f/hMi1qR JVI2sOt6UJgd+ZiDgffL8ekFlFSbvV0oo4EbChzGx4f9GRdb25HMsYhqlCwG5lrLq9biZkxWOiqY 22YiTra2kYMu1l1tQD30/bPm3wwYN0x18gb45AdQl1tp5j/sFB2T0FQ7R0nTNEV3j6o9feQzro1i OWA14Fm+Q8a1a8+Bvu/d/dMb2JY5uiPbhG/ktn4cqGU/er3pcvwCAAD//wMAUEsDBBQABgAIAAAA IQCZ2PQonAEAAJQDAAAOAAAAZHJzL2Uyb0RvYy54bWysU01P3DAQvVfqf7B8Z5MAQm202T2A4FK1 qMAPMM54Y8n2WLbZZP99x97dLGorIRAXxx/z3sx7M1muJ2vYFkLU6DreLGrOwEnstdt0/Onx9uwb ZzEJ1wuDDjq+g8jXq69flqNv4RwHND0ERiQutqPv+JCSb6sqygGsiAv04OhRYbAi0TFsqj6Ikdit qc7r+qoaMfQ+oIQY6fZm/8hXhV8pkOmXUhESMx2n2lJZQ1mf81qtlqLdBOEHLQ9liA9UYYV2lHSm uhFJsJeg/6GyWgaMqNJCoq1QKS2haCA1Tf2XmodBeChayJzoZ5vi59HKn9trdx/IhtHHNvr7kFVM Ktj8pfrYVMzazWbBlJiky6vm8vvFJXkqj2/VCehDTHeAluVNx412WYdoxfZHTJSMQo8hdDilLru0 M5CDjfsNiumekjUFXaYCrk1gW0H9FFKCS03uIfGV6AxT2pgZWL8NPMRnKJSJeQ94RpTM6NIMttph +F/2NB1LVvv4owN73dmCZ+x3pSnFGmp9UXgY0zxbr88FfvqZVn8AAAD//wMAUEsDBBQABgAIAAAA IQBdcTjb3gAAAAcBAAAPAAAAZHJzL2Rvd25yZXYueG1sTI9Ba8JAEIXvBf/DMkJvdVMpYmM2IpZS KxSpLdjjmp0m0exs2F1N/Pcde2kvDx6PefO9bN7bRpzRh9qRgvtRAgKpcKamUsHnx/PdFESImoxu HKGCCwaY54ObTKfGdfSO520sBZdQSLWCKsY2lTIUFVodRq5F4uzbeasjW19K43XH5baR4ySZSKtr 4g+VbnFZYXHcnqyCN79aLRfry4E2X7bbjde7zWv/otTtsH+asSxmICL28e8CrhuYH3IG27sTmSAa Bbwm/ipnj5PpA4j91co8k//58x8AAAD//wMAUEsBAi0AFAAGAAgAAAAhALaDOJL+AAAA4QEAABMA AAAAAAAAAAAAAAAAAAAAAFtDb250ZW50X1R5cGVzXS54bWxQSwECLQAUAAYACAAAACEAOP0h/9YA AACUAQAACwAAAAAAAAAAAAAAAAAvAQAAX3JlbHMvLnJlbHNQSwECLQAUAAYACAAAACEAmdj0KJwB AACUAwAADgAAAAAAAAAAAAAAAAAuAgAAZHJzL2Uyb0RvYy54bWxQSwECLQAUAAYACAAAACEAXXE4 294AAAAHAQAADwAAAAAAAAAAAAAAAAD2AwAAZHJzL2Rvd25yZXYueG1sUEsFBgAAAAAEAAQA8wAA AAEFAAAAAA== " strokecolor="#156082 [3204]" strokeweight=".5pt">
                 <v:stroke joinstyle="miter"/>
@@ -4461,7 +4424,7 @@
               </wp:anchor>
             </w:drawing>
           </mc:Choice>
-          <mc:Fallback xmlns:ns11="http://schemas.microsoft.com/office/drawing/2010/main" xmlns:ns5="http://schemas.openxmlformats.org/drawingml/2006/main" xmlns:ns9="http://schemas.openxmlformats.org/drawingml/2006/picture">
+          <mc:Fallback xmlns:ns9="http://schemas.openxmlformats.org/drawingml/2006/picture" xmlns:ns5="http://schemas.openxmlformats.org/drawingml/2006/main" xmlns:ns11="http://schemas.microsoft.com/office/drawing/2010/main">
             <w:pict>
               <v:line w14:anchorId="7BCFBA01" id="Conexão Reta 3" o:spid="_x0000_s1026" style="position:absolute;z-index:251670528;visibility:visible;mso-wrap-style:square;mso-wrap-distance-left:9pt;mso-wrap-distance-top:0;mso-wrap-distance-right:9pt;mso-wrap-distance-bottom:0;mso-position-horizontal:absolute;mso-position-horizontal-relative:text;mso-position-vertical:absolute;mso-position-vertical-relative:text" from="0,-.05pt" to="484.2pt,-.05pt" o:gfxdata="UEsDBBQABgAIAAAAIQC2gziS/gAAAOEBAAATAAAAW0NvbnRlbnRfVHlwZXNdLnhtbJSRQU7DMBBF 90jcwfIWJU67QAgl6YK0S0CoHGBkTxKLZGx5TGhvj5O2G0SRWNoz/78nu9wcxkFMGNg6quQqL6RA 0s5Y6ir5vt9lD1JwBDIwOMJKHpHlpr69KfdHjyxSmriSfYz+USnWPY7AufNIadK6MEJMx9ApD/oD OlTrorhX2lFEilmcO2RdNtjC5xDF9pCuTyYBB5bi6bQ4syoJ3g9WQ0ymaiLzg5KdCXlKLjvcW893 SUOqXwnz5DrgnHtJTxOsQfEKIT7DmDSUCaxw7Rqn8787ZsmRM9e2VmPeBN4uqYvTtW7jvijg9N/y JsXecLq0q+WD6m8AAAD//wMAUEsDBBQABgAIAAAAIQA4/SH/1gAAAJQBAAALAAAAX3JlbHMvLnJl bHOkkMFqwzAMhu+DvYPRfXGawxijTi+j0GvpHsDYimMaW0Yy2fr2M4PBMnrbUb/Q94l/f/hMi1qR JVI2sOt6UJgd+ZiDgffL8ekFlFSbvV0oo4EbChzGx4f9GRdb25HMsYhqlCwG5lrLq9biZkxWOiqY 22YiTra2kYMu1l1tQD30/bPm3wwYN0x18gb45AdQl1tp5j/sFB2T0FQ7R0nTNEV3j6o9feQzro1i OWA14Fm+Q8a1a8+Bvu/d/dMb2JY5uiPbhG/ktn4cqGU/er3pcvwCAAD//wMAUEsDBBQABgAIAAAA IQCZ2PQonAEAAJQDAAAOAAAAZHJzL2Uyb0RvYy54bWysU01P3DAQvVfqf7B8Z5MAQm202T2A4FK1 qMAPMM54Y8n2WLbZZP99x97dLGorIRAXxx/z3sx7M1muJ2vYFkLU6DreLGrOwEnstdt0/Onx9uwb ZzEJ1wuDDjq+g8jXq69flqNv4RwHND0ERiQutqPv+JCSb6sqygGsiAv04OhRYbAi0TFsqj6Ikdit qc7r+qoaMfQ+oIQY6fZm/8hXhV8pkOmXUhESMx2n2lJZQ1mf81qtlqLdBOEHLQ9liA9UYYV2lHSm uhFJsJeg/6GyWgaMqNJCoq1QKS2haCA1Tf2XmodBeChayJzoZ5vi59HKn9trdx/IhtHHNvr7kFVM Ktj8pfrYVMzazWbBlJiky6vm8vvFJXkqj2/VCehDTHeAluVNx412WYdoxfZHTJSMQo8hdDilLru0 M5CDjfsNiumekjUFXaYCrk1gW0H9FFKCS03uIfGV6AxT2pgZWL8NPMRnKJSJeQ94RpTM6NIMttph +F/2NB1LVvv4owN73dmCZ+x3pSnFGmp9UXgY0zxbr88FfvqZVn8AAAD//wMAUEsDBBQABgAIAAAA IQCasyRQ4AAAAAkBAAAPAAAAZHJzL2Rvd25yZXYueG1sTI9Ba8JAEIXvhf6HZQq96UYpYmM2IpZS KxSpFfS4ZqdJ2uxs2F1N/Pcde2kvA4/He/O+bN7bRpzRh9qRgtEwAYFUOFNTqWD38TyYgghRk9GN I1RwwQDz/PYm06lxHb3jeRtLwSUUUq2girFNpQxFhVaHoWuR2Pt03urI0pfSeN1xuW3kOEkm0uqa +EOlW1xWWHxvT1bBm1+tlov15Ys2B9vtx+v95rV/Uer+rn+a8VnMQETs418Crgy8H3IednQnMkE0 CpgmKhiMQLD5OJk+gDj+apln8j9B/gMAAP//AwBQSwECLQAUAAYACAAAACEAtoM4kv4AAADhAQAA EwAAAAAAAAAAAAAAAAAAAAAAW0NvbnRlbnRfVHlwZXNdLnhtbFBLAQItABQABgAIAAAAIQA4/SH/ 1gAAAJQBAAALAAAAAAAAAAAAAAAAAC8BAABfcmVscy8ucmVsc1BLAQItABQABgAIAAAAIQCZ2PQo nAEAAJQDAAAOAAAAAAAAAAAAAAAAAC4CAABkcnMvZTJvRG9jLnhtbFBLAQItABQABgAIAAAAIQCa syRQ4AAAAAkBAAAPAAAAAAAAAAAAAAAAAPYDAABkcnMvZG93bnJldi54bWxQSwUGAAAAAAQABADz AAAAAwUAAAAA " strokecolor="#156082 [3204]" strokeweight=".5pt">
                 <v:stroke joinstyle="miter"/>
@@ -4716,7 +4679,7 @@
               </wp:anchor>
             </w:drawing>
           </mc:Choice>
-          <mc:Fallback xmlns:ns11="http://schemas.microsoft.com/office/drawing/2010/main" xmlns:ns5="http://schemas.openxmlformats.org/drawingml/2006/main" xmlns:ns9="http://schemas.openxmlformats.org/drawingml/2006/picture">
+          <mc:Fallback xmlns:ns9="http://schemas.openxmlformats.org/drawingml/2006/picture" xmlns:ns5="http://schemas.openxmlformats.org/drawingml/2006/main" xmlns:ns11="http://schemas.microsoft.com/office/drawing/2010/main">
             <w:pict>
               <v:line w14:anchorId="546AD9F8" id="Conexão Reta 3" o:spid="_x0000_s1026" style="position:absolute;z-index:251672576;visibility:visible;mso-wrap-style:square;mso-wrap-distance-left:9pt;mso-wrap-distance-top:0;mso-wrap-distance-right:9pt;mso-wrap-distance-bottom:0;mso-position-horizontal:absolute;mso-position-horizontal-relative:text;mso-position-vertical:absolute;mso-position-vertical-relative:text" from="0,-.05pt" to="484.2pt,-.05pt" o:gfxdata="UEsDBBQABgAIAAAAIQC2gziS/gAAAOEBAAATAAAAW0NvbnRlbnRfVHlwZXNdLnhtbJSRQU7DMBBF 90jcwfIWJU67QAgl6YK0S0CoHGBkTxKLZGx5TGhvj5O2G0SRWNoz/78nu9wcxkFMGNg6quQqL6RA 0s5Y6ir5vt9lD1JwBDIwOMJKHpHlpr69KfdHjyxSmriSfYz+USnWPY7AufNIadK6MEJMx9ApD/oD OlTrorhX2lFEilmcO2RdNtjC5xDF9pCuTyYBB5bi6bQ4syoJ3g9WQ0ymaiLzg5KdCXlKLjvcW893 SUOqXwnz5DrgnHtJTxOsQfEKIT7DmDSUCaxw7Rqn8787ZsmRM9e2VmPeBN4uqYvTtW7jvijg9N/y JsXecLq0q+WD6m8AAAD//wMAUEsDBBQABgAIAAAAIQA4/SH/1gAAAJQBAAALAAAAX3JlbHMvLnJl bHOkkMFqwzAMhu+DvYPRfXGawxijTi+j0GvpHsDYimMaW0Yy2fr2M4PBMnrbUb/Q94l/f/hMi1qR JVI2sOt6UJgd+ZiDgffL8ekFlFSbvV0oo4EbChzGx4f9GRdb25HMsYhqlCwG5lrLq9biZkxWOiqY 22YiTra2kYMu1l1tQD30/bPm3wwYN0x18gb45AdQl1tp5j/sFB2T0FQ7R0nTNEV3j6o9feQzro1i OWA14Fm+Q8a1a8+Bvu/d/dMb2JY5uiPbhG/ktn4cqGU/er3pcvwCAAD//wMAUEsDBBQABgAIAAAA IQCZ2PQonAEAAJQDAAAOAAAAZHJzL2Uyb0RvYy54bWysU01P3DAQvVfqf7B8Z5MAQm202T2A4FK1 qMAPMM54Y8n2WLbZZP99x97dLGorIRAXxx/z3sx7M1muJ2vYFkLU6DreLGrOwEnstdt0/Onx9uwb ZzEJ1wuDDjq+g8jXq69flqNv4RwHND0ERiQutqPv+JCSb6sqygGsiAv04OhRYbAi0TFsqj6Ikdit qc7r+qoaMfQ+oIQY6fZm/8hXhV8pkOmXUhESMx2n2lJZQ1mf81qtlqLdBOEHLQ9liA9UYYV2lHSm uhFJsJeg/6GyWgaMqNJCoq1QKS2haCA1Tf2XmodBeChayJzoZ5vi59HKn9trdx/IhtHHNvr7kFVM Ktj8pfrYVMzazWbBlJiky6vm8vvFJXkqj2/VCehDTHeAluVNx412WYdoxfZHTJSMQo8hdDilLru0 M5CDjfsNiumekjUFXaYCrk1gW0H9FFKCS03uIfGV6AxT2pgZWL8NPMRnKJSJeQ94RpTM6NIMttph +F/2NB1LVvv4owN73dmCZ+x3pSnFGmp9UXgY0zxbr88FfvqZVn8AAAD//wMAUEsDBBQABgAIAAAA IQCasyRQ4AAAAAkBAAAPAAAAZHJzL2Rvd25yZXYueG1sTI9Ba8JAEIXvhf6HZQq96UYpYmM2IpZS KxSpFfS4ZqdJ2uxs2F1N/Pcde2kvA4/He/O+bN7bRpzRh9qRgtEwAYFUOFNTqWD38TyYgghRk9GN I1RwwQDz/PYm06lxHb3jeRtLwSUUUq2girFNpQxFhVaHoWuR2Pt03urI0pfSeN1xuW3kOEkm0uqa +EOlW1xWWHxvT1bBm1+tlov15Ys2B9vtx+v95rV/Uer+rn+a8VnMQETs418Crgy8H3IednQnMkE0 CpgmKhiMQLD5OJk+gDj+apln8j9B/gMAAP//AwBQSwECLQAUAAYACAAAACEAtoM4kv4AAADhAQAA EwAAAAAAAAAAAAAAAAAAAAAAW0NvbnRlbnRfVHlwZXNdLnhtbFBLAQItABQABgAIAAAAIQA4/SH/ 1gAAAJQBAAALAAAAAAAAAAAAAAAAAC8BAABfcmVscy8ucmVsc1BLAQItABQABgAIAAAAIQCZ2PQo nAEAAJQDAAAOAAAAAAAAAAAAAAAAAC4CAABkcnMvZTJvRG9jLnhtbFBLAQItABQABgAIAAAAIQCa syRQ4AAAAAkBAAAPAAAAAAAAAAAAAAAAAPYDAABkcnMvZG93bnJldi54bWxQSwUGAAAAAAQABADz AAAAAwUAAAAA " strokecolor="#156082 [3204]" strokeweight=".5pt">
                 <v:stroke joinstyle="miter"/>
@@ -5271,7 +5234,7 @@
               </wp:anchor>
             </w:drawing>
           </mc:Choice>
-          <mc:Fallback xmlns:ns11="http://schemas.microsoft.com/office/drawing/2010/main" xmlns:ns5="http://schemas.openxmlformats.org/drawingml/2006/main" xmlns:ns9="http://schemas.openxmlformats.org/drawingml/2006/picture">
+          <mc:Fallback xmlns:ns9="http://schemas.openxmlformats.org/drawingml/2006/picture" xmlns:ns5="http://schemas.openxmlformats.org/drawingml/2006/main" xmlns:ns11="http://schemas.microsoft.com/office/drawing/2010/main">
             <w:pict>
               <v:line w14:anchorId="353A3786" id="Conexão Reta 3" o:spid="_x0000_s1026" style="position:absolute;z-index:251674624;visibility:visible;mso-wrap-style:square;mso-wrap-distance-left:9pt;mso-wrap-distance-top:0;mso-wrap-distance-right:9pt;mso-wrap-distance-bottom:0;mso-position-horizontal:absolute;mso-position-horizontal-relative:text;mso-position-vertical:absolute;mso-position-vertical-relative:text" from="0,-.05pt" to="484.2pt,-.05pt" o:gfxdata="UEsDBBQABgAIAAAAIQC2gziS/gAAAOEBAAATAAAAW0NvbnRlbnRfVHlwZXNdLnhtbJSRQU7DMBBF 90jcwfIWJU67QAgl6YK0S0CoHGBkTxKLZGx5TGhvj5O2G0SRWNoz/78nu9wcxkFMGNg6quQqL6RA 0s5Y6ir5vt9lD1JwBDIwOMJKHpHlpr69KfdHjyxSmriSfYz+USnWPY7AufNIadK6MEJMx9ApD/oD OlTrorhX2lFEilmcO2RdNtjC5xDF9pCuTyYBB5bi6bQ4syoJ3g9WQ0ymaiLzg5KdCXlKLjvcW893 SUOqXwnz5DrgnHtJTxOsQfEKIT7DmDSUCaxw7Rqn8787ZsmRM9e2VmPeBN4uqYvTtW7jvijg9N/y JsXecLq0q+WD6m8AAAD//wMAUEsDBBQABgAIAAAAIQA4/SH/1gAAAJQBAAALAAAAX3JlbHMvLnJl bHOkkMFqwzAMhu+DvYPRfXGawxijTi+j0GvpHsDYimMaW0Yy2fr2M4PBMnrbUb/Q94l/f/hMi1qR JVI2sOt6UJgd+ZiDgffL8ekFlFSbvV0oo4EbChzGx4f9GRdb25HMsYhqlCwG5lrLq9biZkxWOiqY 22YiTra2kYMu1l1tQD30/bPm3wwYN0x18gb45AdQl1tp5j/sFB2T0FQ7R0nTNEV3j6o9feQzro1i OWA14Fm+Q8a1a8+Bvu/d/dMb2JY5uiPbhG/ktn4cqGU/er3pcvwCAAD//wMAUEsDBBQABgAIAAAA IQCZ2PQonAEAAJQDAAAOAAAAZHJzL2Uyb0RvYy54bWysU01P3DAQvVfqf7B8Z5MAQm202T2A4FK1 qMAPMM54Y8n2WLbZZP99x97dLGorIRAXxx/z3sx7M1muJ2vYFkLU6DreLGrOwEnstdt0/Onx9uwb ZzEJ1wuDDjq+g8jXq69flqNv4RwHND0ERiQutqPv+JCSb6sqygGsiAv04OhRYbAi0TFsqj6Ikdit qc7r+qoaMfQ+oIQY6fZm/8hXhV8pkOmXUhESMx2n2lJZQ1mf81qtlqLdBOEHLQ9liA9UYYV2lHSm uhFJsJeg/6GyWgaMqNJCoq1QKS2haCA1Tf2XmodBeChayJzoZ5vi59HKn9trdx/IhtHHNvr7kFVM Ktj8pfrYVMzazWbBlJiky6vm8vvFJXkqj2/VCehDTHeAluVNx412WYdoxfZHTJSMQo8hdDilLru0 M5CDjfsNiumekjUFXaYCrk1gW0H9FFKCS03uIfGV6AxT2pgZWL8NPMRnKJSJeQ94RpTM6NIMttph +F/2NB1LVvv4owN73dmCZ+x3pSnFGmp9UXgY0zxbr88FfvqZVn8AAAD//wMAUEsDBBQABgAIAAAA IQCasyRQ4AAAAAkBAAAPAAAAZHJzL2Rvd25yZXYueG1sTI9Ba8JAEIXvhf6HZQq96UYpYmM2IpZS KxSpFfS4ZqdJ2uxs2F1N/Pcde2kvA4/He/O+bN7bRpzRh9qRgtEwAYFUOFNTqWD38TyYgghRk9GN I1RwwQDz/PYm06lxHb3jeRtLwSUUUq2girFNpQxFhVaHoWuR2Pt03urI0pfSeN1xuW3kOEkm0uqa +EOlW1xWWHxvT1bBm1+tlov15Ys2B9vtx+v95rV/Uer+rn+a8VnMQETs418Crgy8H3IednQnMkE0 CpgmKhiMQLD5OJk+gDj+apln8j9B/gMAAP//AwBQSwECLQAUAAYACAAAACEAtoM4kv4AAADhAQAA EwAAAAAAAAAAAAAAAAAAAAAAW0NvbnRlbnRfVHlwZXNdLnhtbFBLAQItABQABgAIAAAAIQA4/SH/ 1gAAAJQBAAALAAAAAAAAAAAAAAAAAC8BAABfcmVscy8ucmVsc1BLAQItABQABgAIAAAAIQCZ2PQo nAEAAJQDAAAOAAAAAAAAAAAAAAAAAC4CAABkcnMvZTJvRG9jLnhtbFBLAQItABQABgAIAAAAIQCa syRQ4AAAAAkBAAAPAAAAAAAAAAAAAAAAAPYDAABkcnMvZG93bnJldi54bWxQSwUGAAAAAAQABADz AAAAAwUAAAAA " strokecolor="#156082 [3204]" strokeweight=".5pt">
                 <v:stroke joinstyle="miter"/>
@@ -6270,46 +6233,206 @@
     <w:p>
       <w:pPr>
         <w:spacing w:before="80" w:after="80" w:line="276" w:lineRule="auto"/>
-      </w:pPr>
-      <w:r>
-        <w:t>O Hibernate já tem, por definição, todo o conhecimento do modelo de domínio da aplicação: as entidades, os campos, os tipos, as relações (@OneToMany, @ManyToOne, etc.). A biblioteca oficial hibernate-assistant expõe esse conhecimento ao LLM através de um prompt construído a partir do metamodelo JPA, forçando o modelo a gerar HQL com os nomes das entidades Java — não os nomes das tabelas SQL.</w:t>
-      </w:r>
-    </w:p>
-    <w:p>
-      <w:pPr>
-        <w:pBdr>
-          <w:left w:val="single" w:sz="8" w:space="6" w:color="2E75B6"/>
-        </w:pBdr>
-        <w:spacing w:before="80" w:after="80"/>
-      </w:pPr>
-      <w:r>
-        <w:rPr>
-          <w:i/>
-          <w:iCs/>
-          <w:color w:val="444444"/>
+        <w:rPr>
+          <w:color w:val="333333"/>
           <w:sz w:val="20"/>
           <w:szCs w:val="20"/>
-          <w:lang w:val="es-ES_tradnl"/>
-        </w:rPr>
-        <w:t xml:space="preserve">Modelo: qwen2.5-coder:7b (via Ollama). </w:t>
-      </w:r>
-      <w:r>
-        <w:rPr>
-          <w:i/>
-          <w:iCs/>
-          <w:color w:val="444444"/>
-          <w:sz w:val="20"/>
-          <w:szCs w:val="20"/>
-        </w:rPr>
-        <w:t>Escolhido pela boa capacidade de gerar HQL correto à primeira (modelo orientado a código) e pelo suporte de saída estruturada JSON. Corre em ~4–5GB RAM em Q4. O Spring Boot corre localmente com Maven; o Ollama corre nativo ou em Docker na porta 11434.</w:t>
-      </w:r>
-    </w:p>
+        </w:rPr>
+      </w:pPr>
+      <w:r>
+        <w:t>O Hibernate já tem, por definição, todo o conhecimento do modelo de domínio da aplicação: as entidades, os campos, os tipos, as relações (@OneToMany, @ManyToOne, etc.). A biblioteca oficial hibernate-assistant expõe esse conhecimento ao LLM através de um prompt construído a partir do metamodelo JPA, forçando o modelo a gerar HQL com os nomes das entidades Java — não os nomes das tabelas SQL.</w:t>
+      </w:r>
+    </w:p>
+    <w:tbl>
+      <w:tblPr>
+        <w:tblW w:w="8426" w:type="dxa"/>
+        <w:tblBorders>
+          <w:top w:val="single" w:sz="4" w:space="0" w:color="auto"/>
+          <w:left w:val="single" w:sz="4" w:space="0" w:color="auto"/>
+          <w:bottom w:val="single" w:sz="4" w:space="0" w:color="auto"/>
+          <w:right w:val="single" w:sz="4" w:space="0" w:color="auto"/>
+          <w:insideH w:val="single" w:sz="4" w:space="0" w:color="auto"/>
+          <w:insideV w:val="single" w:sz="4" w:space="0" w:color="auto"/>
+        </w:tblBorders>
+        <w:tblCellMar>
+          <w:left w:w="10" w:type="dxa"/>
+          <w:right w:w="10" w:type="dxa"/>
+        </w:tblCellMar>
+        <w:tblLook w:val="0000" w:firstRow="0" w:lastRow="0" w:firstColumn="0" w:lastColumn="0" w:noHBand="0" w:noVBand="0"/>
+      </w:tblPr>
+      <w:tblGrid>
+        <w:gridCol w:w="8426"/>
+      </w:tblGrid>
+      <w:tr>
+        <w:tc>
+          <w:tcPr>
+            <w:tcW w:w="8426" w:type="dxa"/>
+            <w:tcBorders>
+              <w:top w:val="none" w:sz="0" w:space="0" w:color="FFFFFF"/>
+              <w:left w:val="none" w:sz="0" w:space="0" w:color="FFFFFF"/>
+              <w:bottom w:val="none" w:sz="0" w:space="0" w:color="FFFFFF"/>
+              <w:right w:val="none" w:sz="0" w:space="0" w:color="FFFFFF"/>
+            </w:tcBorders>
+            <w:shd w:val="clear" w:color="auto" w:fill="F2F2F2"/>
+            <w:tcMar>
+              <w:top w:w="120" w:type="dxa"/>
+              <w:left w:w="120" w:type="dxa"/>
+              <w:bottom w:w="120" w:type="dxa"/>
+              <w:right w:w="160" w:type="dxa"/>
+            </w:tcMar>
+          </w:tcPr>
+          <w:p>
+            <w:pPr>
+              <w:pBdr>
+                <w:left w:val="single" w:sz="8" w:space="6" w:color="2E75B6"/>
+              </w:pBdr>
+              <w:spacing w:before="80" w:after="80"/>
+            </w:pPr>
+            <w:r>
+              <w:rPr>
+                <w:i/>
+                <w:iCs/>
+                <w:color w:val="444444"/>
+                <w:sz w:val="20"/>
+                <w:szCs w:val="20"/>
+                <w:lang w:val="es-ES_tradnl"/>
+              </w:rPr>
+              <w:t>Modelo: qwen2.5-coder:7b (</w:t>
+            </w:r>
+            <w:proofErr w:type="spellStart"/>
+            <w:r>
+              <w:rPr>
+                <w:i/>
+                <w:iCs/>
+                <w:color w:val="444444"/>
+                <w:sz w:val="20"/>
+                <w:szCs w:val="20"/>
+                <w:lang w:val="es-ES_tradnl"/>
+              </w:rPr>
+              <w:t>via</w:t>
+            </w:r>
+            <w:proofErr w:type="spellEnd"/>
+            <w:r>
+              <w:rPr>
+                <w:i/>
+                <w:iCs/>
+                <w:color w:val="444444"/>
+                <w:sz w:val="20"/>
+                <w:szCs w:val="20"/>
+                <w:lang w:val="es-ES_tradnl"/>
+              </w:rPr>
+              <w:t xml:space="preserve"> Ollama). </w:t>
+            </w:r>
+            <w:r>
+              <w:rPr>
+                <w:i/>
+                <w:iCs/>
+                <w:color w:val="444444"/>
+                <w:sz w:val="20"/>
+                <w:szCs w:val="20"/>
+              </w:rPr>
+              <w:t xml:space="preserve">Escolhido pela boa capacidade de gerar HQL correto à primeira (modelo orientado a código) e pelo suporte de saída estruturada JSON. Corre em ~4–5GB RAM em Q4. O Spring </w:t>
+            </w:r>
+            <w:proofErr w:type="spellStart"/>
+            <w:r>
+              <w:rPr>
+                <w:i/>
+                <w:iCs/>
+                <w:color w:val="444444"/>
+                <w:sz w:val="20"/>
+                <w:szCs w:val="20"/>
+              </w:rPr>
+              <w:t>Boot</w:t>
+            </w:r>
+            <w:proofErr w:type="spellEnd"/>
+            <w:r>
+              <w:rPr>
+                <w:i/>
+                <w:iCs/>
+                <w:color w:val="444444"/>
+                <w:sz w:val="20"/>
+                <w:szCs w:val="20"/>
+              </w:rPr>
+              <w:t xml:space="preserve"> corre localmente com </w:t>
+            </w:r>
+            <w:proofErr w:type="spellStart"/>
+            <w:r>
+              <w:rPr>
+                <w:i/>
+                <w:iCs/>
+                <w:color w:val="444444"/>
+                <w:sz w:val="20"/>
+                <w:szCs w:val="20"/>
+              </w:rPr>
+              <w:t>Maven</w:t>
+            </w:r>
+            <w:proofErr w:type="spellEnd"/>
+            <w:r>
+              <w:rPr>
+                <w:i/>
+                <w:iCs/>
+                <w:color w:val="444444"/>
+                <w:sz w:val="20"/>
+                <w:szCs w:val="20"/>
+              </w:rPr>
+              <w:t xml:space="preserve">; o </w:t>
+            </w:r>
+            <w:proofErr w:type="spellStart"/>
+            <w:r>
+              <w:rPr>
+                <w:i/>
+                <w:iCs/>
+                <w:color w:val="444444"/>
+                <w:sz w:val="20"/>
+                <w:szCs w:val="20"/>
+              </w:rPr>
+              <w:t>Ollama</w:t>
+            </w:r>
+            <w:proofErr w:type="spellEnd"/>
+            <w:r>
+              <w:rPr>
+                <w:i/>
+                <w:iCs/>
+                <w:color w:val="444444"/>
+                <w:sz w:val="20"/>
+                <w:szCs w:val="20"/>
+              </w:rPr>
+              <w:t xml:space="preserve"> corre nativo ou em Docker na porta 11434.</w:t>
+            </w:r>
+          </w:p>
+        </w:tc>
+      </w:tr>
+    </w:tbl>
     <w:p>
       <w:pPr>
         <w:spacing w:before="80" w:after="80" w:line="276" w:lineRule="auto"/>
       </w:pPr>
       <w:r>
-        <w:t>O Hibernate ORM 7.4.1 incorpora este padrão no próprio motor, através da interface org.hibernate.tool.language.HibernateAssistant e de dois serializers oficiais: MetamodelJsonSerializerImpl (metamodelo JPA → system prompt) e ResultsJsonSerializerImpl (resultados → JSON, consciente do mapeamento). Os dois projetos V2 implementam esta interface; a única coisa que escrevemos é a “cola” com o LLM e as duas camadas de ocultação.</w:t>
+        <w:t xml:space="preserve">O </w:t>
+      </w:r>
+      <w:proofErr w:type="spellStart"/>
+      <w:r>
+        <w:t>Hibernate</w:t>
+      </w:r>
+      <w:proofErr w:type="spellEnd"/>
+      <w:r>
+        <w:t xml:space="preserve"> ORM 7.4.1 incorpora este padrão no próprio motor, através da interface </w:t>
+      </w:r>
+      <w:proofErr w:type="gramStart"/>
+      <w:r>
+        <w:t>org.hibernate</w:t>
+      </w:r>
+      <w:proofErr w:type="gramEnd"/>
+      <w:r>
+        <w:t>.</w:t>
+      </w:r>
+      <w:proofErr w:type="gramStart"/>
+      <w:r>
+        <w:t>tool.language</w:t>
+      </w:r>
+      <w:proofErr w:type="gramEnd"/>
+      <w:r>
+        <w:t>.HibernateAssistant e de dois serializers oficiais: MetamodelJsonSerializerImpl (metamodelo JPA → system prompt) e ResultsJsonSerializerImpl (resultados → JSON, consciente do mapeamento). Os dois projetos V2 implementam esta interface; a única coisa que escrevemos é a “cola” com o LLM e as duas camadas de ocultação.</w:t>
       </w:r>
     </w:p>
     <w:p>
@@ -6335,6 +6458,10 @@
         <w:spacing w:before="120" w:after="40"/>
       </w:pPr>
       <w:r>
+        <w:rPr>
+          <w:noProof/>
+        </w:rPr>
+        <w:lastRenderedPageBreak/>
         <w:drawing>
           <wp:inline distT="0" distB="0" distL="0" distR="0" wp14:anchorId="058563A5" wp14:editId="48ADF096">
             <wp:extent cx="4903939" cy="2636669"/>
@@ -6401,7 +6528,6 @@
           <w:b/>
           <w:bCs/>
         </w:rPr>
-        <w:lastRenderedPageBreak/>
         <w:t>Percurso de um pedido (ponta a ponta)</w:t>
       </w:r>
     </w:p>
@@ -7035,6 +7161,7 @@
                 <w:sz w:val="20"/>
                 <w:szCs w:val="20"/>
               </w:rPr>
+              <w:lastRenderedPageBreak/>
               <w:t>createSelectionQuery</w:t>
             </w:r>
           </w:p>
@@ -7477,7 +7604,6 @@
                 <w:sz w:val="18"/>
                 <w:szCs w:val="18"/>
               </w:rPr>
-              <w:lastRenderedPageBreak/>
               <w:t xml:space="preserve">    ChatModel chatModel, Metamodel metamodel,</w:t>
             </w:r>
           </w:p>
@@ -8524,6 +8650,7 @@
                 <w:sz w:val="18"/>
                 <w:szCs w:val="18"/>
               </w:rPr>
+              <w:lastRenderedPageBreak/>
               <w:t xml:space="preserve">    return session.createSelectionQuery(hql, Object.class);   // rejeita tudo o que não é SELECT</w:t>
             </w:r>
           </w:p>
@@ -8791,7 +8918,6 @@
         <w:spacing w:before="80" w:after="80" w:line="276" w:lineRule="auto"/>
       </w:pPr>
       <w:r>
-        <w:lastRenderedPageBreak/>
         <w:t>O assistente usa uma pipeline fixa — o Java orquestra explicitamente os passos. A alternativa seria uma abordagem com agentes (@Tool / function calling), em que o LLM decidiria de forma autónoma quando executar a query. Isso exige que o modelo seja fiável a seguir o protocolo de function calling, algo que modelos locais pequenos não garantem de forma consistente. A pipeline é mais previsível e mais fácil de controlar.</w:t>
       </w:r>
     </w:p>
@@ -9229,55 +9355,16 @@
         <w:rPr>
           <w:b/>
           <w:bCs/>
-        </w:rPr>
-      </w:pPr>
-      <w:proofErr w:type="spellStart"/>
+          <w:lang w:val="en-US"/>
+        </w:rPr>
+      </w:pPr>
       <w:r>
         <w:rPr>
           <w:b/>
           <w:bCs/>
-        </w:rPr>
-        <w:t>spring</w:t>
-      </w:r>
-      <w:proofErr w:type="spellEnd"/>
-      <w:r>
-        <w:rPr>
-          <w:b/>
-          <w:bCs/>
-        </w:rPr>
-        <w:t>-</w:t>
-      </w:r>
-      <w:proofErr w:type="gramStart"/>
-      <w:r>
-        <w:rPr>
-          <w:b/>
-          <w:bCs/>
-        </w:rPr>
-        <w:t>ai</w:t>
-      </w:r>
-      <w:proofErr w:type="gramEnd"/>
-      <w:r>
-        <w:rPr>
-          <w:b/>
-          <w:bCs/>
-        </w:rPr>
-        <w:t>-</w:t>
-      </w:r>
-      <w:proofErr w:type="spellStart"/>
-      <w:r>
-        <w:rPr>
-          <w:b/>
-          <w:bCs/>
-        </w:rPr>
-        <w:t>assistant</w:t>
-      </w:r>
-      <w:proofErr w:type="spellEnd"/>
-      <w:r>
-        <w:rPr>
-          <w:b/>
-          <w:bCs/>
-        </w:rPr>
-        <w:t>-demo (Spring AI)</w:t>
+          <w:lang w:val="en-US"/>
+        </w:rPr>
+        <w:t>spring-ai-assistant-demo (Spring AI)</w:t>
       </w:r>
     </w:p>
     <w:p>
@@ -9285,6 +9372,7 @@
         <w:spacing w:before="80" w:after="80" w:line="276" w:lineRule="auto"/>
       </w:pPr>
       <w:r>
+        <w:lastRenderedPageBreak/>
         <w:t xml:space="preserve">A classe </w:t>
       </w:r>
       <w:proofErr w:type="spellStart"/>
@@ -9691,7 +9779,6 @@
                 <w:sz w:val="18"/>
                 <w:szCs w:val="18"/>
               </w:rPr>
-              <w:lastRenderedPageBreak/>
               <w:t>}</w:t>
             </w:r>
           </w:p>
@@ -10360,7 +10447,7 @@
               </wp:anchor>
             </w:drawing>
           </mc:Choice>
-          <mc:Fallback xmlns:ns11="http://schemas.microsoft.com/office/drawing/2010/main" xmlns:ns5="http://schemas.openxmlformats.org/drawingml/2006/main" xmlns:ns9="http://schemas.openxmlformats.org/drawingml/2006/picture">
+          <mc:Fallback xmlns:ns9="http://schemas.openxmlformats.org/drawingml/2006/picture" xmlns:ns5="http://schemas.openxmlformats.org/drawingml/2006/main" xmlns:ns11="http://schemas.microsoft.com/office/drawing/2010/main">
             <w:pict>
               <v:line w14:anchorId="33CA8BAD" id="Conexão Reta 3" o:spid="_x0000_s1026" style="position:absolute;z-index:251684864;visibility:visible;mso-wrap-style:square;mso-wrap-distance-left:9pt;mso-wrap-distance-top:0;mso-wrap-distance-right:9pt;mso-wrap-distance-bottom:0;mso-position-horizontal:absolute;mso-position-horizontal-relative:text;mso-position-vertical:absolute;mso-position-vertical-relative:text" from="0,0" to="484.2pt,0" o:gfxdata="UEsDBBQABgAIAAAAIQC2gziS/gAAAOEBAAATAAAAW0NvbnRlbnRfVHlwZXNdLnhtbJSRQU7DMBBF 90jcwfIWJU67QAgl6YK0S0CoHGBkTxKLZGx5TGhvj5O2G0SRWNoz/78nu9wcxkFMGNg6quQqL6RA 0s5Y6ir5vt9lD1JwBDIwOMJKHpHlpr69KfdHjyxSmriSfYz+USnWPY7AufNIadK6MEJMx9ApD/oD OlTrorhX2lFEilmcO2RdNtjC5xDF9pCuTyYBB5bi6bQ4syoJ3g9WQ0ymaiLzg5KdCXlKLjvcW893 SUOqXwnz5DrgnHtJTxOsQfEKIT7DmDSUCaxw7Rqn8787ZsmRM9e2VmPeBN4uqYvTtW7jvijg9N/y JsXecLq0q+WD6m8AAAD//wMAUEsDBBQABgAIAAAAIQA4/SH/1gAAAJQBAAALAAAAX3JlbHMvLnJl bHOkkMFqwzAMhu+DvYPRfXGawxijTi+j0GvpHsDYimMaW0Yy2fr2M4PBMnrbUb/Q94l/f/hMi1qR JVI2sOt6UJgd+ZiDgffL8ekFlFSbvV0oo4EbChzGx4f9GRdb25HMsYhqlCwG5lrLq9biZkxWOiqY 22YiTra2kYMu1l1tQD30/bPm3wwYN0x18gb45AdQl1tp5j/sFB2T0FQ7R0nTNEV3j6o9feQzro1i OWA14Fm+Q8a1a8+Bvu/d/dMb2JY5uiPbhG/ktn4cqGU/er3pcvwCAAD//wMAUEsDBBQABgAIAAAA IQCZ2PQonAEAAJQDAAAOAAAAZHJzL2Uyb0RvYy54bWysU01P3DAQvVfqf7B8Z5MAQm202T2A4FK1 qMAPMM54Y8n2WLbZZP99x97dLGorIRAXxx/z3sx7M1muJ2vYFkLU6DreLGrOwEnstdt0/Onx9uwb ZzEJ1wuDDjq+g8jXq69flqNv4RwHND0ERiQutqPv+JCSb6sqygGsiAv04OhRYbAi0TFsqj6Ikdit qc7r+qoaMfQ+oIQY6fZm/8hXhV8pkOmXUhESMx2n2lJZQ1mf81qtlqLdBOEHLQ9liA9UYYV2lHSm uhFJsJeg/6GyWgaMqNJCoq1QKS2haCA1Tf2XmodBeChayJzoZ5vi59HKn9trdx/IhtHHNvr7kFVM Ktj8pfrYVMzazWbBlJiky6vm8vvFJXkqj2/VCehDTHeAluVNx412WYdoxfZHTJSMQo8hdDilLru0 M5CDjfsNiumekjUFXaYCrk1gW0H9FFKCS03uIfGV6AxT2pgZWL8NPMRnKJSJeQ94RpTM6NIMttph +F/2NB1LVvv4owN73dmCZ+x3pSnFGmp9UXgY0zxbr88FfvqZVn8AAAD//wMAUEsDBBQABgAIAAAA IQBdcTjb3gAAAAcBAAAPAAAAZHJzL2Rvd25yZXYueG1sTI9Ba8JAEIXvBf/DMkJvdVMpYmM2IpZS KxSpLdjjmp0m0exs2F1N/Pcde2kvDx6PefO9bN7bRpzRh9qRgvtRAgKpcKamUsHnx/PdFESImoxu HKGCCwaY54ObTKfGdfSO520sBZdQSLWCKsY2lTIUFVodRq5F4uzbeasjW19K43XH5baR4ySZSKtr 4g+VbnFZYXHcnqyCN79aLRfry4E2X7bbjde7zWv/otTtsH+asSxmICL28e8CrhuYH3IG27sTmSAa Bbwm/ipnj5PpA4j91co8k//58x8AAAD//wMAUEsBAi0AFAAGAAgAAAAhALaDOJL+AAAA4QEAABMA AAAAAAAAAAAAAAAAAAAAAFtDb250ZW50X1R5cGVzXS54bWxQSwECLQAUAAYACAAAACEAOP0h/9YA AACUAQAACwAAAAAAAAAAAAAAAAAvAQAAX3JlbHMvLnJlbHNQSwECLQAUAAYACAAAACEAmdj0KJwB AACUAwAADgAAAAAAAAAAAAAAAAAuAgAAZHJzL2Uyb0RvYy54bWxQSwECLQAUAAYACAAAACEAXXE4 294AAAAHAQAADwAAAAAAAAAAAAAAAAD2AwAAZHJzL2Rvd25yZXYueG1sUEsFBgAAAAAEAAQA8wAA AAEFAAAAAA== " strokecolor="#156082 [3204]" strokeweight=".5pt">
                 <v:stroke joinstyle="miter"/>
@@ -11127,7 +11214,6 @@
                 <w:sz w:val="18"/>
                 <w:szCs w:val="18"/>
               </w:rPr>
-              <w:lastRenderedPageBreak/>
               <w:t>-- Hibernate resolve o JOIN automaticamente</w:t>
             </w:r>
           </w:p>
@@ -11826,7 +11912,7 @@
               </wp:anchor>
             </w:drawing>
           </mc:Choice>
-          <mc:Fallback xmlns:ns11="http://schemas.microsoft.com/office/drawing/2010/main" xmlns:ns5="http://schemas.openxmlformats.org/drawingml/2006/main" xmlns:ns9="http://schemas.openxmlformats.org/drawingml/2006/picture">
+          <mc:Fallback xmlns:ns9="http://schemas.openxmlformats.org/drawingml/2006/picture" xmlns:ns5="http://schemas.openxmlformats.org/drawingml/2006/main" xmlns:ns11="http://schemas.microsoft.com/office/drawing/2010/main">
             <w:pict>
               <v:line w14:anchorId="2E235C5D" id="Conexão Reta 3" o:spid="_x0000_s1026" style="position:absolute;z-index:251686912;visibility:visible;mso-wrap-style:square;mso-wrap-distance-left:9pt;mso-wrap-distance-top:0;mso-wrap-distance-right:9pt;mso-wrap-distance-bottom:0;mso-position-horizontal:absolute;mso-position-horizontal-relative:text;mso-position-vertical:absolute;mso-position-vertical-relative:text" from="0,-.05pt" to="484.2pt,-.05pt" o:gfxdata="UEsDBBQABgAIAAAAIQC2gziS/gAAAOEBAAATAAAAW0NvbnRlbnRfVHlwZXNdLnhtbJSRQU7DMBBF 90jcwfIWJU67QAgl6YK0S0CoHGBkTxKLZGx5TGhvj5O2G0SRWNoz/78nu9wcxkFMGNg6quQqL6RA 0s5Y6ir5vt9lD1JwBDIwOMJKHpHlpr69KfdHjyxSmriSfYz+USnWPY7AufNIadK6MEJMx9ApD/oD OlTrorhX2lFEilmcO2RdNtjC5xDF9pCuTyYBB5bi6bQ4syoJ3g9WQ0ymaiLzg5KdCXlKLjvcW893 SUOqXwnz5DrgnHtJTxOsQfEKIT7DmDSUCaxw7Rqn8787ZsmRM9e2VmPeBN4uqYvTtW7jvijg9N/y JsXecLq0q+WD6m8AAAD//wMAUEsDBBQABgAIAAAAIQA4/SH/1gAAAJQBAAALAAAAX3JlbHMvLnJl bHOkkMFqwzAMhu+DvYPRfXGawxijTi+j0GvpHsDYimMaW0Yy2fr2M4PBMnrbUb/Q94l/f/hMi1qR JVI2sOt6UJgd+ZiDgffL8ekFlFSbvV0oo4EbChzGx4f9GRdb25HMsYhqlCwG5lrLq9biZkxWOiqY 22YiTra2kYMu1l1tQD30/bPm3wwYN0x18gb45AdQl1tp5j/sFB2T0FQ7R0nTNEV3j6o9feQzro1i OWA14Fm+Q8a1a8+Bvu/d/dMb2JY5uiPbhG/ktn4cqGU/er3pcvwCAAD//wMAUEsDBBQABgAIAAAA IQCZ2PQonAEAAJQDAAAOAAAAZHJzL2Uyb0RvYy54bWysU01P3DAQvVfqf7B8Z5MAQm202T2A4FK1 qMAPMM54Y8n2WLbZZP99x97dLGorIRAXxx/z3sx7M1muJ2vYFkLU6DreLGrOwEnstdt0/Onx9uwb ZzEJ1wuDDjq+g8jXq69flqNv4RwHND0ERiQutqPv+JCSb6sqygGsiAv04OhRYbAi0TFsqj6Ikdit qc7r+qoaMfQ+oIQY6fZm/8hXhV8pkOmXUhESMx2n2lJZQ1mf81qtlqLdBOEHLQ9liA9UYYV2lHSm uhFJsJeg/6GyWgaMqNJCoq1QKS2haCA1Tf2XmodBeChayJzoZ5vi59HKn9trdx/IhtHHNvr7kFVM Ktj8pfrYVMzazWbBlJiky6vm8vvFJXkqj2/VCehDTHeAluVNx412WYdoxfZHTJSMQo8hdDilLru0 M5CDjfsNiumekjUFXaYCrk1gW0H9FFKCS03uIfGV6AxT2pgZWL8NPMRnKJSJeQ94RpTM6NIMttph +F/2NB1LVvv4owN73dmCZ+x3pSnFGmp9UXgY0zxbr88FfvqZVn8AAAD//wMAUEsDBBQABgAIAAAA IQCasyRQ4AAAAAkBAAAPAAAAZHJzL2Rvd25yZXYueG1sTI9Ba8JAEIXvhf6HZQq96UYpYmM2IpZS KxSpFfS4ZqdJ2uxs2F1N/Pcde2kvA4/He/O+bN7bRpzRh9qRgtEwAYFUOFNTqWD38TyYgghRk9GN I1RwwQDz/PYm06lxHb3jeRtLwSUUUq2girFNpQxFhVaHoWuR2Pt03urI0pfSeN1xuW3kOEkm0uqa +EOlW1xWWHxvT1bBm1+tlov15Ys2B9vtx+v95rV/Uer+rn+a8VnMQETs418Crgy8H3IednQnMkE0 CpgmKhiMQLD5OJk+gDj+apln8j9B/gMAAP//AwBQSwECLQAUAAYACAAAACEAtoM4kv4AAADhAQAA EwAAAAAAAAAAAAAAAAAAAAAAW0NvbnRlbnRfVHlwZXNdLnhtbFBLAQItABQABgAIAAAAIQA4/SH/ 1gAAAJQBAAALAAAAAAAAAAAAAAAAAC8BAABfcmVscy8ucmVsc1BLAQItABQABgAIAAAAIQCZ2PQo nAEAAJQDAAAOAAAAAAAAAAAAAAAAAC4CAABkcnMvZTJvRG9jLnhtbFBLAQItABQABgAIAAAAIQCa syRQ4AAAAAkBAAAPAAAAAAAAAAAAAAAAAPYDAABkcnMvZG93bnJldi54bWxQSwUGAAAAAAQABADz AAAAAwUAAAAA " strokecolor="#156082 [3204]" strokeweight=".5pt">
                 <v:stroke joinstyle="miter"/>
@@ -11852,7 +11938,11 @@
         <w:spacing w:before="80"/>
       </w:pPr>
       <w:r>
-        <w:t>No Hibernate Assistant, a abordagem é mais direta e adequada para dados estruturados: o LLM gera uma query HQL a partir da pergunta do utilizador, o Hibernate executa-a na base de dados real e os resultados são devolvidos ao modelo como contexto. Não são precisos embeddings, bases de dados vetoriais, nem pré-indexação. O modelo trabalha com dados reais, em tempo real, e as respostas são determinísticas e verificáveis — uma vantagem clara para sistemas com esquema relacional bem definido.</w:t>
+        <w:t xml:space="preserve">No Hibernate Assistant, a abordagem é mais direta e adequada para dados estruturados: o LLM gera uma query HQL a partir da pergunta do utilizador, o Hibernate executa-a na base de dados </w:t>
+      </w:r>
+      <w:r>
+        <w:lastRenderedPageBreak/>
+        <w:t>real e os resultados são devolvidos ao modelo como contexto. Não são precisos embeddings, bases de dados vetoriais, nem pré-indexação. O modelo trabalha com dados reais, em tempo real, e as respostas são determinísticas e verificáveis — uma vantagem clara para sistemas com esquema relacional bem definido.</w:t>
       </w:r>
     </w:p>
     <w:p>
@@ -12233,7 +12323,6 @@
                 <w:sz w:val="20"/>
                 <w:szCs w:val="20"/>
               </w:rPr>
-              <w:lastRenderedPageBreak/>
               <w:t>Complexidade</w:t>
             </w:r>
           </w:p>
@@ -12974,6 +13063,7 @@
         <w:spacing w:before="80" w:after="80" w:line="276" w:lineRule="auto"/>
       </w:pPr>
       <w:r>
+        <w:lastRenderedPageBreak/>
         <w:t>Esconder do prompt não chega: um SELECT p FROM Product p perfeitamente legítimo devolve a entidade inteira — e o ResultsJsonSerializerImpl oficial serializa todas as colunas mapeadas, incluindo a costPrice, sem saber nada do que foi ocultado no prompt. O FilteringResultsSerializer envolve também esse serializer e percorre recursivamente o JSON de resultado, removendo os mesmos campos ocultos a qualquer profundidade — isto corre em cada query, não só uma vez.</w:t>
       </w:r>
     </w:p>
@@ -13367,7 +13457,6 @@
           <w:b/>
           <w:bCs/>
         </w:rPr>
-        <w:lastRenderedPageBreak/>
         <w:t>Configuração única</w:t>
       </w:r>
     </w:p>
@@ -13677,7 +13766,11 @@
         <w:spacing w:before="80" w:after="80" w:line="276" w:lineRule="auto"/>
       </w:pPr>
       <w:r>
-        <w:t>Dados de exemplo (data.sql): 5 categorias — Electronics, Clothing, Books, Sports, Home &amp; Kitchen — e 6 fornecedores em vários países: Apple Inc. (EUA), Sony (Japão), Samsung (Coreia do Sul), Logitech International (Suíça), EuroDistribution Srl (Itália), Global Books &amp; Goods (Alemanha).</w:t>
+        <w:t xml:space="preserve">Dados de exemplo (data.sql): 5 categorias — Electronics, Clothing, Books, Sports, Home &amp; Kitchen — e 6 fornecedores em vários países: Apple Inc. (EUA), Sony (Japão), Samsung (Coreia </w:t>
+      </w:r>
+      <w:r>
+        <w:lastRenderedPageBreak/>
+        <w:t>do Sul), Logitech International (Suíça), EuroDistribution Srl (Itália), Global Books &amp; Goods (Alemanha).</w:t>
       </w:r>
     </w:p>
     <w:tbl>
@@ -14123,7 +14216,6 @@
                 <w:szCs w:val="18"/>
                 <w:lang w:val="en-US"/>
               </w:rPr>
-              <w:lastRenderedPageBreak/>
               <w:t>curl "http://localhost:8080/assistant/hql?q=What+are+the+top+5+most+expensive+products?"</w:t>
             </w:r>
           </w:p>
@@ -14652,6 +14744,7 @@
           <w:b/>
           <w:bCs/>
         </w:rPr>
+        <w:lastRenderedPageBreak/>
         <w:t>Dois gémeos, uma biblioteca:</w:t>
       </w:r>
       <w:r>
@@ -14691,6 +14784,9 @@
     <w:p>
       <w:pPr>
         <w:spacing w:before="60" w:after="60"/>
+        <w:rPr>
+          <w:lang w:val="en-US"/>
+        </w:rPr>
       </w:pPr>
       <w:proofErr w:type="gramStart"/>
       <w:r>
@@ -14698,63 +14794,70 @@
           <w:b/>
           <w:bCs/>
           <w:color w:val="2E75B6"/>
+          <w:lang w:val="en-US"/>
         </w:rPr>
         <w:t xml:space="preserve">→  </w:t>
       </w:r>
+      <w:r>
+        <w:rPr>
+          <w:color w:val="2E75B6"/>
+          <w:lang w:val="en-US"/>
+        </w:rPr>
+        <w:t>Hibernate</w:t>
+      </w:r>
+      <w:proofErr w:type="gramEnd"/>
+      <w:r>
+        <w:rPr>
+          <w:color w:val="2E75B6"/>
+          <w:lang w:val="en-US"/>
+        </w:rPr>
+        <w:t xml:space="preserve"> ORM 7.4 — </w:t>
+      </w:r>
       <w:proofErr w:type="spellStart"/>
       <w:r>
         <w:rPr>
           <w:color w:val="2E75B6"/>
-        </w:rPr>
-        <w:t>Hibernate</w:t>
+          <w:lang w:val="en-US"/>
+        </w:rPr>
+        <w:t>módulo</w:t>
       </w:r>
       <w:proofErr w:type="spellEnd"/>
+      <w:r>
+        <w:rPr>
+          <w:color w:val="2E75B6"/>
+          <w:lang w:val="en-US"/>
+        </w:rPr>
+        <w:t xml:space="preserve"> hibernate-</w:t>
+      </w:r>
+      <w:proofErr w:type="gramStart"/>
+      <w:r>
+        <w:rPr>
+          <w:color w:val="2E75B6"/>
+          <w:lang w:val="en-US"/>
+        </w:rPr>
+        <w:t>assistant  (</w:t>
+      </w:r>
       <w:proofErr w:type="gramEnd"/>
       <w:r>
         <w:rPr>
           <w:color w:val="2E75B6"/>
-        </w:rPr>
-        <w:t xml:space="preserve"> ORM 7.4 — módulo </w:t>
+          <w:lang w:val="en-US"/>
+        </w:rPr>
+        <w:t>hibernate.org/</w:t>
       </w:r>
       <w:proofErr w:type="spellStart"/>
       <w:r>
         <w:rPr>
           <w:color w:val="2E75B6"/>
-        </w:rPr>
-        <w:t>hibernate-</w:t>
-      </w:r>
-      <w:proofErr w:type="gramStart"/>
+          <w:lang w:val="en-US"/>
+        </w:rPr>
+        <w:t>orm</w:t>
+      </w:r>
+      <w:proofErr w:type="spellEnd"/>
       <w:r>
         <w:rPr>
           <w:color w:val="2E75B6"/>
-        </w:rPr>
-        <w:t>assistant</w:t>
-      </w:r>
-      <w:proofErr w:type="spellEnd"/>
-      <w:r>
-        <w:rPr>
-          <w:color w:val="2E75B6"/>
-        </w:rPr>
-        <w:t xml:space="preserve">  (</w:t>
-      </w:r>
-      <w:proofErr w:type="gramEnd"/>
-      <w:r>
-        <w:rPr>
-          <w:color w:val="2E75B6"/>
-        </w:rPr>
-        <w:t>hibernate.org/</w:t>
-      </w:r>
-      <w:proofErr w:type="spellStart"/>
-      <w:r>
-        <w:rPr>
-          <w:color w:val="2E75B6"/>
-        </w:rPr>
-        <w:t>orm</w:t>
-      </w:r>
-      <w:proofErr w:type="spellEnd"/>
-      <w:r>
-        <w:rPr>
-          <w:color w:val="2E75B6"/>
+          <w:lang w:val="en-US"/>
         </w:rPr>
         <w:t>)</w:t>
       </w:r>

</xml_diff>